<commit_message>
feat: implement official TikTok publishing foundation
</commit_message>
<xml_diff>
--- a/docs/final/Tik_Tok_Loader_Unified_Specification.docx
+++ b/docs/final/Tik_Tok_Loader_Unified_Specification.docx
@@ -39,11 +39,11 @@
         <w:jc w:val="center"/>
       </w:pPr>
       <w:r>
-        <w:t>Версия: 0.1.0</w:t>
+        <w:t>Версия: 0.2.0</w:t>
         <w:br/>
         <w:t>Репозиторий: kredavto/Tik-Tok-bot-Rus-2</w:t>
         <w:br/>
-        <w:t>Дата сборки: 2026-07-12</w:t>
+        <w:t>Дата сборки: 2026-07-13</w:t>
         <w:br/>
         <w:t>Статус: проектная спецификация для реализации</w:t>
       </w:r>
@@ -12164,15 +12164,28 @@
         <w:pStyle w:val="ListBullet"/>
       </w:pPr>
       <w:r>
-        <w:t>Include `TIKTOK_WEBHOOK_SECRET` when signature verification is enabled.</w:t>
-      </w:r>
-    </w:p>
-    <w:p>
-      <w:pPr>
-        <w:pStyle w:val="ListBullet"/>
-      </w:pPr>
-      <w:r>
-        <w:t>Verify inbound webhook signatures.</w:t>
+        <w:t>Signatures use the TikTok app `TIKTOK_CLIENT_SECRET`; no separate webhook secret is accepted by</w:t>
+      </w:r>
+    </w:p>
+    <w:p>
+      <w:r>
+        <w:t xml:space="preserve">  the official verification algorithm.</w:t>
+      </w:r>
+    </w:p>
+    <w:p>
+      <w:pPr>
+        <w:pStyle w:val="ListBullet"/>
+      </w:pPr>
+      <w:r>
+        <w:t>Verify the `TikTok-Signature` timestamp and HMAC against the unmodified request body.</w:t>
+      </w:r>
+    </w:p>
+    <w:p>
+      <w:pPr>
+        <w:pStyle w:val="ListBullet"/>
+      </w:pPr>
+      <w:r>
+        <w:t>Reject webhook timestamps older than five minutes to limit replay attacks.</w:t>
       </w:r>
     </w:p>
     <w:p>
@@ -12233,7 +12246,7 @@
         <w:pStyle w:val="ListNumber"/>
       </w:pPr>
       <w:r>
-        <w:t>Confirm webhook URL and secret.</w:t>
+        <w:t>Confirm webhook URL and `TIKTOK_CLIENT_SECRET` signature verification.</w:t>
       </w:r>
     </w:p>
     <w:p>
@@ -12277,6 +12290,85 @@
       </w:r>
     </w:p>
     <w:p>
+      <w:pPr>
+        <w:pStyle w:val="Heading2"/>
+      </w:pPr>
+      <w:r>
+        <w:t>19.5. Required Direct Post UX</w:t>
+      </w:r>
+    </w:p>
+    <w:p>
+      <w:r>
+        <w:t>Before every publication the bot must query `/v2/post/publish/creator_info/query/` and:</w:t>
+      </w:r>
+    </w:p>
+    <w:p>
+      <w:pPr>
+        <w:pStyle w:val="ListNumber"/>
+      </w:pPr>
+      <w:r>
+        <w:t>Display the TikTok creator nickname.</w:t>
+      </w:r>
+    </w:p>
+    <w:p>
+      <w:pPr>
+        <w:pStyle w:val="ListNumber"/>
+      </w:pPr>
+      <w:r>
+        <w:t>Require a manual choice from the returned privacy options, with no default.</w:t>
+      </w:r>
+    </w:p>
+    <w:p>
+      <w:pPr>
+        <w:pStyle w:val="ListNumber"/>
+      </w:pPr>
+      <w:r>
+        <w:t>Enforce the creator-specific maximum video duration.</w:t>
+      </w:r>
+    </w:p>
+    <w:p>
+      <w:pPr>
+        <w:pStyle w:val="ListNumber"/>
+      </w:pPr>
+      <w:r>
+        <w:t>Let the user explicitly enable Comment, Duet, and Stitch only when TikTok allows them.</w:t>
+      </w:r>
+    </w:p>
+    <w:p>
+      <w:pPr>
+        <w:pStyle w:val="ListNumber"/>
+      </w:pPr>
+      <w:r>
+        <w:t>Collect commercial-content disclosure and prevent branded content with `SELF_ONLY` visibility.</w:t>
+      </w:r>
+    </w:p>
+    <w:p>
+      <w:pPr>
+        <w:pStyle w:val="ListNumber"/>
+      </w:pPr>
+      <w:r>
+        <w:t>Obtain explicit publication consent before any media is transferred.</w:t>
+      </w:r>
+    </w:p>
+    <w:p>
+      <w:pPr>
+        <w:pStyle w:val="ListNumber"/>
+      </w:pPr>
+      <w:r>
+        <w:t>Poll `/v2/post/publish/status/fetch/` or process final Content Posting webhooks.</w:t>
+      </w:r>
+    </w:p>
+    <w:p>
+      <w:r>
+        <w:t>Unaudited TikTok clients remain restricted to private posts and other platform limits. The system</w:t>
+      </w:r>
+    </w:p>
+    <w:p>
+      <w:r>
+        <w:t>must report those restrictions and must not attempt to bypass them.</w:t>
+      </w:r>
+    </w:p>
+    <w:p>
       <w:r>
         <w:t>TikTok account persistence rules are documented in TikTok Accounts Entity.</w:t>
       </w:r>
@@ -12286,7 +12378,7 @@
         <w:pStyle w:val="Heading2"/>
       </w:pPr>
       <w:r>
-        <w:t>19.5. Change Control</w:t>
+        <w:t>19.6. Change Control</w:t>
       </w:r>
     </w:p>
     <w:p>
@@ -12355,7 +12447,7 @@
         <w:pStyle w:val="Heading2"/>
       </w:pPr>
       <w:r>
-        <w:t>19.6. Compliance Rule</w:t>
+        <w:t>19.7. Compliance Rule</w:t>
       </w:r>
     </w:p>
     <w:p>
@@ -13289,12 +13381,22 @@
           <w:rFonts w:ascii="Courier New" w:hAnsi="Courier New"/>
           <w:sz w:val="17"/>
         </w:rPr>
-        <w:t>GET /api/v1/oauth/tiktok/start?telegram_id=123456&amp;username=creator</w:t>
-      </w:r>
-    </w:p>
-    <w:p>
-      <w:r>
-        <w:t>Returns a redirect to official TikTok OAuth.</w:t>
+        <w:t>GET /api/v1/oauth/tiktok/start?state=&lt;one-time-state-created-by-bot&gt;</w:t>
+      </w:r>
+    </w:p>
+    <w:p>
+      <w:r>
+        <w:t>The Telegram bot creates the short-lived state and sends this URL to the user. The endpoint</w:t>
+      </w:r>
+    </w:p>
+    <w:p>
+      <w:r>
+        <w:t>rejects missing, unknown, and expired states, then redirects to official TikTok OAuth. It never</w:t>
+      </w:r>
+    </w:p>
+    <w:p>
+      <w:r>
+        <w:t>accepts a Telegram user identifier from the public request.</w:t>
       </w:r>
     </w:p>
     <w:p>
@@ -13475,7 +13577,17 @@
     </w:p>
     <w:p>
       <w:r>
-        <w:t>TikTok webhook requests must include `X-TikTok-Signature` when `TIKTOK_WEBHOOK_SECRET` is configured.</w:t>
+        <w:t>TikTok webhook requests must include `TikTok-Signature` in the official `t=&lt;timestamp&gt;,s=&lt;hmac&gt;`</w:t>
+      </w:r>
+    </w:p>
+    <w:p>
+      <w:r>
+        <w:t>format. The API validates HMAC-SHA256 over `&lt;timestamp&gt;.&lt;raw_body&gt;` with</w:t>
+      </w:r>
+    </w:p>
+    <w:p>
+      <w:r>
+        <w:t>`TIKTOK_CLIENT_SECRET` and rejects timestamps outside the five-minute replay window.</w:t>
       </w:r>
     </w:p>
     <w:p>
@@ -13506,7 +13618,7 @@
           <w:rFonts w:ascii="Courier New" w:hAnsi="Courier New"/>
           <w:sz w:val="17"/>
         </w:rPr>
-        <w:t>curl "https://your-domain.example/api/v1/oauth/tiktok/start?telegram_id=123456"</w:t>
+        <w:t>curl "https://your-domain.example/api/v1/oauth/tiktok/start?state=$OAUTH_STATE"</w:t>
       </w:r>
     </w:p>
     <w:p>
@@ -14923,6 +15035,16 @@
       </w:r>
     </w:p>
     <w:p>
+      <w:r>
+        <w:t>The OAuth start endpoint accepts only a short-lived random `state` previously created by the</w:t>
+      </w:r>
+    </w:p>
+    <w:p>
+      <w:r>
+        <w:t>Telegram bot. Public callers cannot select a Telegram user identifier or create an account link.</w:t>
+      </w:r>
+    </w:p>
+    <w:p>
       <w:pPr>
         <w:pStyle w:val="Heading2"/>
       </w:pPr>
@@ -17521,7 +17643,12 @@
         <w:pStyle w:val="ListBullet"/>
       </w:pPr>
       <w:r>
-        <w:t>TikTok webhook signatures are checked when `TIKTOK_WEBHOOK_SECRET` is configured.</w:t>
+        <w:t>TikTok webhook signatures are always checked with `TIKTOK_CLIENT_SECRET`, the raw request body,</w:t>
+      </w:r>
+    </w:p>
+    <w:p>
+      <w:r>
+        <w:t xml:space="preserve">  and a five-minute timestamp tolerance.</w:t>
       </w:r>
     </w:p>
     <w:p>
@@ -19529,7 +19656,32 @@
     </w:p>
     <w:p>
       <w:r>
-        <w:t>TikTok API: `TIKTOK_CLIENT_KEY`, `TIKTOK_CLIENT_SECRET`, `TIKTOK_REDIRECT_URI`, `TIKTOK_WEBHOOK_SECRET`.</w:t>
+        <w:t>TikTok API: `TIKTOK_CLIENT_KEY`, `TIKTOK_CLIENT_SECRET`, `TIKTOK_REDIRECT_URI`.</w:t>
+      </w:r>
+    </w:p>
+    <w:p>
+      <w:r>
+        <w:t>Telegram delivery: `TELEGRAM_DELIVERY_MODE` is `polling` for local development and `webhook` for</w:t>
+      </w:r>
+    </w:p>
+    <w:p>
+      <w:r>
+        <w:t>production. Webhook mode also requires `TELEGRAM_WEBHOOK_SECRET`,</w:t>
+      </w:r>
+    </w:p>
+    <w:p>
+      <w:r>
+        <w:t>`TELEGRAM_WEBHOOK_PATH`, and an HTTPS `PUBLIC_BASE_URL`.</w:t>
+      </w:r>
+    </w:p>
+    <w:p>
+      <w:r>
+        <w:t>`TIKTOK_WEBHOOK_SECRET` is retained only as a deprecated compatibility variable. Official TikTok</w:t>
+      </w:r>
+    </w:p>
+    <w:p>
+      <w:r>
+        <w:t>webhook verification uses `TIKTOK_CLIENT_SECRET`.</w:t>
       </w:r>
     </w:p>
     <w:p>
@@ -20070,7 +20222,37 @@
     </w:p>
     <w:p>
       <w:r>
-        <w:t>The current bot service uses long polling. If webhook mode is introduced later, expose it through FastAPI/Nginx and document the endpoint before enabling it in production.</w:t>
+        <w:t>Development can use `TELEGRAM_DELIVERY_MODE=polling`. Production uses</w:t>
+      </w:r>
+    </w:p>
+    <w:p>
+      <w:r>
+        <w:t>`TELEGRAM_DELIVERY_MODE=webhook`; the bot service registers</w:t>
+      </w:r>
+    </w:p>
+    <w:p>
+      <w:r>
+        <w:t>`https://&lt;domain&gt;/api/v1/webhooks/telegram`, while FastAPI verifies</w:t>
+      </w:r>
+    </w:p>
+    <w:p>
+      <w:r>
+        <w:t>`X-Telegram-Bot-Api-Secret-Token` and dispatches the update through aiogram. FSM data is stored in</w:t>
+      </w:r>
+    </w:p>
+    <w:p>
+      <w:r>
+        <w:t>Redis so multiple API instances share state.</w:t>
+      </w:r>
+    </w:p>
+    <w:p>
+      <w:r>
+        <w:t>Never configure a bot token that has appeared in chat, logs, source files, or Git. Revoke it in</w:t>
+      </w:r>
+    </w:p>
+    <w:p>
+      <w:r>
+        <w:t>BotFather and place the replacement only in the server-side `.env`.</w:t>
       </w:r>
     </w:p>
     <w:p>
@@ -25242,15 +25424,15 @@
         <w:pStyle w:val="ListBullet"/>
       </w:pPr>
       <w:r>
-        <w:t>Temporary network failures.</w:t>
-      </w:r>
-    </w:p>
-    <w:p>
-      <w:pPr>
-        <w:pStyle w:val="ListBullet"/>
-      </w:pPr>
-      <w:r>
-        <w:t>Temporary TikTok service errors.</w:t>
+        <w:t>Deterministic byte-range chunk uploads rejected with a temporary TikTok 5xx response.</w:t>
+      </w:r>
+    </w:p>
+    <w:p>
+      <w:pPr>
+        <w:pStyle w:val="ListBullet"/>
+      </w:pPr>
+      <w:r>
+        <w:t>Publication status checks that have not yet reached a terminal TikTok status.</w:t>
       </w:r>
     </w:p>
     <w:p>
@@ -25270,11 +25452,18 @@
       </w:r>
     </w:p>
     <w:p>
-      <w:pPr>
-        <w:pStyle w:val="ListBullet"/>
-      </w:pPr>
-      <w:r>
-        <w:t>Worker interruption before a terminal state is saved.</w:t>
+      <w:r>
+        <w:t>The complete publication actor is not automatically replayed after an ambiguous failure because</w:t>
+      </w:r>
+    </w:p>
+    <w:p>
+      <w:r>
+        <w:t>the official API may already have accepted the publication. Such jobs are marked failed for</w:t>
+      </w:r>
+    </w:p>
+    <w:p>
+      <w:r>
+        <w:t>operator review. A full retry requires evidence that TikTok did not accept the earlier request.</w:t>
       </w:r>
     </w:p>
     <w:p>
@@ -37087,944 +37276,7 @@
       <w:pStyle w:val="Footer"/>
       <w:jc w:val="center"/>
     </w:pPr>
-    <w:r>
-      <w:t xml:space="preserve">Страница </w:t>
-    </w:r>
-    <w:r>
-      <w:fldChar w:fldCharType="begin"/>
-      <w:instrText xml:space="preserve">PAGE</w:instrText>
-      <w:fldChar w:fldCharType="separate"/>
-    </w:r>
-    <w:r>
-      <w:t>1</w:t>
-    </w:r>
-    <w:r>
-      <w:fldChar w:fldCharType="end"/>
-    </w:r>
-    <w:r>
-      <w:t xml:space="preserve">Страница </w:t>
-    </w:r>
-    <w:r>
-      <w:fldChar w:fldCharType="begin"/>
-      <w:instrText xml:space="preserve">PAGE</w:instrText>
-      <w:fldChar w:fldCharType="separate"/>
-    </w:r>
-    <w:r>
-      <w:t>1</w:t>
-    </w:r>
-    <w:r>
-      <w:fldChar w:fldCharType="end"/>
-    </w:r>
-    <w:r>
-      <w:t xml:space="preserve">Страница </w:t>
-    </w:r>
-    <w:r>
-      <w:fldChar w:fldCharType="begin"/>
-      <w:instrText xml:space="preserve">PAGE</w:instrText>
-      <w:fldChar w:fldCharType="separate"/>
-    </w:r>
-    <w:r>
-      <w:t>1</w:t>
-    </w:r>
-    <w:r>
-      <w:fldChar w:fldCharType="end"/>
-    </w:r>
-    <w:r>
-      <w:t xml:space="preserve">Страница </w:t>
-    </w:r>
-    <w:r>
-      <w:fldChar w:fldCharType="begin"/>
-      <w:instrText xml:space="preserve">PAGE</w:instrText>
-      <w:fldChar w:fldCharType="separate"/>
-    </w:r>
-    <w:r>
-      <w:t>1</w:t>
-    </w:r>
-    <w:r>
-      <w:fldChar w:fldCharType="end"/>
-    </w:r>
-    <w:r>
-      <w:t xml:space="preserve">Страница </w:t>
-    </w:r>
-    <w:r>
-      <w:fldChar w:fldCharType="begin"/>
-      <w:instrText xml:space="preserve">PAGE</w:instrText>
-      <w:fldChar w:fldCharType="separate"/>
-    </w:r>
-    <w:r>
-      <w:t>1</w:t>
-    </w:r>
-    <w:r>
-      <w:fldChar w:fldCharType="end"/>
-    </w:r>
-    <w:r>
-      <w:t xml:space="preserve">Страница </w:t>
-    </w:r>
-    <w:r>
-      <w:fldChar w:fldCharType="begin"/>
-      <w:instrText xml:space="preserve">PAGE</w:instrText>
-      <w:fldChar w:fldCharType="separate"/>
-    </w:r>
-    <w:r>
-      <w:t>1</w:t>
-    </w:r>
-    <w:r>
-      <w:fldChar w:fldCharType="end"/>
-    </w:r>
-    <w:r>
-      <w:t xml:space="preserve">Страница </w:t>
-    </w:r>
-    <w:r>
-      <w:fldChar w:fldCharType="begin"/>
-      <w:instrText xml:space="preserve">PAGE</w:instrText>
-      <w:fldChar w:fldCharType="separate"/>
-    </w:r>
-    <w:r>
-      <w:t>1</w:t>
-    </w:r>
-    <w:r>
-      <w:fldChar w:fldCharType="end"/>
-    </w:r>
-    <w:r>
-      <w:t xml:space="preserve">Страница </w:t>
-    </w:r>
-    <w:r>
-      <w:fldChar w:fldCharType="begin"/>
-      <w:instrText xml:space="preserve">PAGE</w:instrText>
-      <w:fldChar w:fldCharType="separate"/>
-    </w:r>
-    <w:r>
-      <w:t>1</w:t>
-    </w:r>
-    <w:r>
-      <w:fldChar w:fldCharType="end"/>
-    </w:r>
-    <w:r>
-      <w:t xml:space="preserve">Страница </w:t>
-    </w:r>
-    <w:r>
-      <w:fldChar w:fldCharType="begin"/>
-      <w:instrText xml:space="preserve">PAGE</w:instrText>
-      <w:fldChar w:fldCharType="separate"/>
-    </w:r>
-    <w:r>
-      <w:t>1</w:t>
-    </w:r>
-    <w:r>
-      <w:fldChar w:fldCharType="end"/>
-    </w:r>
-    <w:r>
-      <w:t xml:space="preserve">Страница </w:t>
-    </w:r>
-    <w:r>
-      <w:fldChar w:fldCharType="begin"/>
-      <w:instrText xml:space="preserve">PAGE</w:instrText>
-      <w:fldChar w:fldCharType="separate"/>
-    </w:r>
-    <w:r>
-      <w:t>1</w:t>
-    </w:r>
-    <w:r>
-      <w:fldChar w:fldCharType="end"/>
-    </w:r>
-    <w:r>
-      <w:t xml:space="preserve">Страница </w:t>
-    </w:r>
-    <w:r>
-      <w:fldChar w:fldCharType="begin"/>
-      <w:instrText xml:space="preserve">PAGE</w:instrText>
-      <w:fldChar w:fldCharType="separate"/>
-    </w:r>
-    <w:r>
-      <w:t>1</w:t>
-    </w:r>
-    <w:r>
-      <w:fldChar w:fldCharType="end"/>
-    </w:r>
-    <w:r>
-      <w:t xml:space="preserve">Страница </w:t>
-    </w:r>
-    <w:r>
-      <w:fldChar w:fldCharType="begin"/>
-      <w:instrText xml:space="preserve">PAGE</w:instrText>
-      <w:fldChar w:fldCharType="separate"/>
-    </w:r>
-    <w:r>
-      <w:t>1</w:t>
-    </w:r>
-    <w:r>
-      <w:fldChar w:fldCharType="end"/>
-    </w:r>
-    <w:r>
-      <w:t xml:space="preserve">Страница </w:t>
-    </w:r>
-    <w:r>
-      <w:fldChar w:fldCharType="begin"/>
-      <w:instrText xml:space="preserve">PAGE</w:instrText>
-      <w:fldChar w:fldCharType="separate"/>
-    </w:r>
-    <w:r>
-      <w:t>1</w:t>
-    </w:r>
-    <w:r>
-      <w:fldChar w:fldCharType="end"/>
-    </w:r>
-    <w:r>
-      <w:t xml:space="preserve">Страница </w:t>
-    </w:r>
-    <w:r>
-      <w:fldChar w:fldCharType="begin"/>
-      <w:instrText xml:space="preserve">PAGE</w:instrText>
-      <w:fldChar w:fldCharType="separate"/>
-    </w:r>
-    <w:r>
-      <w:t>1</w:t>
-    </w:r>
-    <w:r>
-      <w:fldChar w:fldCharType="end"/>
-    </w:r>
-    <w:r>
-      <w:t xml:space="preserve">Страница </w:t>
-    </w:r>
-    <w:r>
-      <w:fldChar w:fldCharType="begin"/>
-      <w:instrText xml:space="preserve">PAGE</w:instrText>
-      <w:fldChar w:fldCharType="separate"/>
-    </w:r>
-    <w:r>
-      <w:t>1</w:t>
-    </w:r>
-    <w:r>
-      <w:fldChar w:fldCharType="end"/>
-    </w:r>
-    <w:r>
-      <w:t xml:space="preserve">Страница </w:t>
-    </w:r>
-    <w:r>
-      <w:fldChar w:fldCharType="begin"/>
-      <w:instrText xml:space="preserve">PAGE</w:instrText>
-      <w:fldChar w:fldCharType="separate"/>
-    </w:r>
-    <w:r>
-      <w:t>1</w:t>
-    </w:r>
-    <w:r>
-      <w:fldChar w:fldCharType="end"/>
-    </w:r>
-    <w:r>
-      <w:t xml:space="preserve">Страница </w:t>
-    </w:r>
-    <w:r>
-      <w:fldChar w:fldCharType="begin"/>
-      <w:instrText xml:space="preserve">PAGE</w:instrText>
-      <w:fldChar w:fldCharType="separate"/>
-    </w:r>
-    <w:r>
-      <w:t>1</w:t>
-    </w:r>
-    <w:r>
-      <w:fldChar w:fldCharType="end"/>
-    </w:r>
-    <w:r>
-      <w:t xml:space="preserve">Страница </w:t>
-    </w:r>
-    <w:r>
-      <w:fldChar w:fldCharType="begin"/>
-      <w:instrText xml:space="preserve">PAGE</w:instrText>
-      <w:fldChar w:fldCharType="separate"/>
-    </w:r>
-    <w:r>
-      <w:t>1</w:t>
-    </w:r>
-    <w:r>
-      <w:fldChar w:fldCharType="end"/>
-    </w:r>
-    <w:r>
-      <w:t xml:space="preserve">Страница </w:t>
-    </w:r>
-    <w:r>
-      <w:fldChar w:fldCharType="begin"/>
-      <w:instrText xml:space="preserve">PAGE</w:instrText>
-      <w:fldChar w:fldCharType="separate"/>
-    </w:r>
-    <w:r>
-      <w:t>1</w:t>
-    </w:r>
-    <w:r>
-      <w:fldChar w:fldCharType="end"/>
-    </w:r>
-    <w:r>
-      <w:t xml:space="preserve">Страница </w:t>
-    </w:r>
-    <w:r>
-      <w:fldChar w:fldCharType="begin"/>
-      <w:instrText xml:space="preserve">PAGE</w:instrText>
-      <w:fldChar w:fldCharType="separate"/>
-    </w:r>
-    <w:r>
-      <w:t>1</w:t>
-    </w:r>
-    <w:r>
-      <w:fldChar w:fldCharType="end"/>
-    </w:r>
-    <w:r>
-      <w:t xml:space="preserve">Страница </w:t>
-    </w:r>
-    <w:r>
-      <w:fldChar w:fldCharType="begin"/>
-      <w:instrText xml:space="preserve">PAGE</w:instrText>
-      <w:fldChar w:fldCharType="separate"/>
-    </w:r>
-    <w:r>
-      <w:t>1</w:t>
-    </w:r>
-    <w:r>
-      <w:fldChar w:fldCharType="end"/>
-    </w:r>
-    <w:r>
-      <w:t xml:space="preserve">Страница </w:t>
-    </w:r>
-    <w:r>
-      <w:fldChar w:fldCharType="begin"/>
-      <w:instrText xml:space="preserve">PAGE</w:instrText>
-      <w:fldChar w:fldCharType="separate"/>
-    </w:r>
-    <w:r>
-      <w:t>1</w:t>
-    </w:r>
-    <w:r>
-      <w:fldChar w:fldCharType="end"/>
-    </w:r>
-    <w:r>
-      <w:t xml:space="preserve">Страница </w:t>
-    </w:r>
-    <w:r>
-      <w:fldChar w:fldCharType="begin"/>
-      <w:instrText xml:space="preserve">PAGE</w:instrText>
-      <w:fldChar w:fldCharType="separate"/>
-    </w:r>
-    <w:r>
-      <w:t>1</w:t>
-    </w:r>
-    <w:r>
-      <w:fldChar w:fldCharType="end"/>
-    </w:r>
-    <w:r>
-      <w:t xml:space="preserve">Страница </w:t>
-    </w:r>
-    <w:r>
-      <w:fldChar w:fldCharType="begin"/>
-      <w:instrText xml:space="preserve">PAGE</w:instrText>
-      <w:fldChar w:fldCharType="separate"/>
-    </w:r>
-    <w:r>
-      <w:t>1</w:t>
-    </w:r>
-    <w:r>
-      <w:fldChar w:fldCharType="end"/>
-    </w:r>
-    <w:r>
-      <w:t xml:space="preserve">Страница </w:t>
-    </w:r>
-    <w:r>
-      <w:fldChar w:fldCharType="begin"/>
-      <w:instrText xml:space="preserve">PAGE</w:instrText>
-      <w:fldChar w:fldCharType="separate"/>
-    </w:r>
-    <w:r>
-      <w:t>1</w:t>
-    </w:r>
-    <w:r>
-      <w:fldChar w:fldCharType="end"/>
-    </w:r>
-    <w:r>
-      <w:t xml:space="preserve">Страница </w:t>
-    </w:r>
-    <w:r>
-      <w:fldChar w:fldCharType="begin"/>
-      <w:instrText xml:space="preserve">PAGE</w:instrText>
-      <w:fldChar w:fldCharType="separate"/>
-    </w:r>
-    <w:r>
-      <w:t>1</w:t>
-    </w:r>
-    <w:r>
-      <w:fldChar w:fldCharType="end"/>
-    </w:r>
-    <w:r>
-      <w:t xml:space="preserve">Страница </w:t>
-    </w:r>
-    <w:r>
-      <w:fldChar w:fldCharType="begin"/>
-      <w:instrText xml:space="preserve">PAGE</w:instrText>
-      <w:fldChar w:fldCharType="separate"/>
-    </w:r>
-    <w:r>
-      <w:t>1</w:t>
-    </w:r>
-    <w:r>
-      <w:fldChar w:fldCharType="end"/>
-    </w:r>
-    <w:r>
-      <w:t xml:space="preserve">Страница </w:t>
-    </w:r>
-    <w:r>
-      <w:fldChar w:fldCharType="begin"/>
-      <w:instrText xml:space="preserve">PAGE</w:instrText>
-      <w:fldChar w:fldCharType="separate"/>
-    </w:r>
-    <w:r>
-      <w:t>1</w:t>
-    </w:r>
-    <w:r>
-      <w:fldChar w:fldCharType="end"/>
-    </w:r>
-    <w:r>
-      <w:t xml:space="preserve">Страница </w:t>
-    </w:r>
-    <w:r>
-      <w:fldChar w:fldCharType="begin"/>
-      <w:instrText xml:space="preserve">PAGE</w:instrText>
-      <w:fldChar w:fldCharType="separate"/>
-    </w:r>
-    <w:r>
-      <w:t>1</w:t>
-    </w:r>
-    <w:r>
-      <w:fldChar w:fldCharType="end"/>
-    </w:r>
-    <w:r>
-      <w:t xml:space="preserve">Страница </w:t>
-    </w:r>
-    <w:r>
-      <w:fldChar w:fldCharType="begin"/>
-      <w:instrText xml:space="preserve">PAGE</w:instrText>
-      <w:fldChar w:fldCharType="separate"/>
-    </w:r>
-    <w:r>
-      <w:t>1</w:t>
-    </w:r>
-    <w:r>
-      <w:fldChar w:fldCharType="end"/>
-    </w:r>
-    <w:r>
-      <w:t xml:space="preserve">Страница </w:t>
-    </w:r>
-    <w:r>
-      <w:fldChar w:fldCharType="begin"/>
-      <w:instrText xml:space="preserve">PAGE</w:instrText>
-      <w:fldChar w:fldCharType="separate"/>
-    </w:r>
-    <w:r>
-      <w:t>1</w:t>
-    </w:r>
-    <w:r>
-      <w:fldChar w:fldCharType="end"/>
-    </w:r>
-    <w:r>
-      <w:t xml:space="preserve">Страница </w:t>
-    </w:r>
-    <w:r>
-      <w:fldChar w:fldCharType="begin"/>
-      <w:instrText xml:space="preserve">PAGE</w:instrText>
-      <w:fldChar w:fldCharType="separate"/>
-    </w:r>
-    <w:r>
-      <w:t>1</w:t>
-    </w:r>
-    <w:r>
-      <w:fldChar w:fldCharType="end"/>
-    </w:r>
-    <w:r>
-      <w:t xml:space="preserve">Страница </w:t>
-    </w:r>
-    <w:r>
-      <w:fldChar w:fldCharType="begin"/>
-      <w:instrText xml:space="preserve">PAGE</w:instrText>
-      <w:fldChar w:fldCharType="separate"/>
-    </w:r>
-    <w:r>
-      <w:t>1</w:t>
-    </w:r>
-    <w:r>
-      <w:fldChar w:fldCharType="end"/>
-    </w:r>
-    <w:r>
-      <w:t xml:space="preserve">Страница </w:t>
-    </w:r>
-    <w:r>
-      <w:fldChar w:fldCharType="begin"/>
-      <w:instrText xml:space="preserve">PAGE</w:instrText>
-      <w:fldChar w:fldCharType="separate"/>
-    </w:r>
-    <w:r>
-      <w:t>1</w:t>
-    </w:r>
-    <w:r>
-      <w:fldChar w:fldCharType="end"/>
-    </w:r>
-    <w:r>
-      <w:t xml:space="preserve">Страница </w:t>
-    </w:r>
-    <w:r>
-      <w:fldChar w:fldCharType="begin"/>
-      <w:instrText xml:space="preserve">PAGE</w:instrText>
-      <w:fldChar w:fldCharType="separate"/>
-    </w:r>
-    <w:r>
-      <w:t>1</w:t>
-    </w:r>
-    <w:r>
-      <w:fldChar w:fldCharType="end"/>
-    </w:r>
-    <w:r>
-      <w:t xml:space="preserve">Страница </w:t>
-    </w:r>
-    <w:r>
-      <w:fldChar w:fldCharType="begin"/>
-      <w:instrText xml:space="preserve">PAGE</w:instrText>
-      <w:fldChar w:fldCharType="separate"/>
-    </w:r>
-    <w:r>
-      <w:t>1</w:t>
-    </w:r>
-    <w:r>
-      <w:fldChar w:fldCharType="end"/>
-    </w:r>
-    <w:r>
-      <w:t xml:space="preserve">Страница </w:t>
-    </w:r>
-    <w:r>
-      <w:fldChar w:fldCharType="begin"/>
-      <w:instrText xml:space="preserve">PAGE</w:instrText>
-      <w:fldChar w:fldCharType="separate"/>
-    </w:r>
-    <w:r>
-      <w:t>1</w:t>
-    </w:r>
-    <w:r>
-      <w:fldChar w:fldCharType="end"/>
-    </w:r>
-    <w:r>
-      <w:t xml:space="preserve">Страница </w:t>
-    </w:r>
-    <w:r>
-      <w:fldChar w:fldCharType="begin"/>
-      <w:instrText xml:space="preserve">PAGE</w:instrText>
-      <w:fldChar w:fldCharType="separate"/>
-    </w:r>
-    <w:r>
-      <w:t>1</w:t>
-    </w:r>
-    <w:r>
-      <w:fldChar w:fldCharType="end"/>
-    </w:r>
-    <w:r>
-      <w:t xml:space="preserve">Страница </w:t>
-    </w:r>
-    <w:r>
-      <w:fldChar w:fldCharType="begin"/>
-      <w:instrText xml:space="preserve">PAGE</w:instrText>
-      <w:fldChar w:fldCharType="separate"/>
-    </w:r>
-    <w:r>
-      <w:t>1</w:t>
-    </w:r>
-    <w:r>
-      <w:fldChar w:fldCharType="end"/>
-    </w:r>
-    <w:r>
-      <w:t xml:space="preserve">Страница </w:t>
-    </w:r>
-    <w:r>
-      <w:fldChar w:fldCharType="begin"/>
-      <w:instrText xml:space="preserve">PAGE</w:instrText>
-      <w:fldChar w:fldCharType="separate"/>
-    </w:r>
-    <w:r>
-      <w:t>1</w:t>
-    </w:r>
-    <w:r>
-      <w:fldChar w:fldCharType="end"/>
-    </w:r>
-    <w:r>
-      <w:t xml:space="preserve">Страница </w:t>
-    </w:r>
-    <w:r>
-      <w:fldChar w:fldCharType="begin"/>
-      <w:instrText xml:space="preserve">PAGE</w:instrText>
-      <w:fldChar w:fldCharType="separate"/>
-    </w:r>
-    <w:r>
-      <w:t>1</w:t>
-    </w:r>
-    <w:r>
-      <w:fldChar w:fldCharType="end"/>
-    </w:r>
-    <w:r>
-      <w:t xml:space="preserve">Страница </w:t>
-    </w:r>
-    <w:r>
-      <w:fldChar w:fldCharType="begin"/>
-      <w:instrText xml:space="preserve">PAGE</w:instrText>
-      <w:fldChar w:fldCharType="separate"/>
-    </w:r>
-    <w:r>
-      <w:t>1</w:t>
-    </w:r>
-    <w:r>
-      <w:fldChar w:fldCharType="end"/>
-    </w:r>
-    <w:r>
-      <w:t xml:space="preserve">Страница </w:t>
-    </w:r>
-    <w:r>
-      <w:fldChar w:fldCharType="begin"/>
-      <w:instrText xml:space="preserve">PAGE</w:instrText>
-      <w:fldChar w:fldCharType="separate"/>
-    </w:r>
-    <w:r>
-      <w:t>1</w:t>
-    </w:r>
-    <w:r>
-      <w:fldChar w:fldCharType="end"/>
-    </w:r>
-    <w:r>
-      <w:t xml:space="preserve">Страница </w:t>
-    </w:r>
-    <w:r>
-      <w:fldChar w:fldCharType="begin"/>
-      <w:instrText xml:space="preserve">PAGE</w:instrText>
-      <w:fldChar w:fldCharType="separate"/>
-    </w:r>
-    <w:r>
-      <w:t>1</w:t>
-    </w:r>
-    <w:r>
-      <w:fldChar w:fldCharType="end"/>
-    </w:r>
-    <w:r>
-      <w:t xml:space="preserve">Страница </w:t>
-    </w:r>
-    <w:r>
-      <w:fldChar w:fldCharType="begin"/>
-      <w:instrText xml:space="preserve">PAGE</w:instrText>
-      <w:fldChar w:fldCharType="separate"/>
-    </w:r>
-    <w:r>
-      <w:t>1</w:t>
-    </w:r>
-    <w:r>
-      <w:fldChar w:fldCharType="end"/>
-    </w:r>
-    <w:r>
-      <w:t xml:space="preserve">Страница </w:t>
-    </w:r>
-    <w:r>
-      <w:fldChar w:fldCharType="begin"/>
-      <w:instrText xml:space="preserve">PAGE</w:instrText>
-      <w:fldChar w:fldCharType="separate"/>
-    </w:r>
-    <w:r>
-      <w:t>1</w:t>
-    </w:r>
-    <w:r>
-      <w:fldChar w:fldCharType="end"/>
-    </w:r>
-    <w:r>
-      <w:t xml:space="preserve">Страница </w:t>
-    </w:r>
-    <w:r>
-      <w:fldChar w:fldCharType="begin"/>
-      <w:instrText xml:space="preserve">PAGE</w:instrText>
-      <w:fldChar w:fldCharType="separate"/>
-    </w:r>
-    <w:r>
-      <w:t>1</w:t>
-    </w:r>
-    <w:r>
-      <w:fldChar w:fldCharType="end"/>
-    </w:r>
-    <w:r>
-      <w:t xml:space="preserve">Страница </w:t>
-    </w:r>
-    <w:r>
-      <w:fldChar w:fldCharType="begin"/>
-      <w:instrText xml:space="preserve">PAGE</w:instrText>
-      <w:fldChar w:fldCharType="separate"/>
-    </w:r>
-    <w:r>
-      <w:t>1</w:t>
-    </w:r>
-    <w:r>
-      <w:fldChar w:fldCharType="end"/>
-    </w:r>
-    <w:r>
-      <w:t xml:space="preserve">Страница </w:t>
-    </w:r>
-    <w:r>
-      <w:fldChar w:fldCharType="begin"/>
-      <w:instrText xml:space="preserve">PAGE</w:instrText>
-      <w:fldChar w:fldCharType="separate"/>
-    </w:r>
-    <w:r>
-      <w:t>1</w:t>
-    </w:r>
-    <w:r>
-      <w:fldChar w:fldCharType="end"/>
-    </w:r>
-    <w:r>
-      <w:t xml:space="preserve">Страница </w:t>
-    </w:r>
-    <w:r>
-      <w:fldChar w:fldCharType="begin"/>
-      <w:instrText xml:space="preserve">PAGE</w:instrText>
-      <w:fldChar w:fldCharType="separate"/>
-    </w:r>
-    <w:r>
-      <w:t>1</w:t>
-    </w:r>
-    <w:r>
-      <w:fldChar w:fldCharType="end"/>
-    </w:r>
-    <w:r>
-      <w:t xml:space="preserve">Страница </w:t>
-    </w:r>
-    <w:r>
-      <w:fldChar w:fldCharType="begin"/>
-      <w:instrText xml:space="preserve">PAGE</w:instrText>
-      <w:fldChar w:fldCharType="separate"/>
-    </w:r>
-    <w:r>
-      <w:t>1</w:t>
-    </w:r>
-    <w:r>
-      <w:fldChar w:fldCharType="end"/>
-    </w:r>
-    <w:r>
-      <w:t xml:space="preserve">Страница </w:t>
-    </w:r>
-    <w:r>
-      <w:fldChar w:fldCharType="begin"/>
-      <w:instrText xml:space="preserve">PAGE</w:instrText>
-      <w:fldChar w:fldCharType="separate"/>
-    </w:r>
-    <w:r>
-      <w:t>1</w:t>
-    </w:r>
-    <w:r>
-      <w:fldChar w:fldCharType="end"/>
-    </w:r>
-    <w:r>
-      <w:t xml:space="preserve">Страница </w:t>
-    </w:r>
-    <w:r>
-      <w:fldChar w:fldCharType="begin"/>
-      <w:instrText xml:space="preserve">PAGE</w:instrText>
-      <w:fldChar w:fldCharType="separate"/>
-    </w:r>
-    <w:r>
-      <w:t>1</w:t>
-    </w:r>
-    <w:r>
-      <w:fldChar w:fldCharType="end"/>
-    </w:r>
-    <w:r>
-      <w:t xml:space="preserve">Страница </w:t>
-    </w:r>
-    <w:r>
-      <w:fldChar w:fldCharType="begin"/>
-      <w:instrText xml:space="preserve">PAGE</w:instrText>
-      <w:fldChar w:fldCharType="separate"/>
-    </w:r>
-    <w:r>
-      <w:t>1</w:t>
-    </w:r>
-    <w:r>
-      <w:fldChar w:fldCharType="end"/>
-    </w:r>
-    <w:r>
-      <w:t xml:space="preserve">Страница </w:t>
-    </w:r>
-    <w:r>
-      <w:fldChar w:fldCharType="begin"/>
-      <w:instrText xml:space="preserve">PAGE</w:instrText>
-      <w:fldChar w:fldCharType="separate"/>
-    </w:r>
-    <w:r>
-      <w:t>1</w:t>
-    </w:r>
-    <w:r>
-      <w:fldChar w:fldCharType="end"/>
-    </w:r>
-    <w:r>
-      <w:t xml:space="preserve">Страница </w:t>
-    </w:r>
-    <w:r>
-      <w:fldChar w:fldCharType="begin"/>
-      <w:instrText xml:space="preserve">PAGE</w:instrText>
-      <w:fldChar w:fldCharType="separate"/>
-    </w:r>
-    <w:r>
-      <w:t>1</w:t>
-    </w:r>
-    <w:r>
-      <w:fldChar w:fldCharType="end"/>
-    </w:r>
-    <w:r>
-      <w:t xml:space="preserve">Страница </w:t>
-    </w:r>
-    <w:r>
-      <w:fldChar w:fldCharType="begin"/>
-      <w:instrText xml:space="preserve">PAGE</w:instrText>
-      <w:fldChar w:fldCharType="separate"/>
-    </w:r>
-    <w:r>
-      <w:t>1</w:t>
-    </w:r>
-    <w:r>
-      <w:fldChar w:fldCharType="end"/>
-    </w:r>
-    <w:r>
-      <w:t xml:space="preserve">Страница </w:t>
-    </w:r>
-    <w:r>
-      <w:fldChar w:fldCharType="begin"/>
-      <w:instrText xml:space="preserve">PAGE</w:instrText>
-      <w:fldChar w:fldCharType="separate"/>
-    </w:r>
-    <w:r>
-      <w:t>1</w:t>
-    </w:r>
-    <w:r>
-      <w:fldChar w:fldCharType="end"/>
-    </w:r>
-    <w:r>
-      <w:t xml:space="preserve">Страница </w:t>
-    </w:r>
-    <w:r>
-      <w:fldChar w:fldCharType="begin"/>
-      <w:instrText xml:space="preserve">PAGE</w:instrText>
-      <w:fldChar w:fldCharType="separate"/>
-    </w:r>
-    <w:r>
-      <w:t>1</w:t>
-    </w:r>
-    <w:r>
-      <w:fldChar w:fldCharType="end"/>
-    </w:r>
-    <w:r>
-      <w:t xml:space="preserve">Страница </w:t>
-    </w:r>
-    <w:r>
-      <w:fldChar w:fldCharType="begin"/>
-      <w:instrText xml:space="preserve">PAGE</w:instrText>
-      <w:fldChar w:fldCharType="separate"/>
-    </w:r>
-    <w:r>
-      <w:t>1</w:t>
-    </w:r>
-    <w:r>
-      <w:fldChar w:fldCharType="end"/>
-    </w:r>
-    <w:r>
-      <w:t xml:space="preserve">Страница </w:t>
-    </w:r>
-    <w:r>
-      <w:fldChar w:fldCharType="begin"/>
-      <w:instrText xml:space="preserve">PAGE</w:instrText>
-      <w:fldChar w:fldCharType="separate"/>
-    </w:r>
-    <w:r>
-      <w:t>1</w:t>
-    </w:r>
-    <w:r>
-      <w:fldChar w:fldCharType="end"/>
-    </w:r>
-    <w:r>
-      <w:t xml:space="preserve">Страница </w:t>
-    </w:r>
-    <w:r>
-      <w:fldChar w:fldCharType="begin"/>
-      <w:instrText xml:space="preserve">PAGE</w:instrText>
-      <w:fldChar w:fldCharType="separate"/>
-    </w:r>
-    <w:r>
-      <w:t>1</w:t>
-    </w:r>
-    <w:r>
-      <w:fldChar w:fldCharType="end"/>
-    </w:r>
-    <w:r>
-      <w:t xml:space="preserve">Страница </w:t>
-    </w:r>
-    <w:r>
-      <w:fldChar w:fldCharType="begin"/>
-      <w:instrText xml:space="preserve">PAGE</w:instrText>
-      <w:fldChar w:fldCharType="separate"/>
-    </w:r>
-    <w:r>
-      <w:t>1</w:t>
-    </w:r>
-    <w:r>
-      <w:fldChar w:fldCharType="end"/>
-    </w:r>
-    <w:r>
-      <w:t xml:space="preserve">Страница </w:t>
-    </w:r>
-    <w:r>
-      <w:fldChar w:fldCharType="begin"/>
-      <w:instrText xml:space="preserve">PAGE</w:instrText>
-      <w:fldChar w:fldCharType="separate"/>
-    </w:r>
-    <w:r>
-      <w:t>1</w:t>
-    </w:r>
-    <w:r>
-      <w:fldChar w:fldCharType="end"/>
-    </w:r>
-    <w:r>
-      <w:t xml:space="preserve">Страница </w:t>
-    </w:r>
-    <w:r>
-      <w:fldChar w:fldCharType="begin"/>
-      <w:instrText xml:space="preserve">PAGE</w:instrText>
-      <w:fldChar w:fldCharType="separate"/>
-    </w:r>
-    <w:r>
-      <w:t>1</w:t>
-    </w:r>
-    <w:r>
-      <w:fldChar w:fldCharType="end"/>
-    </w:r>
-    <w:r>
-      <w:t xml:space="preserve">Страница </w:t>
-    </w:r>
-    <w:r>
-      <w:fldChar w:fldCharType="begin"/>
-      <w:instrText xml:space="preserve">PAGE</w:instrText>
-      <w:fldChar w:fldCharType="separate"/>
-    </w:r>
-    <w:r>
-      <w:t>1</w:t>
-    </w:r>
-    <w:r>
-      <w:fldChar w:fldCharType="end"/>
-    </w:r>
-    <w:r>
-      <w:t xml:space="preserve">Страница </w:t>
-    </w:r>
-    <w:r>
-      <w:fldChar w:fldCharType="begin"/>
-      <w:instrText xml:space="preserve">PAGE</w:instrText>
-      <w:fldChar w:fldCharType="separate"/>
-    </w:r>
-    <w:r>
-      <w:t>1</w:t>
-    </w:r>
-    <w:r>
-      <w:fldChar w:fldCharType="end"/>
-    </w:r>
+    <w:r/>
     <w:r>
       <w:t xml:space="preserve">Страница </w:t>
     </w:r>

</xml_diff>

<commit_message>
feat: add recurring maintenance lifecycle
</commit_message>
<xml_diff>
--- a/docs/final/Tik_Tok_Loader_Unified_Specification.docx
+++ b/docs/final/Tik_Tok_Loader_Unified_Specification.docx
@@ -39,11 +39,11 @@
         <w:jc w:val="center"/>
       </w:pPr>
       <w:r>
-        <w:t>Версия: 0.2.0</w:t>
+        <w:t>Версия: 0.3.0</w:t>
         <w:br/>
         <w:t>Репозиторий: kredavto/Tik-Tok-bot-Rus-2</w:t>
         <w:br/>
-        <w:t>Дата сборки: 2026-07-13</w:t>
+        <w:t>Дата сборки: 2026-07-14</w:t>
         <w:br/>
         <w:t>Статус: проектная спецификация для реализации</w:t>
       </w:r>
@@ -1049,6 +1049,36 @@
               <w:spacing w:after="0" w:line="252" w:lineRule="auto"/>
             </w:pPr>
             <w:r>
+              <w:t>Scheduler</w:t>
+            </w:r>
+          </w:p>
+        </w:tc>
+        <w:tc>
+          <w:tcPr>
+            <w:tcW w:type="dxa" w:w="6760"/>
+            <w:vAlign w:val="center"/>
+          </w:tcPr>
+          <w:p>
+            <w:pPr>
+              <w:spacing w:after="0" w:line="252" w:lineRule="auto"/>
+            </w:pPr>
+            <w:r>
+              <w:t>Redis-leased dispatch and heartbeat for recurring maintenance jobs</w:t>
+            </w:r>
+          </w:p>
+        </w:tc>
+      </w:tr>
+      <w:tr>
+        <w:tc>
+          <w:tcPr>
+            <w:tcW w:type="dxa" w:w="2600"/>
+            <w:vAlign w:val="center"/>
+          </w:tcPr>
+          <w:p>
+            <w:pPr>
+              <w:spacing w:after="0" w:line="252" w:lineRule="auto"/>
+            </w:pPr>
+            <w:r>
               <w:t>Robokassa</w:t>
             </w:r>
           </w:p>
@@ -1710,6 +1740,36 @@
               <w:spacing w:after="0" w:line="252" w:lineRule="auto"/>
             </w:pPr>
             <w:r>
+              <w:t>Scheduler</w:t>
+            </w:r>
+          </w:p>
+        </w:tc>
+        <w:tc>
+          <w:tcPr>
+            <w:tcW w:type="dxa" w:w="6760"/>
+            <w:vAlign w:val="center"/>
+          </w:tcPr>
+          <w:p>
+            <w:pPr>
+              <w:spacing w:after="0" w:line="252" w:lineRule="auto"/>
+            </w:pPr>
+            <w:r>
+              <w:t>Redis-leased dispatch of subscription expiry, OAuth refresh, and retention tasks.</w:t>
+            </w:r>
+          </w:p>
+        </w:tc>
+      </w:tr>
+      <w:tr>
+        <w:tc>
+          <w:tcPr>
+            <w:tcW w:type="dxa" w:w="2600"/>
+            <w:vAlign w:val="center"/>
+          </w:tcPr>
+          <w:p>
+            <w:pPr>
+              <w:spacing w:after="0" w:line="252" w:lineRule="auto"/>
+            </w:pPr>
+            <w:r>
               <w:t>TikTok API</w:t>
             </w:r>
           </w:p>
@@ -1818,6 +1878,8 @@
         <w:t xml:space="preserve">    API --&gt; DB["PostgreSQL"]</w:t>
         <w:br/>
         <w:t xml:space="preserve">    API --&gt; Redis["Redis"]</w:t>
+        <w:br/>
+        <w:t xml:space="preserve">    Scheduler["Scheduler"] --&gt; Redis</w:t>
         <w:br/>
         <w:t xml:space="preserve">    Redis --&gt; Worker["Worker"]</w:t>
         <w:br/>
@@ -6059,6 +6121,94 @@
               <w:spacing w:after="0" w:line="252" w:lineRule="auto"/>
             </w:pPr>
             <w:r>
+              <w:t>`refresh_blocked_at`</w:t>
+            </w:r>
+          </w:p>
+        </w:tc>
+        <w:tc>
+          <w:tcPr>
+            <w:tcW w:type="dxa" w:w="2960"/>
+            <w:vAlign w:val="center"/>
+          </w:tcPr>
+          <w:p>
+            <w:pPr>
+              <w:spacing w:after="0" w:line="252" w:lineRule="auto"/>
+            </w:pPr>
+            <w:r>
+              <w:t>TIMESTAMP WITH TIME ZONE</w:t>
+            </w:r>
+          </w:p>
+        </w:tc>
+        <w:tc>
+          <w:tcPr>
+            <w:tcW w:type="dxa" w:w="4200"/>
+            <w:vAlign w:val="center"/>
+          </w:tcPr>
+          <w:p>
+            <w:pPr>
+              <w:spacing w:after="0" w:line="252" w:lineRule="auto"/>
+            </w:pPr>
+            <w:r>
+              <w:t>Time automatic refresh was stopped after a non-retryable error</w:t>
+            </w:r>
+          </w:p>
+        </w:tc>
+      </w:tr>
+      <w:tr>
+        <w:tc>
+          <w:tcPr>
+            <w:tcW w:type="dxa" w:w="2200"/>
+            <w:vAlign w:val="center"/>
+          </w:tcPr>
+          <w:p>
+            <w:pPr>
+              <w:spacing w:after="0" w:line="252" w:lineRule="auto"/>
+            </w:pPr>
+            <w:r>
+              <w:t>`refresh_error_code`</w:t>
+            </w:r>
+          </w:p>
+        </w:tc>
+        <w:tc>
+          <w:tcPr>
+            <w:tcW w:type="dxa" w:w="2960"/>
+            <w:vAlign w:val="center"/>
+          </w:tcPr>
+          <w:p>
+            <w:pPr>
+              <w:spacing w:after="0" w:line="252" w:lineRule="auto"/>
+            </w:pPr>
+            <w:r>
+              <w:t>VARCHAR</w:t>
+            </w:r>
+          </w:p>
+        </w:tc>
+        <w:tc>
+          <w:tcPr>
+            <w:tcW w:type="dxa" w:w="4200"/>
+            <w:vAlign w:val="center"/>
+          </w:tcPr>
+          <w:p>
+            <w:pPr>
+              <w:spacing w:after="0" w:line="252" w:lineRule="auto"/>
+            </w:pPr>
+            <w:r>
+              <w:t>Sanitized non-retryable refresh error code</w:t>
+            </w:r>
+          </w:p>
+        </w:tc>
+      </w:tr>
+      <w:tr>
+        <w:tc>
+          <w:tcPr>
+            <w:tcW w:type="dxa" w:w="2200"/>
+            <w:vAlign w:val="center"/>
+          </w:tcPr>
+          <w:p>
+            <w:pPr>
+              <w:spacing w:after="0" w:line="252" w:lineRule="auto"/>
+            </w:pPr>
+            <w:r>
               <w:t>`created_at`</w:t>
             </w:r>
           </w:p>
@@ -6317,6 +6467,19 @@
       </w:pPr>
       <w:r>
         <w:t>Refresh access tokens safely through the official OAuth refresh flow.</w:t>
+      </w:r>
+    </w:p>
+    <w:p>
+      <w:pPr>
+        <w:pStyle w:val="ListBullet"/>
+      </w:pPr>
+      <w:r>
+        <w:t>Retry only network, rate-limit, and server failures. A permanent OAuth response blocks further</w:t>
+      </w:r>
+    </w:p>
+    <w:p>
+      <w:r>
+        <w:t xml:space="preserve">  scheduled refresh attempts until the user reconnects the account.</w:t>
       </w:r>
     </w:p>
     <w:p>
@@ -6829,6 +6992,50 @@
               <w:spacing w:after="0" w:line="252" w:lineRule="auto"/>
             </w:pPr>
             <w:r>
+              <w:t>`expiration_notified_at`</w:t>
+            </w:r>
+          </w:p>
+        </w:tc>
+        <w:tc>
+          <w:tcPr>
+            <w:tcW w:type="dxa" w:w="2960"/>
+            <w:vAlign w:val="center"/>
+          </w:tcPr>
+          <w:p>
+            <w:pPr>
+              <w:spacing w:after="0" w:line="252" w:lineRule="auto"/>
+            </w:pPr>
+            <w:r>
+              <w:t>TIMESTAMP WITH TIME ZONE</w:t>
+            </w:r>
+          </w:p>
+        </w:tc>
+        <w:tc>
+          <w:tcPr>
+            <w:tcW w:type="dxa" w:w="4200"/>
+            <w:vAlign w:val="center"/>
+          </w:tcPr>
+          <w:p>
+            <w:pPr>
+              <w:spacing w:after="0" w:line="252" w:lineRule="auto"/>
+            </w:pPr>
+            <w:r>
+              <w:t>Successful Telegram expiration notification time</w:t>
+            </w:r>
+          </w:p>
+        </w:tc>
+      </w:tr>
+      <w:tr>
+        <w:tc>
+          <w:tcPr>
+            <w:tcW w:type="dxa" w:w="2200"/>
+            <w:vAlign w:val="center"/>
+          </w:tcPr>
+          <w:p>
+            <w:pPr>
+              <w:spacing w:after="0" w:line="252" w:lineRule="auto"/>
+            </w:pPr>
+            <w:r>
               <w:t>`daily_limit`</w:t>
             </w:r>
           </w:p>
@@ -7169,6 +7376,27 @@
       </w:pPr>
       <w:r>
         <w:t>Subscription status changes must be transactional.</w:t>
+      </w:r>
+    </w:p>
+    <w:p>
+      <w:pPr>
+        <w:pStyle w:val="ListBullet"/>
+      </w:pPr>
+      <w:r>
+        <w:t>The scheduler locks due rows, marks paid subscriptions expired, creates FREE, and commits before</w:t>
+      </w:r>
+    </w:p>
+    <w:p>
+      <w:r>
+        <w:t xml:space="preserve">  dispatching Telegram notifications.</w:t>
+      </w:r>
+    </w:p>
+    <w:p>
+      <w:pPr>
+        <w:pStyle w:val="ListBullet"/>
+      </w:pPr>
+      <w:r>
+        <w:t>Failed notifications remain pending and are retried without creating another FREE subscription.</w:t>
       </w:r>
     </w:p>
     <w:p>
@@ -19701,6 +19929,31 @@
     </w:p>
     <w:p>
       <w:r>
+        <w:t>Scheduler: `SCHEDULER_TICK_SECONDS`, `SUBSCRIPTION_SWEEP_SECONDS`,</w:t>
+      </w:r>
+    </w:p>
+    <w:p>
+      <w:r>
+        <w:t>`TOKEN_REFRESH_SWEEP_SECONDS`, `RETENTION_SWEEP_SECONDS`,</w:t>
+      </w:r>
+    </w:p>
+    <w:p>
+      <w:r>
+        <w:t>`TOKEN_REFRESH_LEAD_SECONDS`, and `MAINTENANCE_BATCH_SIZE`.</w:t>
+      </w:r>
+    </w:p>
+    <w:p>
+      <w:r>
+        <w:t>The scheduler uses Redis leases so multiple instances do not enqueue the same periodic task in</w:t>
+      </w:r>
+    </w:p>
+    <w:p>
+      <w:r>
+        <w:t>one interval. Values must remain above the minimums validated by `Settings`.</w:t>
+      </w:r>
+    </w:p>
+    <w:p>
+      <w:r>
         <w:t>Generate Fernet key:</w:t>
       </w:r>
     </w:p>
@@ -20104,7 +20357,7 @@
         <w:br/>
         <w:t>docker compose up -d --build</w:t>
         <w:br/>
-        <w:t>docker compose logs -f api bot worker</w:t>
+        <w:t>docker compose logs -f api bot worker scheduler</w:t>
       </w:r>
     </w:p>
     <w:p>
@@ -20150,6 +20403,23 @@
         <w:t>curl https://your-domain.example/ready</w:t>
         <w:br/>
         <w:t>curl https://your-domain.example/metrics</w:t>
+        <w:br/>
+        <w:t>docker compose ps scheduler</w:t>
+      </w:r>
+    </w:p>
+    <w:p>
+      <w:r>
+        <w:t>The API image contains `alembic.ini` and the complete `alembic/` migration tree. The scheduler</w:t>
+      </w:r>
+    </w:p>
+    <w:p>
+      <w:r>
+        <w:t>healthcheck reads its Redis heartbeat; an unhealthy scheduler means subscription expiry, token</w:t>
+      </w:r>
+    </w:p>
+    <w:p>
+      <w:r>
+        <w:t>refresh, and retention cleanup are not being dispatched.</w:t>
       </w:r>
     </w:p>
     <w:p>
@@ -20350,6 +20620,14 @@
       </w:pPr>
       <w:r>
         <w:t>`worker`: Dramatiq background workers.</w:t>
+      </w:r>
+    </w:p>
+    <w:p>
+      <w:pPr>
+        <w:pStyle w:val="ListBullet"/>
+      </w:pPr>
+      <w:r>
+        <w:t>`scheduler`: recurring task dispatch with Redis leases and heartbeat.</w:t>
       </w:r>
     </w:p>
     <w:p>
@@ -20495,6 +20773,14 @@
       </w:pPr>
       <w:r>
         <w:t>Nginx via `/health` proxy.</w:t>
+      </w:r>
+    </w:p>
+    <w:p>
+      <w:pPr>
+        <w:pStyle w:val="ListBullet"/>
+      </w:pPr>
+      <w:r>
+        <w:t>Scheduler via its Redis heartbeat.</w:t>
       </w:r>
     </w:p>
     <w:p>
@@ -21013,7 +21299,15 @@
         <w:pStyle w:val="ListBullet"/>
       </w:pPr>
       <w:r>
-        <w:t>Review critical JSON logs for `api`, `bot`, `worker`, `postgres`, `redis`, and `nginx`.</w:t>
+        <w:t>Review critical JSON logs for `api`, `bot`, `worker`, `scheduler`, `postgres`, `redis`, and `nginx`.</w:t>
+      </w:r>
+    </w:p>
+    <w:p>
+      <w:pPr>
+        <w:pStyle w:val="ListBullet"/>
+      </w:pPr>
+      <w:r>
+        <w:t>Confirm the `scheduler` container is healthy and its subscription sweep is running.</w:t>
       </w:r>
     </w:p>
     <w:p>
@@ -25411,7 +25705,74 @@
         <w:pStyle w:val="Heading2"/>
       </w:pPr>
       <w:r>
-        <w:t>47.3. Retryable Errors</w:t>
+        <w:t>47.3. Periodic Maintenance</w:t>
+      </w:r>
+    </w:p>
+    <w:p>
+      <w:r>
+        <w:t>The dedicated `scheduler` service dispatches maintenance actors through Dramatiq. A Redis lease</w:t>
+      </w:r>
+    </w:p>
+    <w:p>
+      <w:r>
+        <w:t>is acquired for each periodic task before dispatch, which allows multiple scheduler instances to</w:t>
+      </w:r>
+    </w:p>
+    <w:p>
+      <w:r>
+        <w:t>run without intentionally enqueueing the same interval twice. If broker dispatch fails, the lease</w:t>
+      </w:r>
+    </w:p>
+    <w:p>
+      <w:r>
+        <w:t>is released so the next scheduler tick can retry.</w:t>
+      </w:r>
+    </w:p>
+    <w:p>
+      <w:r>
+        <w:t>The current periodic tasks are:</w:t>
+      </w:r>
+    </w:p>
+    <w:p>
+      <w:pPr>
+        <w:pStyle w:val="ListBullet"/>
+      </w:pPr>
+      <w:r>
+        <w:t>Expire due PRO and BUSINESS subscriptions and create the replacement FREE subscription.</w:t>
+      </w:r>
+    </w:p>
+    <w:p>
+      <w:pPr>
+        <w:pStyle w:val="ListBullet"/>
+      </w:pPr>
+      <w:r>
+        <w:t>Refresh TikTok access tokens before their expiry.</w:t>
+      </w:r>
+    </w:p>
+    <w:p>
+      <w:pPr>
+        <w:pStyle w:val="ListBullet"/>
+      </w:pPr>
+      <w:r>
+        <w:t>Remove temporary files and expired operational records according to the retention policy.</w:t>
+      </w:r>
+    </w:p>
+    <w:p>
+      <w:r>
+        <w:t>Subscription selection uses PostgreSQL `FOR UPDATE SKIP LOCKED`. Expiration notifications use a</w:t>
+      </w:r>
+    </w:p>
+    <w:p>
+      <w:r>
+        <w:t>per-subscription Redis lock and a durable `expiration_notified_at` marker.</w:t>
+      </w:r>
+    </w:p>
+    <w:p>
+      <w:pPr>
+        <w:pStyle w:val="Heading2"/>
+      </w:pPr>
+      <w:r>
+        <w:t>47.4. Retryable Errors</w:t>
       </w:r>
     </w:p>
     <w:p>
@@ -25452,6 +25813,14 @@
       </w:r>
     </w:p>
     <w:p>
+      <w:pPr>
+        <w:pStyle w:val="ListBullet"/>
+      </w:pPr>
+      <w:r>
+        <w:t>TikTok token refresh requests that fail because of network errors, HTTP 429, or HTTP 5xx.</w:t>
+      </w:r>
+    </w:p>
+    <w:p>
       <w:r>
         <w:t>The complete publication actor is not automatically replayed after an ambiguous failure because</w:t>
       </w:r>
@@ -25476,7 +25845,7 @@
         <w:pStyle w:val="Heading2"/>
       </w:pPr>
       <w:r>
-        <w:t>47.4. Non-Retryable Errors</w:t>
+        <w:t>47.5. Non-Retryable Errors</w:t>
       </w:r>
     </w:p>
     <w:p>
@@ -25542,10 +25911,23 @@
     </w:p>
     <w:p>
       <w:pPr>
+        <w:pStyle w:val="ListBullet"/>
+      </w:pPr>
+      <w:r>
+        <w:t>TikTok refresh-token rejection or another permanent OAuth error. The account is marked as</w:t>
+      </w:r>
+    </w:p>
+    <w:p>
+      <w:r>
+        <w:t xml:space="preserve">  refresh-blocked until the user reconnects it through the official OAuth flow.</w:t>
+      </w:r>
+    </w:p>
+    <w:p>
+      <w:pPr>
         <w:pStyle w:val="Heading2"/>
       </w:pPr>
       <w:r>
-        <w:t>47.5. Status Updates</w:t>
+        <w:t>47.6. Status Updates</w:t>
       </w:r>
     </w:p>
     <w:p>
@@ -25624,7 +26006,7 @@
         <w:pStyle w:val="Heading2"/>
       </w:pPr>
       <w:r>
-        <w:t>47.6. Duplicate Prevention</w:t>
+        <w:t>47.7. Duplicate Prevention</w:t>
       </w:r>
     </w:p>
     <w:p>
@@ -25685,7 +26067,7 @@
         <w:pStyle w:val="Heading2"/>
       </w:pPr>
       <w:r>
-        <w:t>47.7. Administrative Control</w:t>
+        <w:t>47.8. Administrative Control</w:t>
       </w:r>
     </w:p>
     <w:p>
@@ -25767,7 +26149,7 @@
         <w:pStyle w:val="Heading2"/>
       </w:pPr>
       <w:r>
-        <w:t>47.8. Operational Goal</w:t>
+        <w:t>47.9. Operational Goal</w:t>
       </w:r>
     </w:p>
     <w:p>
@@ -33440,6 +33822,14 @@
         <w:pStyle w:val="ListBullet"/>
       </w:pPr>
       <w:r>
+        <w:t>Expired paid subscriptions return to FREE and produce one pending user notification.</w:t>
+      </w:r>
+    </w:p>
+    <w:p>
+      <w:pPr>
+        <w:pStyle w:val="ListBullet"/>
+      </w:pPr>
+      <w:r>
         <w:t>User can disconnect TikTok.</w:t>
       </w:r>
     </w:p>
@@ -33472,7 +33862,7 @@
         <w:pStyle w:val="ListBullet"/>
       </w:pPr>
       <w:r>
-        <w:t>API, PostgreSQL, Redis, and Nginx healthchecks pass.</w:t>
+        <w:t>API, PostgreSQL, Redis, scheduler, and Nginx healthchecks pass.</w:t>
       </w:r>
     </w:p>
     <w:p>

</xml_diff>

<commit_message>
feat: automate deployment pipeline
</commit_message>
<xml_diff>
--- a/docs/final/Tik_Tok_Loader_Unified_Specification.docx
+++ b/docs/final/Tik_Tok_Loader_Unified_Specification.docx
@@ -39,7 +39,7 @@
         <w:jc w:val="center"/>
       </w:pPr>
       <w:r>
-        <w:t>Версия: 0.4.0</w:t>
+        <w:t>Версия: 0.5.0</w:t>
         <w:br/>
         <w:t>Репозиторий: kredavto/Tik-Tok-bot-Rus-2</w:t>
         <w:br/>
@@ -21910,6 +21910,34 @@
       </w:r>
     </w:p>
     <w:p>
+      <w:r>
+        <w:t>Run the target-specific gate before staging or production deployment:</w:t>
+      </w:r>
+    </w:p>
+    <w:p>
+      <w:pPr>
+        <w:spacing w:after="160"/>
+        <w:ind w:left="216"/>
+      </w:pPr>
+      <w:r>
+        <w:rPr>
+          <w:rFonts w:ascii="Courier New" w:hAnsi="Courier New"/>
+          <w:sz w:val="17"/>
+        </w:rPr>
+        <w:t>python3 tools/validate_deploy_env.py --env-file .env --environment production</w:t>
+      </w:r>
+    </w:p>
+    <w:p>
+      <w:r>
+        <w:t>The validator reports variable names and validation rules only; it never prints configured secret</w:t>
+      </w:r>
+    </w:p>
+    <w:p>
+      <w:r>
+        <w:t>values.</w:t>
+      </w:r>
+    </w:p>
+    <w:p>
       <w:pPr>
         <w:pStyle w:val="Heading2"/>
       </w:pPr>
@@ -22465,6 +22493,41 @@
     </w:p>
     <w:p>
       <w:r>
+        <w:t>For staging and production, use the checked automation instead of running these commands</w:t>
+      </w:r>
+    </w:p>
+    <w:p>
+      <w:r>
+        <w:t>individually:</w:t>
+      </w:r>
+    </w:p>
+    <w:p>
+      <w:pPr>
+        <w:spacing w:after="160"/>
+        <w:ind w:left="216"/>
+      </w:pPr>
+      <w:r>
+        <w:rPr>
+          <w:rFonts w:ascii="Courier New" w:hAnsi="Courier New"/>
+          <w:sz w:val="17"/>
+        </w:rPr>
+        <w:t>python3 tools/validate_deploy_env.py --env-file .env --environment production</w:t>
+        <w:br/>
+        <w:t>ENV_FILE=.env bash deploy/deploy.sh production vX.Y.Z</w:t>
+      </w:r>
+    </w:p>
+    <w:p>
+      <w:r>
+        <w:t>The complete certificate bootstrap, deployment, backup, restore, rollback, and CI procedure is in</w:t>
+      </w:r>
+    </w:p>
+    <w:p>
+      <w:r>
+        <w:t>CI/CD and Deployment Automation.</w:t>
+      </w:r>
+    </w:p>
+    <w:p>
+      <w:r>
         <w:t>Run migrations explicitly before first start or during deploy:</w:t>
       </w:r>
     </w:p>
@@ -22704,6 +22767,16 @@
       </w:r>
     </w:p>
     <w:p>
+      <w:r>
+        <w:t>Staging and production use `NGINX_TEMPLATE=https.conf.template`, set `DOMAIN` to the</w:t>
+      </w:r>
+    </w:p>
+    <w:p>
+      <w:r>
+        <w:t>`PUBLIC_BASE_URL` host, and provide `fullchain.pem` and `privkey.pem` under `TLS_CERT_DIR`.</w:t>
+      </w:r>
+    </w:p>
+    <w:p>
       <w:pPr>
         <w:sectPr>
           <w:pgSz w:w="12240" w:h="15840"/>
@@ -22718,7 +22791,7 @@
         <w:pStyle w:val="Heading1"/>
       </w:pPr>
       <w:r>
-        <w:t>36. Containerization</w:t>
+        <w:t>36. CI/CD and Deployment Automation</w:t>
       </w:r>
     </w:p>
     <w:p>
@@ -22727,11 +22800,537 @@
       </w:r>
     </w:p>
     <w:p>
+      <w:r>
+        <w:t>This document defines the automated quality gates and the supported staging and production</w:t>
+      </w:r>
+    </w:p>
+    <w:p>
+      <w:r>
+        <w:t>deployment procedure for Tik_Tok_Loader.</w:t>
+      </w:r>
+    </w:p>
+    <w:p>
       <w:pPr>
         <w:pStyle w:val="Heading2"/>
       </w:pPr>
       <w:r>
-        <w:t>36.1. Services</w:t>
+        <w:t>36.1. CI Pipeline</w:t>
+      </w:r>
+    </w:p>
+    <w:p>
+      <w:r>
+        <w:t>GitHub Actions runs three jobs:</w:t>
+      </w:r>
+    </w:p>
+    <w:p>
+      <w:pPr>
+        <w:pStyle w:val="ListBullet"/>
+      </w:pPr>
+      <w:r>
+        <w:t>`Quality and security`: Ruff formatting and linting, MyPy, Bash syntax, ShellCheck, and secret</w:t>
+      </w:r>
+    </w:p>
+    <w:p>
+      <w:r>
+        <w:t xml:space="preserve">   scanning.</w:t>
+      </w:r>
+    </w:p>
+    <w:p>
+      <w:pPr>
+        <w:pStyle w:val="ListBullet"/>
+      </w:pPr>
+      <w:r>
+        <w:t>`Migrations and tests`: PostgreSQL 16 and Redis integration services, Alembic upgrade/check,</w:t>
+      </w:r>
+    </w:p>
+    <w:p>
+      <w:r>
+        <w:t xml:space="preserve">   downgrade-to-base/upgrade verification on a disposable database, and the full test suite.</w:t>
+      </w:r>
+    </w:p>
+    <w:p>
+      <w:pPr>
+        <w:pStyle w:val="ListBullet"/>
+      </w:pPr>
+      <w:r>
+        <w:t>`Container build`: Docker Compose model validation, application image build, and verification</w:t>
+      </w:r>
+    </w:p>
+    <w:p>
+      <w:r>
+        <w:t xml:space="preserve">   that the runtime image uses the unprivileged `appuser` account.</w:t>
+      </w:r>
+    </w:p>
+    <w:p>
+      <w:r>
+        <w:t>The container job starts only after the quality and integration jobs pass. The workflow has</w:t>
+      </w:r>
+    </w:p>
+    <w:p>
+      <w:r>
+        <w:t>read-only repository permissions and cancels superseded runs for the same branch or pull request.</w:t>
+      </w:r>
+    </w:p>
+    <w:p>
+      <w:pPr>
+        <w:pStyle w:val="Heading2"/>
+      </w:pPr>
+      <w:r>
+        <w:t>36.2. Secret Gate</w:t>
+      </w:r>
+    </w:p>
+    <w:p>
+      <w:r>
+        <w:t>`python tools/check_secrets.py` compares the current scan with `.secrets.baseline`. New findings</w:t>
+      </w:r>
+    </w:p>
+    <w:p>
+      <w:r>
+        <w:t>fail CI and report only the file, line, and detector type. A second non-baselined check always</w:t>
+      </w:r>
+    </w:p>
+    <w:p>
+      <w:r>
+        <w:t>rejects Telegram bot token patterns and private-key blocks.</w:t>
+      </w:r>
+    </w:p>
+    <w:p>
+      <w:r>
+        <w:t>Baseline changes require code review. A finding must never be added to the baseline to conceal a</w:t>
+      </w:r>
+    </w:p>
+    <w:p>
+      <w:r>
+        <w:t>real credential. Rotate any credential that has appeared in chat, source, a pull request, logs, or</w:t>
+      </w:r>
+    </w:p>
+    <w:p>
+      <w:r>
+        <w:t>CI output before using the project in staging or production.</w:t>
+      </w:r>
+    </w:p>
+    <w:p>
+      <w:pPr>
+        <w:pStyle w:val="Heading2"/>
+      </w:pPr>
+      <w:r>
+        <w:t>36.3. Server Prerequisites</w:t>
+      </w:r>
+    </w:p>
+    <w:p>
+      <w:pPr>
+        <w:pStyle w:val="ListBullet"/>
+      </w:pPr>
+      <w:r>
+        <w:t>Ubuntu 24.04 LTS.</w:t>
+      </w:r>
+    </w:p>
+    <w:p>
+      <w:pPr>
+        <w:pStyle w:val="ListBullet"/>
+      </w:pPr>
+      <w:r>
+        <w:t>Docker Engine with the Compose plugin.</w:t>
+      </w:r>
+    </w:p>
+    <w:p>
+      <w:pPr>
+        <w:pStyle w:val="ListBullet"/>
+      </w:pPr>
+      <w:r>
+        <w:t>Git, Python 3, curl, and SSH key access.</w:t>
+      </w:r>
+    </w:p>
+    <w:p>
+      <w:pPr>
+        <w:pStyle w:val="ListBullet"/>
+      </w:pPr>
+      <w:r>
+        <w:t>A domain pointing to the server.</w:t>
+      </w:r>
+    </w:p>
+    <w:p>
+      <w:pPr>
+        <w:pStyle w:val="ListBullet"/>
+      </w:pPr>
+      <w:r>
+        <w:t>A real environment file at `.env`, readable only by the deployment operator.</w:t>
+      </w:r>
+    </w:p>
+    <w:p>
+      <w:pPr>
+        <w:pStyle w:val="ListBullet"/>
+      </w:pPr>
+      <w:r>
+        <w:t>TLS files at `${TLS_CERT_DIR}/fullchain.pem` and `${TLS_CERT_DIR}/privkey.pem`.</w:t>
+      </w:r>
+    </w:p>
+    <w:p>
+      <w:r>
+        <w:t>Run the configuration gate before a release:</w:t>
+      </w:r>
+    </w:p>
+    <w:p>
+      <w:pPr>
+        <w:spacing w:after="160"/>
+        <w:ind w:left="216"/>
+      </w:pPr>
+      <w:r>
+        <w:rPr>
+          <w:rFonts w:ascii="Courier New" w:hAnsi="Courier New"/>
+          <w:sz w:val="17"/>
+        </w:rPr>
+        <w:t>python3 tools/validate_deploy_env.py --env-file .env --environment staging</w:t>
+        <w:br/>
+        <w:t>python3 tools/validate_deploy_env.py --env-file .env --environment production</w:t>
+      </w:r>
+    </w:p>
+    <w:p>
+      <w:r>
+        <w:t>The gate validates environment identity, HTTPS callbacks, domain consistency, webhook mode,</w:t>
+      </w:r>
+    </w:p>
+    <w:p>
+      <w:r>
+        <w:t>secret length and uniqueness, Fernet key format, Robokassa mode, and required TikTok credentials</w:t>
+      </w:r>
+    </w:p>
+    <w:p>
+      <w:r>
+        <w:t>when publication is enabled. It never prints secret values.</w:t>
+      </w:r>
+    </w:p>
+    <w:p>
+      <w:pPr>
+        <w:pStyle w:val="Heading2"/>
+      </w:pPr>
+      <w:r>
+        <w:t>36.4. TLS Bootstrap</w:t>
+      </w:r>
+    </w:p>
+    <w:p>
+      <w:r>
+        <w:t>For the first certificate, temporarily start the HTTP Nginx template and use Certbot webroot:</w:t>
+      </w:r>
+    </w:p>
+    <w:p>
+      <w:pPr>
+        <w:spacing w:after="160"/>
+        <w:ind w:left="216"/>
+      </w:pPr>
+      <w:r>
+        <w:rPr>
+          <w:rFonts w:ascii="Courier New" w:hAnsi="Courier New"/>
+          <w:sz w:val="17"/>
+        </w:rPr>
+        <w:t>NGINX_TEMPLATE=http.conf.template docker compose up -d api nginx</w:t>
+        <w:br/>
+        <w:t>sudo certbot certonly --webroot \</w:t>
+        <w:br/>
+        <w:t xml:space="preserve">  --webroot-path "$(pwd)/deploy/nginx/acme" \</w:t>
+        <w:br/>
+        <w:t xml:space="preserve">  --domain loader.example.net</w:t>
+        <w:br/>
+        <w:t>sudo install -m 0644 /etc/letsencrypt/live/loader.example.net/fullchain.pem \</w:t>
+        <w:br/>
+        <w:t xml:space="preserve">  deploy/nginx/certs/fullchain.pem</w:t>
+        <w:br/>
+        <w:t>sudo install -m 0600 /etc/letsencrypt/live/loader.example.net/privkey.pem \</w:t>
+        <w:br/>
+        <w:t xml:space="preserve">  deploy/nginx/certs/privkey.pem</w:t>
+        <w:br/>
+        <w:t>docker compose restart nginx</w:t>
+      </w:r>
+    </w:p>
+    <w:p>
+      <w:r>
+        <w:t>Replace the example domain. Keep `NGINX_TEMPLATE=https.conf.template` in staging and production.</w:t>
+      </w:r>
+    </w:p>
+    <w:p>
+      <w:r>
+        <w:t>Automate certificate renewal with a root-owned Certbot deploy hook that refreshes the two copied</w:t>
+      </w:r>
+    </w:p>
+    <w:p>
+      <w:r>
+        <w:t>files and runs `docker compose exec -T nginx nginx -s reload`.</w:t>
+      </w:r>
+    </w:p>
+    <w:p>
+      <w:pPr>
+        <w:pStyle w:val="Heading2"/>
+      </w:pPr>
+      <w:r>
+        <w:t>36.5. Automated Deployment</w:t>
+      </w:r>
+    </w:p>
+    <w:p>
+      <w:r>
+        <w:t>Deploy an immutable tag or reviewed commit:</w:t>
+      </w:r>
+    </w:p>
+    <w:p>
+      <w:pPr>
+        <w:spacing w:after="160"/>
+        <w:ind w:left="216"/>
+      </w:pPr>
+      <w:r>
+        <w:rPr>
+          <w:rFonts w:ascii="Courier New" w:hAnsi="Courier New"/>
+          <w:sz w:val="17"/>
+        </w:rPr>
+        <w:t>ENV_FILE=.env bash deploy/deploy.sh staging v0.2.0</w:t>
+        <w:br/>
+        <w:t>ENV_FILE=.env bash deploy/deploy.sh production v0.2.0</w:t>
+      </w:r>
+    </w:p>
+    <w:p>
+      <w:r>
+        <w:t>The script:</w:t>
+      </w:r>
+    </w:p>
+    <w:p>
+      <w:pPr>
+        <w:pStyle w:val="ListBullet"/>
+      </w:pPr>
+      <w:r>
+        <w:t>validates `.env` and TLS files;</w:t>
+      </w:r>
+    </w:p>
+    <w:p>
+      <w:pPr>
+        <w:pStyle w:val="ListBullet"/>
+      </w:pPr>
+      <w:r>
+        <w:t>rejects tracked local changes;</w:t>
+      </w:r>
+    </w:p>
+    <w:p>
+      <w:pPr>
+        <w:pStyle w:val="ListBullet"/>
+      </w:pPr>
+      <w:r>
+        <w:t>creates and verifies a PostgreSQL backup;</w:t>
+      </w:r>
+    </w:p>
+    <w:p>
+      <w:pPr>
+        <w:pStyle w:val="ListBullet"/>
+      </w:pPr>
+      <w:r>
+        <w:t>records the previous Git revision under ignored `.deploy/`;</w:t>
+      </w:r>
+    </w:p>
+    <w:p>
+      <w:pPr>
+        <w:pStyle w:val="ListBullet"/>
+      </w:pPr>
+      <w:r>
+        <w:t>fetches and checks out the requested commit in detached mode;</w:t>
+      </w:r>
+    </w:p>
+    <w:p>
+      <w:pPr>
+        <w:pStyle w:val="ListBullet"/>
+      </w:pPr>
+      <w:r>
+        <w:t>builds images with refreshed base layers;</w:t>
+      </w:r>
+    </w:p>
+    <w:p>
+      <w:pPr>
+        <w:pStyle w:val="ListBullet"/>
+      </w:pPr>
+      <w:r>
+        <w:t>applies Alembic migrations;</w:t>
+      </w:r>
+    </w:p>
+    <w:p>
+      <w:pPr>
+        <w:pStyle w:val="ListBullet"/>
+      </w:pPr>
+      <w:r>
+        <w:t>requires the one-shot `migrate` service to complete before application services start;</w:t>
+      </w:r>
+    </w:p>
+    <w:p>
+      <w:pPr>
+        <w:pStyle w:val="ListBullet"/>
+      </w:pPr>
+      <w:r>
+        <w:t>starts Compose services; and</w:t>
+      </w:r>
+    </w:p>
+    <w:p>
+      <w:pPr>
+        <w:pStyle w:val="ListBullet"/>
+      </w:pPr>
+      <w:r>
+        <w:t>checks `/health`, `/ready`, and `/metrics` through the public URL.</w:t>
+      </w:r>
+    </w:p>
+    <w:p>
+      <w:r>
+        <w:t>The deployment operator must still configure Telegram, TikTok, and Robokassa dashboards and run</w:t>
+      </w:r>
+    </w:p>
+    <w:p>
+      <w:r>
+        <w:t>the acceptance scenarios. Termius is an SSH client for these server-side commands; it does not</w:t>
+      </w:r>
+    </w:p>
+    <w:p>
+      <w:r>
+        <w:t>change the deployment procedure.</w:t>
+      </w:r>
+    </w:p>
+    <w:p>
+      <w:pPr>
+        <w:pStyle w:val="Heading2"/>
+      </w:pPr>
+      <w:r>
+        <w:t>36.6. Backup and Restore</w:t>
+      </w:r>
+    </w:p>
+    <w:p>
+      <w:r>
+        <w:t>Create a verified custom-format PostgreSQL archive:</w:t>
+      </w:r>
+    </w:p>
+    <w:p>
+      <w:pPr>
+        <w:spacing w:after="160"/>
+        <w:ind w:left="216"/>
+      </w:pPr>
+      <w:r>
+        <w:rPr>
+          <w:rFonts w:ascii="Courier New" w:hAnsi="Courier New"/>
+          <w:sz w:val="17"/>
+        </w:rPr>
+        <w:t>ENV_FILE=.env bash deploy/backup_postgres.sh</w:t>
+      </w:r>
+    </w:p>
+    <w:p>
+      <w:r>
+        <w:t>The command uses the database container's configured user and database, verifies the archive with</w:t>
+      </w:r>
+    </w:p>
+    <w:p>
+      <w:r>
+        <w:t>`pg_restore --list`, writes a SHA-256 sidecar and metadata, applies mode `0600`, and removes files</w:t>
+      </w:r>
+    </w:p>
+    <w:p>
+      <w:r>
+        <w:t>older than `BACKUP_RETENTION_DAYS`.</w:t>
+      </w:r>
+    </w:p>
+    <w:p>
+      <w:r>
+        <w:t>Restore is destructive and requires explicit confirmation:</w:t>
+      </w:r>
+    </w:p>
+    <w:p>
+      <w:pPr>
+        <w:spacing w:after="160"/>
+        <w:ind w:left="216"/>
+      </w:pPr>
+      <w:r>
+        <w:rPr>
+          <w:rFonts w:ascii="Courier New" w:hAnsi="Courier New"/>
+          <w:sz w:val="17"/>
+        </w:rPr>
+        <w:t>ENV_FILE=.env bash deploy/restore_postgres.sh \</w:t>
+        <w:br/>
+        <w:t xml:space="preserve">  backups/tiktok_loader_YYYYMMDDTHHMMSSZ.dump --confirm</w:t>
+      </w:r>
+    </w:p>
+    <w:p>
+      <w:r>
+        <w:t>The restore verifies the checksum and archive, creates a pre-restore safety backup, stops public</w:t>
+      </w:r>
+    </w:p>
+    <w:p>
+      <w:r>
+        <w:t>and background application services, recreates the database, restores data, applies migrations,</w:t>
+      </w:r>
+    </w:p>
+    <w:p>
+      <w:r>
+        <w:t>starts services, and runs smoke tests. On failure, application services remain stopped for</w:t>
+      </w:r>
+    </w:p>
+    <w:p>
+      <w:r>
+        <w:t>investigation. Use `--skip-pre-backup` only in a documented disaster-recovery case.</w:t>
+      </w:r>
+    </w:p>
+    <w:p>
+      <w:pPr>
+        <w:pStyle w:val="Heading2"/>
+      </w:pPr>
+      <w:r>
+        <w:t>36.7. Application Rollback</w:t>
+      </w:r>
+    </w:p>
+    <w:p>
+      <w:pPr>
+        <w:spacing w:after="160"/>
+        <w:ind w:left="216"/>
+      </w:pPr>
+      <w:r>
+        <w:rPr>
+          <w:rFonts w:ascii="Courier New" w:hAnsi="Courier New"/>
+          <w:sz w:val="17"/>
+        </w:rPr>
+        <w:t>ENV_FILE=.env bash deploy/rollback.sh production &lt;previous-tag-or-commit&gt; --confirm</w:t>
+      </w:r>
+    </w:p>
+    <w:p>
+      <w:r>
+        <w:t>Rollback creates a fresh backup and changes application code only. It never runs `alembic</w:t>
+      </w:r>
+    </w:p>
+    <w:p>
+      <w:r>
+        <w:t>downgrade`. The target application must be schema-compatible. Restore an older database backup</w:t>
+      </w:r>
+    </w:p>
+    <w:p>
+      <w:r>
+        <w:t>only after impact review and according to the recovery plan.</w:t>
+      </w:r>
+    </w:p>
+    <w:p>
+      <w:pPr>
+        <w:sectPr>
+          <w:pgSz w:w="12240" w:h="15840"/>
+          <w:pgMar w:top="1440" w:right="1440" w:bottom="1440" w:left="1440" w:header="708" w:footer="708" w:gutter="0"/>
+          <w:cols w:space="720"/>
+          <w:docGrid w:linePitch="360"/>
+        </w:sectPr>
+      </w:pPr>
+    </w:p>
+    <w:p>
+      <w:pPr>
+        <w:pStyle w:val="Heading1"/>
+      </w:pPr>
+      <w:r>
+        <w:t>37. Containerization</w:t>
+      </w:r>
+    </w:p>
+    <w:p>
+      <w:r>
+        <w:t>Группа спецификации: Эксплуатация</w:t>
+      </w:r>
+    </w:p>
+    <w:p>
+      <w:pPr>
+        <w:pStyle w:val="Heading2"/>
+      </w:pPr>
+      <w:r>
+        <w:t>37.1. Services</w:t>
       </w:r>
     </w:p>
     <w:p>
@@ -22771,6 +23370,14 @@
         <w:pStyle w:val="ListBullet"/>
       </w:pPr>
       <w:r>
+        <w:t>`migrate`: one-shot Alembic migration gate that must complete before application services start.</w:t>
+      </w:r>
+    </w:p>
+    <w:p>
+      <w:pPr>
+        <w:pStyle w:val="ListBullet"/>
+      </w:pPr>
+      <w:r>
         <w:t>`postgres`: PostgreSQL 16.</w:t>
       </w:r>
     </w:p>
@@ -22795,7 +23402,7 @@
         <w:pStyle w:val="Heading2"/>
       </w:pPr>
       <w:r>
-        <w:t>36.2. Startup</w:t>
+        <w:t>37.2. Startup</w:t>
       </w:r>
     </w:p>
     <w:p>
@@ -22818,7 +23425,7 @@
         <w:pStyle w:val="Heading2"/>
       </w:pPr>
       <w:r>
-        <w:t>36.3. Networking</w:t>
+        <w:t>37.3. Networking</w:t>
       </w:r>
     </w:p>
     <w:p>
@@ -22831,7 +23438,7 @@
         <w:pStyle w:val="Heading2"/>
       </w:pPr>
       <w:r>
-        <w:t>36.4. Volumes</w:t>
+        <w:t>37.4. Volumes</w:t>
       </w:r>
     </w:p>
     <w:p>
@@ -22871,7 +23478,7 @@
         <w:pStyle w:val="Heading2"/>
       </w:pPr>
       <w:r>
-        <w:t>36.5. Healthchecks</w:t>
+        <w:t>37.5. Healthchecks</w:t>
       </w:r>
     </w:p>
     <w:p>
@@ -22921,6 +23528,16 @@
     </w:p>
     <w:p>
       <w:r>
+        <w:t>API, bot, worker, and scheduler wait for the one-shot `migrate` service. This prevents concurrent</w:t>
+      </w:r>
+    </w:p>
+    <w:p>
+      <w:r>
+        <w:t>schema upgrades when API or worker processes are scaled horizontally.</w:t>
+      </w:r>
+    </w:p>
+    <w:p>
+      <w:r>
         <w:t>Service continuity requirements are documented in Service Continuity Plan.</w:t>
       </w:r>
     </w:p>
@@ -22929,7 +23546,7 @@
         <w:pStyle w:val="Heading2"/>
       </w:pPr>
       <w:r>
-        <w:t>36.6. Production Notes</w:t>
+        <w:t>37.6. Production Notes</w:t>
       </w:r>
     </w:p>
     <w:p>
@@ -22953,7 +23570,25 @@
         <w:pStyle w:val="ListBullet"/>
       </w:pPr>
       <w:r>
-        <w:t>Put TLS certificates under `deploy/nginx/certs` or terminate HTTPS at a managed load balancer.</w:t>
+        <w:t>Use `NGINX_TEMPLATE=https.conf.template` and put copied TLS certificate/key files under</w:t>
+      </w:r>
+    </w:p>
+    <w:p>
+      <w:r>
+        <w:t xml:space="preserve">  `TLS_CERT_DIR`, or terminate HTTPS at a managed load balancer with an approved Compose override.</w:t>
+      </w:r>
+    </w:p>
+    <w:p>
+      <w:pPr>
+        <w:pStyle w:val="ListBullet"/>
+      </w:pPr>
+      <w:r>
+        <w:t>Application containers run as `appuser`, drop Linux capabilities, enable `no-new-privileges`,</w:t>
+      </w:r>
+    </w:p>
+    <w:p>
+      <w:r>
+        <w:t xml:space="preserve">  and use an isolated temporary filesystem.</w:t>
       </w:r>
     </w:p>
     <w:p>
@@ -22979,7 +23614,7 @@
         <w:pStyle w:val="Heading1"/>
       </w:pPr>
       <w:r>
-        <w:t>37. Production Launch Plan</w:t>
+        <w:t>38. Production Launch Plan</w:t>
       </w:r>
     </w:p>
     <w:p>
@@ -22997,7 +23632,7 @@
         <w:pStyle w:val="Heading2"/>
       </w:pPr>
       <w:r>
-        <w:t>37.1. Preparation</w:t>
+        <w:t>38.1. Preparation</w:t>
       </w:r>
     </w:p>
     <w:p>
@@ -23098,7 +23733,7 @@
         <w:pStyle w:val="Heading2"/>
       </w:pPr>
       <w:r>
-        <w:t>37.2. First Startup</w:t>
+        <w:t>38.2. First Startup</w:t>
       </w:r>
     </w:p>
     <w:p>
@@ -23111,15 +23746,21 @@
           <w:rFonts w:ascii="Courier New" w:hAnsi="Courier New"/>
           <w:sz w:val="17"/>
         </w:rPr>
-        <w:t>docker compose up -d</w:t>
+        <w:t>python3 tools/validate_deploy_env.py --env-file .env --environment production</w:t>
+        <w:br/>
+        <w:t>ENV_FILE=.env bash deploy/deploy.sh production vX.Y.Z</w:t>
         <w:br/>
         <w:t>docker compose ps</w:t>
-        <w:br/>
-        <w:t>curl https://your-domain.example/health</w:t>
-        <w:br/>
-        <w:t>curl https://your-domain.example/ready</w:t>
-        <w:br/>
-        <w:t>curl https://your-domain.example/metrics</w:t>
+      </w:r>
+    </w:p>
+    <w:p>
+      <w:r>
+        <w:t>Follow CI/CD and Deployment Automation for first-certificate bootstrap,</w:t>
+      </w:r>
+    </w:p>
+    <w:p>
+      <w:r>
+        <w:t>verified backup creation, and deployment behavior.</w:t>
       </w:r>
     </w:p>
     <w:p>
@@ -23127,7 +23768,7 @@
         <w:pStyle w:val="Heading2"/>
       </w:pPr>
       <w:r>
-        <w:t>37.3. Smoke Test</w:t>
+        <w:t>38.3. Smoke Test</w:t>
       </w:r>
     </w:p>
     <w:p>
@@ -23223,7 +23864,7 @@
         <w:pStyle w:val="Heading2"/>
       </w:pPr>
       <w:r>
-        <w:t>37.4. Success Criteria</w:t>
+        <w:t>38.4. Success Criteria</w:t>
       </w:r>
     </w:p>
     <w:p>
@@ -23287,7 +23928,7 @@
         <w:pStyle w:val="Heading2"/>
       </w:pPr>
       <w:r>
-        <w:t>37.5. Handover</w:t>
+        <w:t>38.5. Handover</w:t>
       </w:r>
     </w:p>
     <w:p>
@@ -23374,7 +24015,7 @@
         <w:pStyle w:val="Heading1"/>
       </w:pPr>
       <w:r>
-        <w:t>38. Operations Runbook</w:t>
+        <w:t>39. Operations Runbook</w:t>
       </w:r>
     </w:p>
     <w:p>
@@ -23387,7 +24028,7 @@
         <w:pStyle w:val="Heading2"/>
       </w:pPr>
       <w:r>
-        <w:t>38.1. Daily Operations</w:t>
+        <w:t>39.1. Daily Operations</w:t>
       </w:r>
     </w:p>
     <w:p>
@@ -23467,7 +24108,7 @@
         <w:pStyle w:val="Heading2"/>
       </w:pPr>
       <w:r>
-        <w:t>38.2. Weekly Operations</w:t>
+        <w:t>39.2. Weekly Operations</w:t>
       </w:r>
     </w:p>
     <w:p>
@@ -23539,7 +24180,7 @@
         <w:pStyle w:val="Heading2"/>
       </w:pPr>
       <w:r>
-        <w:t>38.3. Monthly Operations</w:t>
+        <w:t>39.3. Monthly Operations</w:t>
       </w:r>
     </w:p>
     <w:p>
@@ -23619,7 +24260,7 @@
         <w:pStyle w:val="Heading2"/>
       </w:pPr>
       <w:r>
-        <w:t>38.4. Update Checklist</w:t>
+        <w:t>39.4. Update Checklist</w:t>
       </w:r>
     </w:p>
     <w:p>
@@ -23669,7 +24310,7 @@
         <w:pStyle w:val="ListNumber"/>
       </w:pPr>
       <w:r>
-        <w:t>Pull the release tag.</w:t>
+        <w:t>Run `ENV_FILE=.env bash deploy/deploy.sh &lt;environment&gt; &lt;release-tag&gt;`.</w:t>
       </w:r>
     </w:p>
     <w:p>
@@ -23677,7 +24318,7 @@
         <w:pStyle w:val="ListNumber"/>
       </w:pPr>
       <w:r>
-        <w:t>Rebuild containers.</w:t>
+        <w:t>Preserve `.deploy/previous_revision` with the release record.</w:t>
       </w:r>
     </w:p>
     <w:p>
@@ -23685,7 +24326,12 @@
         <w:pStyle w:val="ListNumber"/>
       </w:pPr>
       <w:r>
-        <w:t>Apply Alembic migrations.</w:t>
+        <w:t>Do not run an automatic Alembic downgrade during application rollback.</w:t>
+      </w:r>
+    </w:p>
+    <w:p>
+      <w:r>
+        <w:t>After update:</w:t>
       </w:r>
     </w:p>
     <w:p>
@@ -23693,12 +24339,7 @@
         <w:pStyle w:val="ListNumber"/>
       </w:pPr>
       <w:r>
-        <w:t>Restart services.</w:t>
-      </w:r>
-    </w:p>
-    <w:p>
-      <w:r>
-        <w:t>After update:</w:t>
+        <w:t>Check `/health`, `/ready`, and `/metrics`.</w:t>
       </w:r>
     </w:p>
     <w:p>
@@ -23706,7 +24347,7 @@
         <w:pStyle w:val="ListNumber"/>
       </w:pPr>
       <w:r>
-        <w:t>Check `/health`, `/ready`, and `/metrics`.</w:t>
+        <w:t>Test `/start`, TikTok OAuth start, tariff display, Robokassa payment link generation, and upload queue creation.</w:t>
       </w:r>
     </w:p>
     <w:p>
@@ -23714,7 +24355,7 @@
         <w:pStyle w:val="ListNumber"/>
       </w:pPr>
       <w:r>
-        <w:t>Test `/start`, TikTok OAuth start, tariff display, Robokassa payment link generation, and upload queue creation.</w:t>
+        <w:t>Watch logs for at least 15 minutes.</w:t>
       </w:r>
     </w:p>
     <w:p>
@@ -23722,14 +24363,6 @@
         <w:pStyle w:val="ListNumber"/>
       </w:pPr>
       <w:r>
-        <w:t>Watch logs for at least 15 minutes.</w:t>
-      </w:r>
-    </w:p>
-    <w:p>
-      <w:pPr>
-        <w:pStyle w:val="ListNumber"/>
-      </w:pPr>
-      <w:r>
         <w:t>Re-enable intake with `intake_enabled=true`.</w:t>
       </w:r>
     </w:p>
@@ -23738,7 +24371,7 @@
         <w:pStyle w:val="Heading2"/>
       </w:pPr>
       <w:r>
-        <w:t>38.5. Goal</w:t>
+        <w:t>39.5. Goal</w:t>
       </w:r>
     </w:p>
     <w:p>
@@ -23756,7 +24389,7 @@
         <w:pStyle w:val="Heading2"/>
       </w:pPr>
       <w:r>
-        <w:t>38.6. Incidents</w:t>
+        <w:t>39.6. Incidents</w:t>
       </w:r>
     </w:p>
     <w:p>
@@ -23772,6 +24405,16 @@
     <w:p>
       <w:r>
         <w:t>Tracing, event correlation, and log search requirements are described in Observability and Diagnostics.</w:t>
+      </w:r>
+    </w:p>
+    <w:p>
+      <w:r>
+        <w:t>Executable release, backup, restore, rollback, and smoke-test procedures are described in</w:t>
+      </w:r>
+    </w:p>
+    <w:p>
+      <w:r>
+        <w:t>CI/CD and Deployment Automation.</w:t>
       </w:r>
     </w:p>
     <w:p>
@@ -23789,7 +24432,7 @@
         <w:pStyle w:val="Heading1"/>
       </w:pPr>
       <w:r>
-        <w:t>39. SOP Checklists</w:t>
+        <w:t>40. SOP Checklists</w:t>
       </w:r>
     </w:p>
     <w:p>
@@ -23802,7 +24445,7 @@
         <w:pStyle w:val="Heading2"/>
       </w:pPr>
       <w:r>
-        <w:t>39.1. Daily Administrator Checklist</w:t>
+        <w:t>40.1. Daily Administrator Checklist</w:t>
       </w:r>
     </w:p>
     <w:p>
@@ -23858,7 +24501,7 @@
         <w:pStyle w:val="Heading2"/>
       </w:pPr>
       <w:r>
-        <w:t>39.2. Weekly Checklist</w:t>
+        <w:t>40.2. Weekly Checklist</w:t>
       </w:r>
     </w:p>
     <w:p>
@@ -23911,7 +24554,7 @@
         <w:pStyle w:val="Heading2"/>
       </w:pPr>
       <w:r>
-        <w:t>39.3. Production Preflight</w:t>
+        <w:t>40.3. Production Preflight</w:t>
       </w:r>
     </w:p>
     <w:p>
@@ -24007,7 +24650,7 @@
         <w:pStyle w:val="Heading2"/>
       </w:pPr>
       <w:r>
-        <w:t>39.4. Configuration Change Checklist</w:t>
+        <w:t>40.4. Configuration Change Checklist</w:t>
       </w:r>
     </w:p>
     <w:p>
@@ -24084,7 +24727,7 @@
         <w:pStyle w:val="Heading2"/>
       </w:pPr>
       <w:r>
-        <w:t>39.5. Post-Update Checklist</w:t>
+        <w:t>40.5. Post-Update Checklist</w:t>
       </w:r>
     </w:p>
     <w:p>
@@ -24172,7 +24815,7 @@
         <w:pStyle w:val="Heading2"/>
       </w:pPr>
       <w:r>
-        <w:t>39.6. Diagnostics</w:t>
+        <w:t>40.6. Diagnostics</w:t>
       </w:r>
     </w:p>
     <w:p>
@@ -24285,7 +24928,7 @@
         <w:pStyle w:val="Heading2"/>
       </w:pPr>
       <w:r>
-        <w:t>39.7. Incident Documentation</w:t>
+        <w:t>40.7. Incident Documentation</w:t>
       </w:r>
     </w:p>
     <w:p>
@@ -24351,7 +24994,7 @@
         <w:pStyle w:val="Heading2"/>
       </w:pPr>
       <w:r>
-        <w:t>39.8. Emergency Procedure</w:t>
+        <w:t>40.8. Emergency Procedure</w:t>
       </w:r>
     </w:p>
     <w:p>
@@ -24422,7 +25065,7 @@
         <w:pStyle w:val="Heading1"/>
       </w:pPr>
       <w:r>
-        <w:t>40. Maintenance Guide</w:t>
+        <w:t>41. Maintenance Guide</w:t>
       </w:r>
     </w:p>
     <w:p>
@@ -24435,7 +25078,7 @@
         <w:pStyle w:val="Heading2"/>
       </w:pPr>
       <w:r>
-        <w:t>40.1. Source of Truth</w:t>
+        <w:t>41.1. Source of Truth</w:t>
       </w:r>
     </w:p>
     <w:p>
@@ -24453,7 +25096,7 @@
         <w:pStyle w:val="Heading2"/>
       </w:pPr>
       <w:r>
-        <w:t>40.2. Versioning</w:t>
+        <w:t>41.2. Versioning</w:t>
       </w:r>
     </w:p>
     <w:p>
@@ -24495,7 +25138,7 @@
         <w:pStyle w:val="Heading2"/>
       </w:pPr>
       <w:r>
-        <w:t>40.3. Production Update Procedure</w:t>
+        <w:t>41.3. Production Update Procedure</w:t>
       </w:r>
     </w:p>
     <w:p>
@@ -24559,7 +25202,7 @@
         <w:pStyle w:val="Heading2"/>
       </w:pPr>
       <w:r>
-        <w:t>40.4. Rollback Procedure</w:t>
+        <w:t>41.4. Rollback Procedure</w:t>
       </w:r>
     </w:p>
     <w:p>
@@ -24607,7 +25250,7 @@
         <w:pStyle w:val="Heading2"/>
       </w:pPr>
       <w:r>
-        <w:t>40.5. Support Operations</w:t>
+        <w:t>41.5. Support Operations</w:t>
       </w:r>
     </w:p>
     <w:p>
@@ -24665,7 +25308,7 @@
         <w:pStyle w:val="Heading2"/>
       </w:pPr>
       <w:r>
-        <w:t>40.6. Routine Maintenance</w:t>
+        <w:t>41.6. Routine Maintenance</w:t>
       </w:r>
     </w:p>
     <w:p>
@@ -24688,7 +25331,7 @@
         <w:pStyle w:val="Heading2"/>
       </w:pPr>
       <w:r>
-        <w:t>40.7. Feature Development</w:t>
+        <w:t>41.7. Feature Development</w:t>
       </w:r>
     </w:p>
     <w:p>
@@ -24759,7 +25402,7 @@
         <w:pStyle w:val="Heading1"/>
       </w:pPr>
       <w:r>
-        <w:t>41. Post-Launch Maintenance and Versioning</w:t>
+        <w:t>42. Post-Launch Maintenance and Versioning</w:t>
       </w:r>
     </w:p>
     <w:p>
@@ -24772,7 +25415,7 @@
         <w:pStyle w:val="Heading2"/>
       </w:pPr>
       <w:r>
-        <w:t>41.1. Release Cycle</w:t>
+        <w:t>42.1. Release Cycle</w:t>
       </w:r>
     </w:p>
     <w:p>
@@ -24841,7 +25484,7 @@
         <w:pStyle w:val="Heading2"/>
       </w:pPr>
       <w:r>
-        <w:t>41.2. Maintenance Schedule</w:t>
+        <w:t>42.2. Maintenance Schedule</w:t>
       </w:r>
     </w:p>
     <w:p>
@@ -24849,7 +25492,7 @@
         <w:pStyle w:val="Heading3"/>
       </w:pPr>
       <w:r>
-        <w:t>41.2.1. Daily</w:t>
+        <w:t>42.2.1. Daily</w:t>
       </w:r>
     </w:p>
     <w:p>
@@ -24897,7 +25540,7 @@
         <w:pStyle w:val="Heading3"/>
       </w:pPr>
       <w:r>
-        <w:t>41.2.2. Weekly</w:t>
+        <w:t>42.2.2. Weekly</w:t>
       </w:r>
     </w:p>
     <w:p>
@@ -24945,7 +25588,7 @@
         <w:pStyle w:val="Heading3"/>
       </w:pPr>
       <w:r>
-        <w:t>41.2.3. Monthly</w:t>
+        <w:t>42.2.3. Monthly</w:t>
       </w:r>
     </w:p>
     <w:p>
@@ -24998,7 +25641,7 @@
         <w:pStyle w:val="Heading2"/>
       </w:pPr>
       <w:r>
-        <w:t>41.3. Change Management</w:t>
+        <w:t>42.3. Change Management</w:t>
       </w:r>
     </w:p>
     <w:p>
@@ -25056,7 +25699,7 @@
         <w:pStyle w:val="Heading2"/>
       </w:pPr>
       <w:r>
-        <w:t>41.4. Release Quality Gates</w:t>
+        <w:t>42.4. Release Quality Gates</w:t>
       </w:r>
     </w:p>
     <w:p>
@@ -25125,7 +25768,7 @@
         <w:pStyle w:val="Heading2"/>
       </w:pPr>
       <w:r>
-        <w:t>41.5. Post-Release Monitoring</w:t>
+        <w:t>42.5. Post-Release Monitoring</w:t>
       </w:r>
     </w:p>
     <w:p>
@@ -25202,7 +25845,7 @@
         <w:pStyle w:val="Heading2"/>
       </w:pPr>
       <w:r>
-        <w:t>41.6. Stability Goal</w:t>
+        <w:t>42.6. Stability Goal</w:t>
       </w:r>
     </w:p>
     <w:p>
@@ -25225,7 +25868,7 @@
         <w:pStyle w:val="Heading1"/>
       </w:pPr>
       <w:r>
-        <w:t>42. Incident Response and Disaster Recovery</w:t>
+        <w:t>43. Incident Response and Disaster Recovery</w:t>
       </w:r>
     </w:p>
     <w:p>
@@ -25258,7 +25901,7 @@
         <w:pStyle w:val="Heading2"/>
       </w:pPr>
       <w:r>
-        <w:t>42.1. Critical Failure Procedure</w:t>
+        <w:t>43.1. Critical Failure Procedure</w:t>
       </w:r>
     </w:p>
     <w:p>
@@ -25330,7 +25973,7 @@
         <w:pStyle w:val="Heading2"/>
       </w:pPr>
       <w:r>
-        <w:t>42.2. Queue Recovery</w:t>
+        <w:t>43.2. Queue Recovery</w:t>
       </w:r>
     </w:p>
     <w:p>
@@ -25362,7 +26005,7 @@
         <w:pStyle w:val="Heading2"/>
       </w:pPr>
       <w:r>
-        <w:t>42.3. Monitoring Checklist</w:t>
+        <w:t>43.3. Monitoring Checklist</w:t>
       </w:r>
     </w:p>
     <w:p>
@@ -25426,7 +26069,7 @@
         <w:pStyle w:val="Heading2"/>
       </w:pPr>
       <w:r>
-        <w:t>42.4. Audit</w:t>
+        <w:t>43.4. Audit</w:t>
       </w:r>
     </w:p>
     <w:p>
@@ -25473,7 +26116,7 @@
         <w:pStyle w:val="Heading1"/>
       </w:pPr>
       <w:r>
-        <w:t>43. Incident Management</w:t>
+        <w:t>44. Incident Management</w:t>
       </w:r>
     </w:p>
     <w:p>
@@ -25486,7 +26129,7 @@
         <w:pStyle w:val="Heading2"/>
       </w:pPr>
       <w:r>
-        <w:t>43.1. Priorities</w:t>
+        <w:t>44.1. Priorities</w:t>
       </w:r>
     </w:p>
     <w:tbl>
@@ -25757,7 +26400,7 @@
         <w:pStyle w:val="Heading2"/>
       </w:pPr>
       <w:r>
-        <w:t>43.2. Response Flow</w:t>
+        <w:t>44.2. Response Flow</w:t>
       </w:r>
     </w:p>
     <w:p>
@@ -25821,7 +26464,7 @@
         <w:pStyle w:val="Heading2"/>
       </w:pPr>
       <w:r>
-        <w:t>43.3. Incident Record Template</w:t>
+        <w:t>44.3. Incident Record Template</w:t>
       </w:r>
     </w:p>
     <w:p>
@@ -25864,7 +26507,7 @@
         <w:pStyle w:val="Heading2"/>
       </w:pPr>
       <w:r>
-        <w:t>43.4. Availability Checks</w:t>
+        <w:t>44.4. Availability Checks</w:t>
       </w:r>
     </w:p>
     <w:p>
@@ -25944,7 +26587,7 @@
         <w:pStyle w:val="Heading2"/>
       </w:pPr>
       <w:r>
-        <w:t>43.5. Escalation</w:t>
+        <w:t>44.5. Escalation</w:t>
       </w:r>
     </w:p>
     <w:p>
@@ -25984,7 +26627,7 @@
         <w:pStyle w:val="Heading2"/>
       </w:pPr>
       <w:r>
-        <w:t>43.6. Post-Incident Review</w:t>
+        <w:t>44.6. Post-Incident Review</w:t>
       </w:r>
     </w:p>
     <w:p>
@@ -26052,7 +26695,7 @@
         <w:pStyle w:val="Heading1"/>
       </w:pPr>
       <w:r>
-        <w:t>44. Backup and Restore Policy</w:t>
+        <w:t>45. Backup and Restore Policy</w:t>
       </w:r>
     </w:p>
     <w:p>
@@ -26065,7 +26708,7 @@
         <w:pStyle w:val="Heading2"/>
       </w:pPr>
       <w:r>
-        <w:t>44.1. Backup Objects</w:t>
+        <w:t>45.1. Backup Objects</w:t>
       </w:r>
     </w:p>
     <w:p>
@@ -26144,7 +26787,7 @@
         <w:pStyle w:val="Heading2"/>
       </w:pPr>
       <w:r>
-        <w:t>44.2. Backup Policy</w:t>
+        <w:t>45.2. Backup Policy</w:t>
       </w:r>
     </w:p>
     <w:p>
@@ -26208,7 +26851,7 @@
         <w:pStyle w:val="Heading2"/>
       </w:pPr>
       <w:r>
-        <w:t>44.3. Backup Verification</w:t>
+        <w:t>45.3. Backup Verification</w:t>
       </w:r>
     </w:p>
     <w:p>
@@ -26286,11 +26929,21 @@
       </w:r>
     </w:p>
     <w:p>
+      <w:r>
+        <w:t>The supported command is `ENV_FILE=.env bash deploy/backup_postgres.sh`. It creates a PostgreSQL</w:t>
+      </w:r>
+    </w:p>
+    <w:p>
+      <w:r>
+        <w:t>custom archive, verifies it with `pg_restore --list`, and writes `.sha256` and `.meta` sidecars.</w:t>
+      </w:r>
+    </w:p>
+    <w:p>
       <w:pPr>
         <w:pStyle w:val="Heading2"/>
       </w:pPr>
       <w:r>
-        <w:t>44.4. Restore Procedure</w:t>
+        <w:t>45.4. Restore Procedure</w:t>
       </w:r>
     </w:p>
     <w:p>
@@ -26374,11 +27027,26 @@
       </w:r>
     </w:p>
     <w:p>
+      <w:r>
+        <w:t>Use `ENV_FILE=.env bash deploy/restore_postgres.sh &lt;archive&gt; --confirm`. The script keeps</w:t>
+      </w:r>
+    </w:p>
+    <w:p>
+      <w:r>
+        <w:t>application services stopped if restoration fails. Full command behavior is documented in</w:t>
+      </w:r>
+    </w:p>
+    <w:p>
+      <w:r>
+        <w:t>CI/CD and Deployment Automation.</w:t>
+      </w:r>
+    </w:p>
+    <w:p>
       <w:pPr>
         <w:pStyle w:val="Heading2"/>
       </w:pPr>
       <w:r>
-        <w:t>44.5. Recovery Success Criteria</w:t>
+        <w:t>45.5. Recovery Success Criteria</w:t>
       </w:r>
     </w:p>
     <w:p>
@@ -26460,7 +27128,7 @@
         <w:pStyle w:val="Heading2"/>
       </w:pPr>
       <w:r>
-        <w:t>44.6. Restore Drill</w:t>
+        <w:t>45.6. Restore Drill</w:t>
       </w:r>
     </w:p>
     <w:p>
@@ -26513,7 +27181,7 @@
         <w:pStyle w:val="Heading2"/>
       </w:pPr>
       <w:r>
-        <w:t>44.7. Documentation Requirement</w:t>
+        <w:t>45.7. Documentation Requirement</w:t>
       </w:r>
     </w:p>
     <w:p>
@@ -26592,7 +27260,7 @@
         <w:pStyle w:val="Heading1"/>
       </w:pPr>
       <w:r>
-        <w:t>45. Service Continuity Plan</w:t>
+        <w:t>46. Service Continuity Plan</w:t>
       </w:r>
     </w:p>
     <w:p>
@@ -26605,7 +27273,7 @@
         <w:pStyle w:val="Heading2"/>
       </w:pPr>
       <w:r>
-        <w:t>45.1. Critical Services</w:t>
+        <w:t>46.1. Critical Services</w:t>
       </w:r>
     </w:p>
     <w:p>
@@ -26671,7 +27339,7 @@
         <w:pStyle w:val="Heading2"/>
       </w:pPr>
       <w:r>
-        <w:t>45.2. Continuity Measures</w:t>
+        <w:t>46.2. Continuity Measures</w:t>
       </w:r>
     </w:p>
     <w:p>
@@ -26735,7 +27403,7 @@
         <w:pStyle w:val="Heading2"/>
       </w:pPr>
       <w:r>
-        <w:t>45.3. Planned Maintenance</w:t>
+        <w:t>46.3. Planned Maintenance</w:t>
       </w:r>
     </w:p>
     <w:p>
@@ -26812,7 +27480,7 @@
         <w:pStyle w:val="Heading2"/>
       </w:pPr>
       <w:r>
-        <w:t>45.4. External Service Degradation</w:t>
+        <w:t>46.4. External Service Degradation</w:t>
       </w:r>
     </w:p>
     <w:p>
@@ -26865,7 +27533,7 @@
         <w:pStyle w:val="Heading2"/>
       </w:pPr>
       <w:r>
-        <w:t>45.5. Recovery Readiness</w:t>
+        <w:t>46.5. Recovery Readiness</w:t>
       </w:r>
     </w:p>
     <w:p>
@@ -26926,7 +27594,7 @@
         <w:pStyle w:val="Heading2"/>
       </w:pPr>
       <w:r>
-        <w:t>45.6. Success Criteria</w:t>
+        <w:t>46.6. Success Criteria</w:t>
       </w:r>
     </w:p>
     <w:p>
@@ -26997,7 +27665,7 @@
         <w:pStyle w:val="Heading1"/>
       </w:pPr>
       <w:r>
-        <w:t>46. Data Retention</w:t>
+        <w:t>47. Data Retention</w:t>
       </w:r>
     </w:p>
     <w:p>
@@ -27010,7 +27678,7 @@
         <w:pStyle w:val="Heading2"/>
       </w:pPr>
       <w:r>
-        <w:t>46.1. Configuration</w:t>
+        <w:t>47.1. Configuration</w:t>
       </w:r>
     </w:p>
     <w:p>
@@ -27037,7 +27705,7 @@
         <w:pStyle w:val="Heading2"/>
       </w:pPr>
       <w:r>
-        <w:t>46.2. Policy</w:t>
+        <w:t>47.2. Policy</w:t>
       </w:r>
     </w:p>
     <w:p>
@@ -27098,7 +27766,7 @@
         <w:pStyle w:val="Heading2"/>
       </w:pPr>
       <w:r>
-        <w:t>46.3. User Data Deletion</w:t>
+        <w:t>47.3. User Data Deletion</w:t>
       </w:r>
     </w:p>
     <w:p>
@@ -27139,7 +27807,7 @@
         <w:pStyle w:val="Heading1"/>
       </w:pPr>
       <w:r>
-        <w:t>47. File Storage Policy</w:t>
+        <w:t>48. File Storage Policy</w:t>
       </w:r>
     </w:p>
     <w:p>
@@ -27152,7 +27820,7 @@
         <w:pStyle w:val="Heading2"/>
       </w:pPr>
       <w:r>
-        <w:t>47.1. Storage Principles</w:t>
+        <w:t>48.1. Storage Principles</w:t>
       </w:r>
     </w:p>
     <w:p>
@@ -27208,7 +27876,7 @@
         <w:pStyle w:val="Heading2"/>
       </w:pPr>
       <w:r>
-        <w:t>47.2. Directory Structure</w:t>
+        <w:t>48.2. Directory Structure</w:t>
       </w:r>
     </w:p>
     <w:p>
@@ -27470,7 +28138,7 @@
         <w:pStyle w:val="Heading2"/>
       </w:pPr>
       <w:r>
-        <w:t>47.3. Cleanup Policy</w:t>
+        <w:t>48.3. Cleanup Policy</w:t>
       </w:r>
     </w:p>
     <w:p>
@@ -27526,7 +28194,7 @@
         <w:pStyle w:val="Heading2"/>
       </w:pPr>
       <w:r>
-        <w:t>47.4. Security Requirements</w:t>
+        <w:t>48.4. Security Requirements</w:t>
       </w:r>
     </w:p>
     <w:p>
@@ -27590,7 +28258,7 @@
         <w:pStyle w:val="Heading2"/>
       </w:pPr>
       <w:r>
-        <w:t>47.5. Operational Checks</w:t>
+        <w:t>48.5. Operational Checks</w:t>
       </w:r>
     </w:p>
     <w:p>
@@ -27651,7 +28319,7 @@
         <w:pStyle w:val="Heading2"/>
       </w:pPr>
       <w:r>
-        <w:t>47.6. Recovery Notes</w:t>
+        <w:t>48.6. Recovery Notes</w:t>
       </w:r>
     </w:p>
     <w:p>
@@ -27722,7 +28390,7 @@
         <w:pStyle w:val="Heading1"/>
       </w:pPr>
       <w:r>
-        <w:t>48. Queue and Retry Policy</w:t>
+        <w:t>49. Queue and Retry Policy</w:t>
       </w:r>
     </w:p>
     <w:p>
@@ -27735,7 +28403,7 @@
         <w:pStyle w:val="Heading2"/>
       </w:pPr>
       <w:r>
-        <w:t>48.1. Background Task Types</w:t>
+        <w:t>49.1. Background Task Types</w:t>
       </w:r>
     </w:p>
     <w:p>
@@ -27804,7 +28472,7 @@
         <w:pStyle w:val="Heading2"/>
       </w:pPr>
       <w:r>
-        <w:t>48.2. Queue Rules</w:t>
+        <w:t>49.2. Queue Rules</w:t>
       </w:r>
     </w:p>
     <w:p>
@@ -27876,7 +28544,7 @@
         <w:pStyle w:val="Heading2"/>
       </w:pPr>
       <w:r>
-        <w:t>48.3. Periodic Maintenance</w:t>
+        <w:t>49.3. Periodic Maintenance</w:t>
       </w:r>
     </w:p>
     <w:p>
@@ -27943,7 +28611,7 @@
         <w:pStyle w:val="Heading2"/>
       </w:pPr>
       <w:r>
-        <w:t>48.4. Retryable Errors</w:t>
+        <w:t>49.4. Retryable Errors</w:t>
       </w:r>
     </w:p>
     <w:p>
@@ -28016,7 +28684,7 @@
         <w:pStyle w:val="Heading2"/>
       </w:pPr>
       <w:r>
-        <w:t>48.5. Non-Retryable Errors</w:t>
+        <w:t>49.5. Non-Retryable Errors</w:t>
       </w:r>
     </w:p>
     <w:p>
@@ -28098,7 +28766,7 @@
         <w:pStyle w:val="Heading2"/>
       </w:pPr>
       <w:r>
-        <w:t>48.6. Status Updates</w:t>
+        <w:t>49.6. Status Updates</w:t>
       </w:r>
     </w:p>
     <w:p>
@@ -28177,7 +28845,7 @@
         <w:pStyle w:val="Heading2"/>
       </w:pPr>
       <w:r>
-        <w:t>48.7. Duplicate Prevention</w:t>
+        <w:t>49.7. Duplicate Prevention</w:t>
       </w:r>
     </w:p>
     <w:p>
@@ -28238,7 +28906,7 @@
         <w:pStyle w:val="Heading2"/>
       </w:pPr>
       <w:r>
-        <w:t>48.8. Administrative Control</w:t>
+        <w:t>49.8. Administrative Control</w:t>
       </w:r>
     </w:p>
     <w:p>
@@ -28320,7 +28988,7 @@
         <w:pStyle w:val="Heading2"/>
       </w:pPr>
       <w:r>
-        <w:t>48.9. Operational Goal</w:t>
+        <w:t>49.9. Operational Goal</w:t>
       </w:r>
     </w:p>
     <w:p>
@@ -28343,7 +29011,7 @@
         <w:pStyle w:val="Heading1"/>
       </w:pPr>
       <w:r>
-        <w:t>49. Performance and Scaling</w:t>
+        <w:t>50. Performance and Scaling</w:t>
       </w:r>
     </w:p>
     <w:p>
@@ -28361,7 +29029,7 @@
         <w:pStyle w:val="Heading2"/>
       </w:pPr>
       <w:r>
-        <w:t>49.1. Goals</w:t>
+        <w:t>50.1. Goals</w:t>
       </w:r>
     </w:p>
     <w:p>
@@ -28411,7 +29079,7 @@
         <w:pStyle w:val="Heading2"/>
       </w:pPr>
       <w:r>
-        <w:t>49.2. Scaling API</w:t>
+        <w:t>50.2. Scaling API</w:t>
       </w:r>
     </w:p>
     <w:p>
@@ -28442,7 +29110,7 @@
         <w:pStyle w:val="Heading2"/>
       </w:pPr>
       <w:r>
-        <w:t>49.3. Scaling Workers</w:t>
+        <w:t>50.3. Scaling Workers</w:t>
       </w:r>
     </w:p>
     <w:p>
@@ -28480,7 +29148,7 @@
         <w:pStyle w:val="Heading2"/>
       </w:pPr>
       <w:r>
-        <w:t>49.4. Database</w:t>
+        <w:t>50.4. Database</w:t>
       </w:r>
     </w:p>
     <w:p>
@@ -28515,7 +29183,7 @@
         <w:pStyle w:val="Heading2"/>
       </w:pPr>
       <w:r>
-        <w:t>49.5. Safe Restarts</w:t>
+        <w:t>50.5. Safe Restarts</w:t>
       </w:r>
     </w:p>
     <w:p>
@@ -28557,7 +29225,7 @@
         <w:pStyle w:val="Heading1"/>
       </w:pPr>
       <w:r>
-        <w:t>50. Capacity and Performance Management</w:t>
+        <w:t>51. Capacity and Performance Management</w:t>
       </w:r>
     </w:p>
     <w:p>
@@ -28570,7 +29238,7 @@
         <w:pStyle w:val="Heading2"/>
       </w:pPr>
       <w:r>
-        <w:t>50.1. Controlled Resources</w:t>
+        <w:t>51.1. Controlled Resources</w:t>
       </w:r>
     </w:p>
     <w:p>
@@ -28663,7 +29331,7 @@
         <w:pStyle w:val="Heading2"/>
       </w:pPr>
       <w:r>
-        <w:t>50.2. Threshold Events</w:t>
+        <w:t>51.2. Threshold Events</w:t>
       </w:r>
     </w:p>
     <w:p>
@@ -28748,7 +29416,7 @@
         <w:pStyle w:val="Heading2"/>
       </w:pPr>
       <w:r>
-        <w:t>50.3. Scaling Actions</w:t>
+        <w:t>51.3. Scaling Actions</w:t>
       </w:r>
     </w:p>
     <w:p>
@@ -28817,7 +29485,7 @@
         <w:pStyle w:val="Heading2"/>
       </w:pPr>
       <w:r>
-        <w:t>50.4. Review Cadence</w:t>
+        <w:t>51.4. Review Cadence</w:t>
       </w:r>
     </w:p>
     <w:p>
@@ -28880,7 +29548,7 @@
         <w:pStyle w:val="Heading2"/>
       </w:pPr>
       <w:r>
-        <w:t>50.5. Capacity Planning Inputs</w:t>
+        <w:t>51.5. Capacity Planning Inputs</w:t>
       </w:r>
     </w:p>
     <w:p>
@@ -28957,7 +29625,7 @@
         <w:pStyle w:val="Heading2"/>
       </w:pPr>
       <w:r>
-        <w:t>50.6. Operational Goal</w:t>
+        <w:t>51.6. Operational Goal</w:t>
       </w:r>
     </w:p>
     <w:p>
@@ -28980,7 +29648,7 @@
         <w:pStyle w:val="Heading1"/>
       </w:pPr>
       <w:r>
-        <w:t>51. Metrics and KPI</w:t>
+        <w:t>52. Metrics and KPI</w:t>
       </w:r>
     </w:p>
     <w:p>
@@ -28993,7 +29661,7 @@
         <w:pStyle w:val="Heading2"/>
       </w:pPr>
       <w:r>
-        <w:t>51.1. Technical KPI</w:t>
+        <w:t>52.1. Technical KPI</w:t>
       </w:r>
     </w:p>
     <w:p>
@@ -29293,7 +29961,7 @@
         <w:pStyle w:val="Heading2"/>
       </w:pPr>
       <w:r>
-        <w:t>51.2. Business Metrics</w:t>
+        <w:t>52.2. Business Metrics</w:t>
       </w:r>
     </w:p>
     <w:p>
@@ -29626,7 +30294,7 @@
         <w:pStyle w:val="Heading2"/>
       </w:pPr>
       <w:r>
-        <w:t>51.3. Quality Metrics</w:t>
+        <w:t>52.3. Quality Metrics</w:t>
       </w:r>
     </w:p>
     <w:p>
@@ -29893,7 +30561,7 @@
         <w:pStyle w:val="Heading2"/>
       </w:pPr>
       <w:r>
-        <w:t>51.4. Administrative Dashboard</w:t>
+        <w:t>52.4. Administrative Dashboard</w:t>
       </w:r>
     </w:p>
     <w:p>
@@ -29970,7 +30638,7 @@
         <w:pStyle w:val="Heading2"/>
       </w:pPr>
       <w:r>
-        <w:t>51.5. Operational Use</w:t>
+        <w:t>52.5. Operational Use</w:t>
       </w:r>
     </w:p>
     <w:p>
@@ -30056,7 +30724,7 @@
         <w:pStyle w:val="Heading1"/>
       </w:pPr>
       <w:r>
-        <w:t>52. Observability and Diagnostics</w:t>
+        <w:t>53. Observability and Diagnostics</w:t>
       </w:r>
     </w:p>
     <w:p>
@@ -30074,7 +30742,7 @@
         <w:pStyle w:val="Heading2"/>
       </w:pPr>
       <w:r>
-        <w:t>52.1. Unified Tracing</w:t>
+        <w:t>53.1. Unified Tracing</w:t>
       </w:r>
     </w:p>
     <w:p>
@@ -30122,7 +30790,7 @@
         <w:pStyle w:val="Heading2"/>
       </w:pPr>
       <w:r>
-        <w:t>52.2. Diagnostic Events</w:t>
+        <w:t>53.2. Diagnostic Events</w:t>
       </w:r>
     </w:p>
     <w:p>
@@ -30233,7 +30901,7 @@
         <w:pStyle w:val="Heading2"/>
       </w:pPr>
       <w:r>
-        <w:t>52.3. Log Requirements</w:t>
+        <w:t>53.3. Log Requirements</w:t>
       </w:r>
     </w:p>
     <w:p>
@@ -30315,7 +30983,7 @@
         <w:pStyle w:val="Heading2"/>
       </w:pPr>
       <w:r>
-        <w:t>52.4. Cross-Service Diagnostics</w:t>
+        <w:t>53.4. Cross-Service Diagnostics</w:t>
       </w:r>
     </w:p>
     <w:p>
@@ -30450,7 +31118,7 @@
         <w:pStyle w:val="Heading2"/>
       </w:pPr>
       <w:r>
-        <w:t>52.5. Operational Diagnostics</w:t>
+        <w:t>53.5. Operational Diagnostics</w:t>
       </w:r>
     </w:p>
     <w:p>
@@ -30532,7 +31200,7 @@
         <w:pStyle w:val="Heading2"/>
       </w:pPr>
       <w:r>
-        <w:t>52.6. Goal</w:t>
+        <w:t>53.6. Goal</w:t>
       </w:r>
     </w:p>
     <w:p>
@@ -30555,7 +31223,7 @@
         <w:pStyle w:val="Heading1"/>
       </w:pPr>
       <w:r>
-        <w:t>53. Development Standards</w:t>
+        <w:t>54. Development Standards</w:t>
       </w:r>
     </w:p>
     <w:p>
@@ -30578,7 +31246,7 @@
         <w:pStyle w:val="Heading2"/>
       </w:pPr>
       <w:r>
-        <w:t>53.1. Repository Structure</w:t>
+        <w:t>54.1. Repository Structure</w:t>
       </w:r>
     </w:p>
     <w:p>
@@ -30617,7 +31285,7 @@
         <w:pStyle w:val="Heading2"/>
       </w:pPr>
       <w:r>
-        <w:t>53.2. Coding Standards</w:t>
+        <w:t>54.2. Coding Standards</w:t>
       </w:r>
     </w:p>
     <w:p>
@@ -30670,7 +31338,7 @@
         <w:pStyle w:val="Heading2"/>
       </w:pPr>
       <w:r>
-        <w:t>53.3. Git Workflow</w:t>
+        <w:t>54.3. Git Workflow</w:t>
       </w:r>
     </w:p>
     <w:p>
@@ -30817,7 +31485,7 @@
         <w:pStyle w:val="Heading2"/>
       </w:pPr>
       <w:r>
-        <w:t>53.4. Quality Gates</w:t>
+        <w:t>54.4. Quality Gates</w:t>
       </w:r>
     </w:p>
     <w:p>
@@ -30855,7 +31523,7 @@
         <w:pStyle w:val="Heading2"/>
       </w:pPr>
       <w:r>
-        <w:t>53.5. Compatibility</w:t>
+        <w:t>54.5. Compatibility</w:t>
       </w:r>
     </w:p>
     <w:p>
@@ -30883,7 +31551,7 @@
         <w:pStyle w:val="Heading1"/>
       </w:pPr>
       <w:r>
-        <w:t>54. GitHub Workflow</w:t>
+        <w:t>55. GitHub Workflow</w:t>
       </w:r>
     </w:p>
     <w:p>
@@ -30896,7 +31564,7 @@
         <w:pStyle w:val="Heading2"/>
       </w:pPr>
       <w:r>
-        <w:t>54.1. Repository</w:t>
+        <w:t>55.1. Repository</w:t>
       </w:r>
     </w:p>
     <w:p>
@@ -30914,7 +31582,7 @@
         <w:pStyle w:val="Heading2"/>
       </w:pPr>
       <w:r>
-        <w:t>54.2. Development Flow</w:t>
+        <w:t>55.2. Development Flow</w:t>
       </w:r>
     </w:p>
     <w:p>
@@ -30994,7 +31662,7 @@
         <w:pStyle w:val="Heading2"/>
       </w:pPr>
       <w:r>
-        <w:t>54.3. Branch Protection Recommendations</w:t>
+        <w:t>55.3. Branch Protection Recommendations</w:t>
       </w:r>
     </w:p>
     <w:p>
@@ -31063,7 +31731,7 @@
         <w:pStyle w:val="Heading2"/>
       </w:pPr>
       <w:r>
-        <w:t>54.4. Task Description Standard</w:t>
+        <w:t>55.4. Task Description Standard</w:t>
       </w:r>
     </w:p>
     <w:p>
@@ -31121,7 +31789,7 @@
         <w:pStyle w:val="Heading2"/>
       </w:pPr>
       <w:r>
-        <w:t>54.5. Completion Criteria</w:t>
+        <w:t>55.5. Completion Criteria</w:t>
       </w:r>
     </w:p>
     <w:p>
@@ -31174,7 +31842,7 @@
         <w:pStyle w:val="Heading2"/>
       </w:pPr>
       <w:r>
-        <w:t>54.6. Release Tags</w:t>
+        <w:t>55.6. Release Tags</w:t>
       </w:r>
     </w:p>
     <w:p>
@@ -31215,7 +31883,7 @@
         <w:pStyle w:val="Heading1"/>
       </w:pPr>
       <w:r>
-        <w:t>55. Feature Development Plan</w:t>
+        <w:t>56. Feature Development Plan</w:t>
       </w:r>
     </w:p>
     <w:p>
@@ -31228,7 +31896,7 @@
         <w:pStyle w:val="Heading2"/>
       </w:pPr>
       <w:r>
-        <w:t>55.1. Principles</w:t>
+        <w:t>56.1. Principles</w:t>
       </w:r>
     </w:p>
     <w:p>
@@ -31284,7 +31952,7 @@
         <w:pStyle w:val="Heading2"/>
       </w:pPr>
       <w:r>
-        <w:t>55.2. Feature Delivery Flow</w:t>
+        <w:t>56.2. Feature Delivery Flow</w:t>
       </w:r>
     </w:p>
     <w:p>
@@ -31372,7 +32040,7 @@
         <w:pStyle w:val="Heading2"/>
       </w:pPr>
       <w:r>
-        <w:t>55.3. Compatibility Requirements</w:t>
+        <w:t>56.3. Compatibility Requirements</w:t>
       </w:r>
     </w:p>
     <w:p>
@@ -31433,7 +32101,7 @@
         <w:pStyle w:val="Heading2"/>
       </w:pPr>
       <w:r>
-        <w:t>55.4. Quality Control</w:t>
+        <w:t>56.4. Quality Control</w:t>
       </w:r>
     </w:p>
     <w:p>
@@ -31510,7 +32178,7 @@
         <w:pStyle w:val="Heading2"/>
       </w:pPr>
       <w:r>
-        <w:t>55.5. Release Readiness</w:t>
+        <w:t>56.5. Release Readiness</w:t>
       </w:r>
     </w:p>
     <w:p>
@@ -31581,7 +32249,7 @@
         <w:pStyle w:val="Heading1"/>
       </w:pPr>
       <w:r>
-        <w:t>56. Technical Debt Management</w:t>
+        <w:t>57. Technical Debt Management</w:t>
       </w:r>
     </w:p>
     <w:p>
@@ -31599,7 +32267,7 @@
         <w:pStyle w:val="Heading2"/>
       </w:pPr>
       <w:r>
-        <w:t>56.1. Sources of Technical Debt</w:t>
+        <w:t>57.1. Sources of Technical Debt</w:t>
       </w:r>
     </w:p>
     <w:p>
@@ -31668,7 +32336,7 @@
         <w:pStyle w:val="Heading2"/>
       </w:pPr>
       <w:r>
-        <w:t>56.2. Debt Record Format</w:t>
+        <w:t>57.2. Debt Record Format</w:t>
       </w:r>
     </w:p>
     <w:p>
@@ -32067,7 +32735,7 @@
         <w:pStyle w:val="Heading2"/>
       </w:pPr>
       <w:r>
-        <w:t>56.3. Prioritization</w:t>
+        <w:t>57.3. Prioritization</w:t>
       </w:r>
     </w:p>
     <w:p>
@@ -32107,7 +32775,7 @@
         <w:pStyle w:val="Heading2"/>
       </w:pPr>
       <w:r>
-        <w:t>56.4. Review Rules</w:t>
+        <w:t>57.4. Review Rules</w:t>
       </w:r>
     </w:p>
     <w:p>
@@ -32155,7 +32823,7 @@
         <w:pStyle w:val="Heading2"/>
       </w:pPr>
       <w:r>
-        <w:t>56.5. Release Control</w:t>
+        <w:t>57.5. Release Control</w:t>
       </w:r>
     </w:p>
     <w:p>
@@ -32200,7 +32868,7 @@
         <w:pStyle w:val="Heading2"/>
       </w:pPr>
       <w:r>
-        <w:t>56.6. Documentation</w:t>
+        <w:t>57.6. Documentation</w:t>
       </w:r>
     </w:p>
     <w:p>
@@ -32223,7 +32891,7 @@
         <w:pStyle w:val="Heading1"/>
       </w:pPr>
       <w:r>
-        <w:t>57. Dependencies and Third-Party Services</w:t>
+        <w:t>58. Dependencies and Third-Party Services</w:t>
       </w:r>
     </w:p>
     <w:p>
@@ -32236,7 +32904,7 @@
         <w:pStyle w:val="Heading2"/>
       </w:pPr>
       <w:r>
-        <w:t>57.1. Core Dependencies</w:t>
+        <w:t>58.1. Core Dependencies</w:t>
       </w:r>
     </w:p>
     <w:p>
@@ -32336,7 +33004,7 @@
         <w:pStyle w:val="Heading2"/>
       </w:pPr>
       <w:r>
-        <w:t>57.2. External Integrations</w:t>
+        <w:t>58.2. External Integrations</w:t>
       </w:r>
     </w:p>
     <w:p>
@@ -32378,7 +33046,7 @@
         <w:pStyle w:val="Heading2"/>
       </w:pPr>
       <w:r>
-        <w:t>57.3. Update Policy</w:t>
+        <w:t>58.3. Update Policy</w:t>
       </w:r>
     </w:p>
     <w:p>
@@ -32442,7 +33110,7 @@
         <w:pStyle w:val="Heading2"/>
       </w:pPr>
       <w:r>
-        <w:t>57.4. Compatibility Checks</w:t>
+        <w:t>58.4. Compatibility Checks</w:t>
       </w:r>
     </w:p>
     <w:p>
@@ -32519,7 +33187,7 @@
         <w:pStyle w:val="Heading2"/>
       </w:pPr>
       <w:r>
-        <w:t>57.5. Third-Party Service Control</w:t>
+        <w:t>58.5. Third-Party Service Control</w:t>
       </w:r>
     </w:p>
     <w:p>
@@ -32572,7 +33240,7 @@
         <w:pStyle w:val="Heading2"/>
       </w:pPr>
       <w:r>
-        <w:t>57.6. Release Rule</w:t>
+        <w:t>58.6. Release Rule</w:t>
       </w:r>
     </w:p>
     <w:p>
@@ -32595,7 +33263,7 @@
         <w:pStyle w:val="Heading1"/>
       </w:pPr>
       <w:r>
-        <w:t>58. Infrastructure Dependency Management</w:t>
+        <w:t>59. Infrastructure Dependency Management</w:t>
       </w:r>
     </w:p>
     <w:p>
@@ -32613,7 +33281,7 @@
         <w:pStyle w:val="Heading2"/>
       </w:pPr>
       <w:r>
-        <w:t>58.1. Controlled Components</w:t>
+        <w:t>59.1. Controlled Components</w:t>
       </w:r>
     </w:p>
     <w:tbl>
@@ -32908,7 +33576,7 @@
         <w:pStyle w:val="Heading2"/>
       </w:pPr>
       <w:r>
-        <w:t>58.2. Update Policy</w:t>
+        <w:t>59.2. Update Policy</w:t>
       </w:r>
     </w:p>
     <w:p>
@@ -32964,7 +33632,7 @@
         <w:pStyle w:val="Heading2"/>
       </w:pPr>
       <w:r>
-        <w:t>58.3. Security Control</w:t>
+        <w:t>59.3. Security Control</w:t>
       </w:r>
     </w:p>
     <w:p>
@@ -33020,7 +33688,7 @@
         <w:pStyle w:val="Heading2"/>
       </w:pPr>
       <w:r>
-        <w:t>58.4. Production Update Procedure</w:t>
+        <w:t>59.4. Production Update Procedure</w:t>
       </w:r>
     </w:p>
     <w:p>
@@ -33116,7 +33784,7 @@
         <w:pStyle w:val="Heading2"/>
       </w:pPr>
       <w:r>
-        <w:t>58.5. Compatibility Checks</w:t>
+        <w:t>59.5. Compatibility Checks</w:t>
       </w:r>
     </w:p>
     <w:p>
@@ -33201,7 +33869,7 @@
         <w:pStyle w:val="Heading2"/>
       </w:pPr>
       <w:r>
-        <w:t>58.6. Successful Update Criteria</w:t>
+        <w:t>59.6. Successful Update Criteria</w:t>
       </w:r>
     </w:p>
     <w:p>
@@ -33254,7 +33922,7 @@
         <w:pStyle w:val="Heading2"/>
       </w:pPr>
       <w:r>
-        <w:t>58.7. Related Documents</w:t>
+        <w:t>59.7. Related Documents</w:t>
       </w:r>
     </w:p>
     <w:p>
@@ -33328,7 +33996,7 @@
         <w:pStyle w:val="Heading1"/>
       </w:pPr>
       <w:r>
-        <w:t>59. License and Third-Party Component Management</w:t>
+        <w:t>60. License and Third-Party Component Management</w:t>
       </w:r>
     </w:p>
     <w:p>
@@ -33346,7 +34014,7 @@
         <w:pStyle w:val="Heading2"/>
       </w:pPr>
       <w:r>
-        <w:t>59.1. Component Registry</w:t>
+        <w:t>60.1. Component Registry</w:t>
       </w:r>
     </w:p>
     <w:p>
@@ -33715,7 +34383,7 @@
         <w:pStyle w:val="Heading2"/>
       </w:pPr>
       <w:r>
-        <w:t>59.2. License Checks</w:t>
+        <w:t>60.2. License Checks</w:t>
       </w:r>
     </w:p>
     <w:p>
@@ -33763,7 +34431,7 @@
         <w:pStyle w:val="Heading2"/>
       </w:pPr>
       <w:r>
-        <w:t>59.3. Security Control</w:t>
+        <w:t>60.3. Security Control</w:t>
       </w:r>
     </w:p>
     <w:p>
@@ -33811,7 +34479,7 @@
         <w:pStyle w:val="Heading2"/>
       </w:pPr>
       <w:r>
-        <w:t>59.4. Review Before Adding a Dependency</w:t>
+        <w:t>60.4. Review Before Adding a Dependency</w:t>
       </w:r>
     </w:p>
     <w:p>
@@ -33872,7 +34540,7 @@
         <w:pStyle w:val="Heading2"/>
       </w:pPr>
       <w:r>
-        <w:t>59.5. Release Requirements</w:t>
+        <w:t>60.5. Release Requirements</w:t>
       </w:r>
     </w:p>
     <w:p>
@@ -33925,7 +34593,7 @@
         <w:pStyle w:val="Heading2"/>
       </w:pPr>
       <w:r>
-        <w:t>59.6. Related Documents</w:t>
+        <w:t>60.6. Related Documents</w:t>
       </w:r>
     </w:p>
     <w:p>
@@ -33975,7 +34643,7 @@
         <w:pStyle w:val="Heading1"/>
       </w:pPr>
       <w:r>
-        <w:t>60. Migration and Version Compatibility Plan</w:t>
+        <w:t>61. Migration and Version Compatibility Plan</w:t>
       </w:r>
     </w:p>
     <w:p>
@@ -33988,7 +34656,7 @@
         <w:pStyle w:val="Heading2"/>
       </w:pPr>
       <w:r>
-        <w:t>60.1. Migration Rules</w:t>
+        <w:t>61.1. Migration Rules</w:t>
       </w:r>
     </w:p>
     <w:p>
@@ -34044,7 +34712,7 @@
         <w:pStyle w:val="Heading2"/>
       </w:pPr>
       <w:r>
-        <w:t>60.2. Migration Preflight</w:t>
+        <w:t>61.2. Migration Preflight</w:t>
       </w:r>
     </w:p>
     <w:p>
@@ -34113,7 +34781,7 @@
         <w:pStyle w:val="Heading2"/>
       </w:pPr>
       <w:r>
-        <w:t>60.3. Version Compatibility</w:t>
+        <w:t>61.3. Version Compatibility</w:t>
       </w:r>
     </w:p>
     <w:p>
@@ -34169,7 +34837,7 @@
         <w:pStyle w:val="Heading2"/>
       </w:pPr>
       <w:r>
-        <w:t>60.4. Production Update Procedure</w:t>
+        <w:t>61.4. Production Update Procedure</w:t>
       </w:r>
     </w:p>
     <w:p>
@@ -34225,7 +34893,7 @@
         <w:pStyle w:val="Heading2"/>
       </w:pPr>
       <w:r>
-        <w:t>60.5. Rollback Procedure</w:t>
+        <w:t>61.5. Rollback Procedure</w:t>
       </w:r>
     </w:p>
     <w:p>
@@ -34286,7 +34954,7 @@
         <w:pStyle w:val="Heading2"/>
       </w:pPr>
       <w:r>
-        <w:t>60.6. Post-Update Control</w:t>
+        <w:t>61.6. Post-Update Control</w:t>
       </w:r>
     </w:p>
     <w:p>
@@ -34363,7 +35031,7 @@
         <w:pStyle w:val="Heading2"/>
       </w:pPr>
       <w:r>
-        <w:t>60.7. Development Requirement</w:t>
+        <w:t>61.7. Development Requirement</w:t>
       </w:r>
     </w:p>
     <w:p>
@@ -34386,7 +35054,7 @@
         <w:pStyle w:val="Heading1"/>
       </w:pPr>
       <w:r>
-        <w:t>61. Release Management</w:t>
+        <w:t>62. Release Management</w:t>
       </w:r>
     </w:p>
     <w:p>
@@ -34399,7 +35067,7 @@
         <w:pStyle w:val="Heading2"/>
       </w:pPr>
       <w:r>
-        <w:t>61.1. Environments</w:t>
+        <w:t>62.1. Environments</w:t>
       </w:r>
     </w:p>
     <w:tbl>
@@ -34567,7 +35235,7 @@
         <w:pStyle w:val="Heading2"/>
       </w:pPr>
       <w:r>
-        <w:t>61.2. Release Requirements</w:t>
+        <w:t>62.2. Release Requirements</w:t>
       </w:r>
     </w:p>
     <w:p>
@@ -34655,7 +35323,7 @@
         <w:pStyle w:val="Heading2"/>
       </w:pPr>
       <w:r>
-        <w:t>61.3. Release Flow</w:t>
+        <w:t>62.3. Release Flow</w:t>
       </w:r>
     </w:p>
     <w:p>
@@ -34813,7 +35481,7 @@
         <w:pStyle w:val="Heading2"/>
       </w:pPr>
       <w:r>
-        <w:t>61.4. Production Update</w:t>
+        <w:t>62.4. Production Update</w:t>
       </w:r>
     </w:p>
     <w:p>
@@ -34826,21 +35494,7 @@
           <w:rFonts w:ascii="Courier New" w:hAnsi="Courier New"/>
           <w:sz w:val="17"/>
         </w:rPr>
-        <w:t>bash deploy/backup_postgres.sh</w:t>
-        <w:br/>
-        <w:t>git fetch --tags</w:t>
-        <w:br/>
-        <w:t>git checkout vX.Y.Z</w:t>
-        <w:br/>
-        <w:t>docker compose build</w:t>
-        <w:br/>
-        <w:t>docker compose run --rm api alembic upgrade head</w:t>
-        <w:br/>
-        <w:t>docker compose up -d</w:t>
-        <w:br/>
-        <w:t>curl https://your-domain.example/health</w:t>
-        <w:br/>
-        <w:t>curl https://your-domain.example/ready</w:t>
+        <w:t>ENV_FILE=.env bash deploy/deploy.sh production vX.Y.Z</w:t>
       </w:r>
     </w:p>
     <w:p>
@@ -34848,7 +35502,7 @@
         <w:pStyle w:val="Heading2"/>
       </w:pPr>
       <w:r>
-        <w:t>61.5. Rollback</w:t>
+        <w:t>62.5. Rollback</w:t>
       </w:r>
     </w:p>
     <w:p>
@@ -34856,7 +35510,7 @@
         <w:pStyle w:val="ListNumber"/>
       </w:pPr>
       <w:r>
-        <w:t>Stop intake with `intake_enabled=false`.</w:t>
+        <w:t>Stop intake with `intake_enabled=false` when publication behavior is affected.</w:t>
       </w:r>
     </w:p>
     <w:p>
@@ -34864,7 +35518,7 @@
         <w:pStyle w:val="ListNumber"/>
       </w:pPr>
       <w:r>
-        <w:t>Check out the previous stable tag.</w:t>
+        <w:t>Confirm the previous release is compatible with the current database schema.</w:t>
       </w:r>
     </w:p>
     <w:p>
@@ -34872,7 +35526,7 @@
         <w:pStyle w:val="ListNumber"/>
       </w:pPr>
       <w:r>
-        <w:t>Rebuild and restart containers.</w:t>
+        <w:t>Run `ENV_FILE=.env bash deploy/rollback.sh production &lt;ref&gt; --confirm`.</w:t>
       </w:r>
     </w:p>
     <w:p>
@@ -34880,7 +35534,7 @@
         <w:pStyle w:val="ListNumber"/>
       </w:pPr>
       <w:r>
-        <w:t>Restore the database backup if the failed release changed data incompatibly.</w:t>
+        <w:t>Restore a verified database backup only after a separate data-impact review.</w:t>
       </w:r>
     </w:p>
     <w:p>
@@ -34888,7 +35542,7 @@
         <w:pStyle w:val="ListNumber"/>
       </w:pPr>
       <w:r>
-        <w:t>Check health and readiness.</w:t>
+        <w:t>Check health, readiness, metrics, and key user scenarios.</w:t>
       </w:r>
     </w:p>
     <w:p>
@@ -34900,11 +35554,21 @@
       </w:r>
     </w:p>
     <w:p>
+      <w:r>
+        <w:t>The automation details and database downgrade restriction are documented in</w:t>
+      </w:r>
+    </w:p>
+    <w:p>
+      <w:r>
+        <w:t>CI/CD and Deployment Automation.</w:t>
+      </w:r>
+    </w:p>
+    <w:p>
       <w:pPr>
         <w:pStyle w:val="Heading2"/>
       </w:pPr>
       <w:r>
-        <w:t>61.6. API Compatibility</w:t>
+        <w:t>62.6. API Compatibility</w:t>
       </w:r>
     </w:p>
     <w:p>
@@ -34927,7 +35591,7 @@
         <w:pStyle w:val="Heading1"/>
       </w:pPr>
       <w:r>
-        <w:t>62. Change Acceptance Policy</w:t>
+        <w:t>63. Change Acceptance Policy</w:t>
       </w:r>
     </w:p>
     <w:p>
@@ -34940,7 +35604,7 @@
         <w:pStyle w:val="Heading2"/>
       </w:pPr>
       <w:r>
-        <w:t>62.1. Architectural Principles</w:t>
+        <w:t>63.1. Architectural Principles</w:t>
       </w:r>
     </w:p>
     <w:p>
@@ -35001,7 +35665,7 @@
         <w:pStyle w:val="Heading2"/>
       </w:pPr>
       <w:r>
-        <w:t>62.2. Change Acceptance Flow</w:t>
+        <w:t>63.2. Change Acceptance Flow</w:t>
       </w:r>
     </w:p>
     <w:p>
@@ -35111,7 +35775,7 @@
         <w:pStyle w:val="Heading2"/>
       </w:pPr>
       <w:r>
-        <w:t>62.3. Minimum Quality Criteria</w:t>
+        <w:t>63.3. Minimum Quality Criteria</w:t>
       </w:r>
     </w:p>
     <w:p>
@@ -35204,7 +35868,7 @@
         <w:pStyle w:val="Heading2"/>
       </w:pPr>
       <w:r>
-        <w:t>62.4. Regression Checks</w:t>
+        <w:t>63.4. Regression Checks</w:t>
       </w:r>
     </w:p>
     <w:p>
@@ -35286,7 +35950,7 @@
         <w:pStyle w:val="Heading2"/>
       </w:pPr>
       <w:r>
-        <w:t>62.5. Final Requirement</w:t>
+        <w:t>63.5. Final Requirement</w:t>
       </w:r>
     </w:p>
     <w:p>
@@ -35314,7 +35978,7 @@
         <w:pStyle w:val="Heading1"/>
       </w:pPr>
       <w:r>
-        <w:t>63. QA Test Data and Acceptance Scenarios</w:t>
+        <w:t>64. QA Test Data and Acceptance Scenarios</w:t>
       </w:r>
     </w:p>
     <w:p>
@@ -35332,7 +35996,7 @@
         <w:pStyle w:val="Heading2"/>
       </w:pPr>
       <w:r>
-        <w:t>63.1. Test Users</w:t>
+        <w:t>64.1. Test Users</w:t>
       </w:r>
     </w:p>
     <w:p>
@@ -35571,7 +36235,7 @@
         <w:pStyle w:val="Heading2"/>
       </w:pPr>
       <w:r>
-        <w:t>63.2. Acceptance Scenarios</w:t>
+        <w:t>64.2. Acceptance Scenarios</w:t>
       </w:r>
     </w:p>
     <w:p>
@@ -35579,7 +36243,7 @@
         <w:pStyle w:val="Heading3"/>
       </w:pPr>
       <w:r>
-        <w:t>63.2.1. New User Registration</w:t>
+        <w:t>64.2.1. New User Registration</w:t>
       </w:r>
     </w:p>
     <w:p>
@@ -35624,7 +36288,7 @@
         <w:pStyle w:val="Heading3"/>
       </w:pPr>
       <w:r>
-        <w:t>63.2.2. TikTok OAuth Connection</w:t>
+        <w:t>64.2.2. TikTok OAuth Connection</w:t>
       </w:r>
     </w:p>
     <w:p>
@@ -35669,7 +36333,7 @@
         <w:pStyle w:val="Heading3"/>
       </w:pPr>
       <w:r>
-        <w:t>63.2.3. Successful Video Publication</w:t>
+        <w:t>64.2.3. Successful Video Publication</w:t>
       </w:r>
     </w:p>
     <w:p>
@@ -35730,7 +36394,7 @@
         <w:pStyle w:val="Heading3"/>
       </w:pPr>
       <w:r>
-        <w:t>63.2.4. Daily Limit Exceeded</w:t>
+        <w:t>64.2.4. Daily Limit Exceeded</w:t>
       </w:r>
     </w:p>
     <w:p>
@@ -35775,7 +36439,7 @@
         <w:pStyle w:val="Heading3"/>
       </w:pPr>
       <w:r>
-        <w:t>63.2.5. PRO Purchase Through Robokassa</w:t>
+        <w:t>64.2.5. PRO Purchase Through Robokassa</w:t>
       </w:r>
     </w:p>
     <w:p>
@@ -35828,7 +36492,7 @@
         <w:pStyle w:val="Heading3"/>
       </w:pPr>
       <w:r>
-        <w:t>63.2.6. Automatic Return to FREE</w:t>
+        <w:t>64.2.6. Automatic Return to FREE</w:t>
       </w:r>
     </w:p>
     <w:p>
@@ -35873,7 +36537,7 @@
         <w:pStyle w:val="Heading3"/>
       </w:pPr>
       <w:r>
-        <w:t>63.2.7. Repeated Webhook</w:t>
+        <w:t>64.2.7. Repeated Webhook</w:t>
       </w:r>
     </w:p>
     <w:p>
@@ -35918,7 +36582,7 @@
         <w:pStyle w:val="Heading3"/>
       </w:pPr>
       <w:r>
-        <w:t>63.2.8. Temporary Queue Failure Recovery</w:t>
+        <w:t>64.2.8. Temporary Queue Failure Recovery</w:t>
       </w:r>
     </w:p>
     <w:p>
@@ -35963,7 +36627,7 @@
         <w:pStyle w:val="Heading2"/>
       </w:pPr>
       <w:r>
-        <w:t>63.3. Success Criteria</w:t>
+        <w:t>64.3. Success Criteria</w:t>
       </w:r>
     </w:p>
     <w:p>
@@ -36024,7 +36688,7 @@
         <w:pStyle w:val="Heading2"/>
       </w:pPr>
       <w:r>
-        <w:t>63.4. Release Rule</w:t>
+        <w:t>64.4. Release Rule</w:t>
       </w:r>
     </w:p>
     <w:p>
@@ -36047,7 +36711,7 @@
         <w:pStyle w:val="Heading1"/>
       </w:pPr>
       <w:r>
-        <w:t>64. Acceptance Checklist</w:t>
+        <w:t>65. Acceptance Checklist</w:t>
       </w:r>
     </w:p>
     <w:p>
@@ -36080,7 +36744,7 @@
         <w:pStyle w:val="Heading2"/>
       </w:pPr>
       <w:r>
-        <w:t>64.1. Functional Readiness</w:t>
+        <w:t>65.1. Functional Readiness</w:t>
       </w:r>
     </w:p>
     <w:p>
@@ -36240,7 +36904,7 @@
         <w:pStyle w:val="Heading2"/>
       </w:pPr>
       <w:r>
-        <w:t>64.2. Technical Readiness</w:t>
+        <w:t>65.2. Technical Readiness</w:t>
       </w:r>
     </w:p>
     <w:p>
@@ -36296,6 +36960,14 @@
         <w:pStyle w:val="ListBullet"/>
       </w:pPr>
       <w:r>
+        <w:t>CI verifies Bash scripts with ShellCheck and confirms the application image runs as `appuser`.</w:t>
+      </w:r>
+    </w:p>
+    <w:p>
+      <w:pPr>
+        <w:pStyle w:val="ListBullet"/>
+      </w:pPr>
+      <w:r>
         <w:t>`.env` files are not committed.</w:t>
       </w:r>
     </w:p>
@@ -36400,7 +37072,7 @@
         <w:pStyle w:val="Heading2"/>
       </w:pPr>
       <w:r>
-        <w:t>64.3. Operational Readiness</w:t>
+        <w:t>65.3. Operational Readiness</w:t>
       </w:r>
     </w:p>
     <w:p>
@@ -36448,6 +37120,22 @@
         <w:pStyle w:val="ListBullet"/>
       </w:pPr>
       <w:r>
+        <w:t>Backup checksum/metadata and `pg_restore --list` verification are present.</w:t>
+      </w:r>
+    </w:p>
+    <w:p>
+      <w:pPr>
+        <w:pStyle w:val="ListBullet"/>
+      </w:pPr>
+      <w:r>
+        <w:t>Automated deployment and application rollback smoke tests pass in staging.</w:t>
+      </w:r>
+    </w:p>
+    <w:p>
+      <w:pPr>
+        <w:pStyle w:val="ListBullet"/>
+      </w:pPr>
+      <w:r>
         <w:t>Backup and restore policy is documented and current.</w:t>
       </w:r>
     </w:p>
@@ -36520,7 +37208,7 @@
         <w:pStyle w:val="Heading2"/>
       </w:pPr>
       <w:r>
-        <w:t>64.4. Final Sign-Off</w:t>
+        <w:t>65.4. Final Sign-Off</w:t>
       </w:r>
     </w:p>
     <w:p>
@@ -36568,7 +37256,7 @@
         <w:pStyle w:val="Heading1"/>
       </w:pPr>
       <w:r>
-        <w:t>65. Requirements Traceability Matrix</w:t>
+        <w:t>66. Requirements Traceability Matrix</w:t>
       </w:r>
     </w:p>
     <w:p>
@@ -36581,7 +37269,7 @@
         <w:pStyle w:val="Heading2"/>
       </w:pPr>
       <w:r>
-        <w:t>65.1. Purpose</w:t>
+        <w:t>66.1. Purpose</w:t>
       </w:r>
     </w:p>
     <w:p>
@@ -36594,7 +37282,7 @@
         <w:pStyle w:val="Heading2"/>
       </w:pPr>
       <w:r>
-        <w:t>65.2. Initial Matrix</w:t>
+        <w:t>66.2. Initial Matrix</w:t>
       </w:r>
     </w:p>
     <w:tbl>
@@ -38069,7 +38757,7 @@
         <w:pStyle w:val="Heading2"/>
       </w:pPr>
       <w:r>
-        <w:t>65.3. Maintenance Rules</w:t>
+        <w:t>66.3. Maintenance Rules</w:t>
       </w:r>
     </w:p>
     <w:p>
@@ -38125,7 +38813,7 @@
         <w:pStyle w:val="Heading2"/>
       </w:pPr>
       <w:r>
-        <w:t>65.4. Completion Criterion</w:t>
+        <w:t>66.4. Completion Criterion</w:t>
       </w:r>
     </w:p>
     <w:p>
@@ -38148,7 +38836,7 @@
         <w:pStyle w:val="Heading1"/>
       </w:pPr>
       <w:r>
-        <w:t>66. Glossary and Naming Conventions</w:t>
+        <w:t>67. Glossary and Naming Conventions</w:t>
       </w:r>
     </w:p>
     <w:p>
@@ -38161,7 +38849,7 @@
         <w:pStyle w:val="Heading2"/>
       </w:pPr>
       <w:r>
-        <w:t>66.1. Glossary</w:t>
+        <w:t>67.1. Glossary</w:t>
       </w:r>
     </w:p>
     <w:tbl>
@@ -38588,7 +39276,7 @@
         <w:pStyle w:val="Heading2"/>
       </w:pPr>
       <w:r>
-        <w:t>66.2. Naming Conventions</w:t>
+        <w:t>67.2. Naming Conventions</w:t>
       </w:r>
     </w:p>
     <w:p>
@@ -38652,7 +39340,7 @@
         <w:pStyle w:val="Heading2"/>
       </w:pPr>
       <w:r>
-        <w:t>66.3. Entity Names</w:t>
+        <w:t>67.3. Entity Names</w:t>
       </w:r>
     </w:p>
     <w:p>
@@ -39084,7 +39772,7 @@
         <w:pStyle w:val="Heading2"/>
       </w:pPr>
       <w:r>
-        <w:t>66.4. Consistency Rule</w:t>
+        <w:t>67.4. Consistency Rule</w:t>
       </w:r>
     </w:p>
     <w:p>
@@ -39112,7 +39800,7 @@
         <w:pStyle w:val="Heading1"/>
       </w:pPr>
       <w:r>
-        <w:t>67. Specification Index</w:t>
+        <w:t>68. Specification Index</w:t>
       </w:r>
     </w:p>
     <w:p>
@@ -39130,7 +39818,7 @@
         <w:pStyle w:val="Heading2"/>
       </w:pPr>
       <w:r>
-        <w:t>67.1. Purpose</w:t>
+        <w:t>68.1. Purpose</w:t>
       </w:r>
     </w:p>
     <w:p>
@@ -39191,7 +39879,7 @@
         <w:pStyle w:val="Heading2"/>
       </w:pPr>
       <w:r>
-        <w:t>67.2. Core Specification Groups</w:t>
+        <w:t>68.2. Core Specification Groups</w:t>
       </w:r>
     </w:p>
     <w:tbl>
@@ -39585,7 +40273,7 @@
         <w:pStyle w:val="Heading2"/>
       </w:pPr>
       <w:r>
-        <w:t>67.3. Documentation Maintenance Rules</w:t>
+        <w:t>68.3. Documentation Maintenance Rules</w:t>
       </w:r>
     </w:p>
     <w:p>
@@ -39649,7 +40337,7 @@
         <w:pStyle w:val="Heading2"/>
       </w:pPr>
       <w:r>
-        <w:t>67.4. Completeness Control</w:t>
+        <w:t>68.4. Completeness Control</w:t>
       </w:r>
     </w:p>
     <w:p>
@@ -39750,7 +40438,7 @@
         <w:pStyle w:val="Heading2"/>
       </w:pPr>
       <w:r>
-        <w:t>67.5. Release Rule</w:t>
+        <w:t>68.5. Release Rule</w:t>
       </w:r>
     </w:p>
     <w:p>
@@ -39763,7 +40451,7 @@
         <w:pStyle w:val="Heading2"/>
       </w:pPr>
       <w:r>
-        <w:t>67.6. Final Statement</w:t>
+        <w:t>68.6. Final Statement</w:t>
       </w:r>
     </w:p>
     <w:p>
@@ -39786,7 +40474,7 @@
         <w:pStyle w:val="Heading1"/>
       </w:pPr>
       <w:r>
-        <w:t>68. Risk Management</w:t>
+        <w:t>69. Risk Management</w:t>
       </w:r>
     </w:p>
     <w:p>
@@ -39799,7 +40487,7 @@
         <w:pStyle w:val="Heading2"/>
       </w:pPr>
       <w:r>
-        <w:t>68.1. Operational Constraints</w:t>
+        <w:t>69.1. Operational Constraints</w:t>
       </w:r>
     </w:p>
     <w:p>
@@ -39847,7 +40535,7 @@
         <w:pStyle w:val="Heading2"/>
       </w:pPr>
       <w:r>
-        <w:t>68.2. Risk Register</w:t>
+        <w:t>69.2. Risk Register</w:t>
       </w:r>
     </w:p>
     <w:tbl>
@@ -40175,7 +40863,7 @@
         <w:pStyle w:val="Heading2"/>
       </w:pPr>
       <w:r>
-        <w:t>68.3. Change Control</w:t>
+        <w:t>69.3. Change Control</w:t>
       </w:r>
     </w:p>
     <w:p>
@@ -40244,7 +40932,7 @@
         <w:pStyle w:val="Heading2"/>
       </w:pPr>
       <w:r>
-        <w:t>68.4. Resilience Criteria</w:t>
+        <w:t>69.4. Resilience Criteria</w:t>
       </w:r>
     </w:p>
     <w:p>

</xml_diff>

<commit_message>
test: expand release acceptance coverage
</commit_message>
<xml_diff>
--- a/docs/final/Tik_Tok_Loader_Unified_Specification.docx
+++ b/docs/final/Tik_Tok_Loader_Unified_Specification.docx
@@ -39,7 +39,7 @@
         <w:jc w:val="center"/>
       </w:pPr>
       <w:r>
-        <w:t>Версия: 0.5.0</w:t>
+        <w:t>Версия: 0.6.0</w:t>
         <w:br/>
         <w:t>Репозиторий: kredavto/Tik-Tok-bot-Rus-2</w:t>
         <w:br/>
@@ -3036,7 +3036,35 @@
         <w:pStyle w:val="Heading2"/>
       </w:pPr>
       <w:r>
-        <w:t>5.2. Control Points</w:t>
+        <w:t>5.2. Current Status</w:t>
+      </w:r>
+    </w:p>
+    <w:p>
+      <w:r>
+        <w:t>Current implementation status: stages 1 through 9 are represented in the repository and automated</w:t>
+      </w:r>
+    </w:p>
+    <w:p>
+      <w:r>
+        <w:t>quality gates. Stage 9 is complete at code and CI configuration level; external acceptance evidence</w:t>
+      </w:r>
+    </w:p>
+    <w:p>
+      <w:r>
+        <w:t>is intentionally deferred to staging. Stage 10 remains pending until production credentials,</w:t>
+      </w:r>
+    </w:p>
+    <w:p>
+      <w:r>
+        <w:t>approved provider applications, domain, HTTPS, backup destination, and server access are available.</w:t>
+      </w:r>
+    </w:p>
+    <w:p>
+      <w:pPr>
+        <w:pStyle w:val="Heading2"/>
+      </w:pPr>
+      <w:r>
+        <w:t>5.3. Control Points</w:t>
       </w:r>
     </w:p>
     <w:p>
@@ -3121,7 +3149,7 @@
         <w:pStyle w:val="Heading2"/>
       </w:pPr>
       <w:r>
-        <w:t>5.3. Final Rule</w:t>
+        <w:t>5.4. Final Rule</w:t>
       </w:r>
     </w:p>
     <w:p>
@@ -22827,12 +22855,12 @@
         <w:pStyle w:val="ListBullet"/>
       </w:pPr>
       <w:r>
-        <w:t>`Quality and security`: Ruff formatting and linting, MyPy, Bash syntax, ShellCheck, and secret</w:t>
-      </w:r>
-    </w:p>
-    <w:p>
-      <w:r>
-        <w:t xml:space="preserve">   scanning.</w:t>
+        <w:t>`Quality and security`: Ruff formatting and linting, MyPy, OpenAPI contract validation, Python</w:t>
+      </w:r>
+    </w:p>
+    <w:p>
+      <w:r>
+        <w:t xml:space="preserve">  bytecode compilation, Bash syntax, ShellCheck, and secret scanning.</w:t>
       </w:r>
     </w:p>
     <w:p>
@@ -22845,7 +22873,12 @@
     </w:p>
     <w:p>
       <w:r>
-        <w:t xml:space="preserve">   downgrade-to-base/upgrade verification on a disposable database, and the full test suite.</w:t>
+        <w:t xml:space="preserve">  downgrade-to-base/upgrade verification on a disposable database, the full test suite, XML</w:t>
+      </w:r>
+    </w:p>
+    <w:p>
+      <w:r>
+        <w:t xml:space="preserve">  coverage output, and a 45% project coverage floor.</w:t>
       </w:r>
     </w:p>
     <w:p>
@@ -23183,6 +23216,16 @@
     <w:p>
       <w:r>
         <w:t>change the deployment procedure.</w:t>
+      </w:r>
+    </w:p>
+    <w:p>
+      <w:r>
+        <w:t>The full automated test-layer map and external acceptance boundary are documented in</w:t>
+      </w:r>
+    </w:p>
+    <w:p>
+      <w:r>
+        <w:t>Test Strategy and Quality Gates.</w:t>
       </w:r>
     </w:p>
     <w:p>
@@ -36243,7 +36286,12 @@
         <w:pStyle w:val="Heading3"/>
       </w:pPr>
       <w:r>
-        <w:t>64.2.1. New User Registration</w:t>
+        <w:t>64.2.1. QA-REG-001: New User Registration</w:t>
+      </w:r>
+    </w:p>
+    <w:p>
+      <w:r>
+        <w:t>Automation: implemented in `tests/test_subscriptions.py` and `tests/test_bot_fsm.py`.</w:t>
       </w:r>
     </w:p>
     <w:p>
@@ -36288,7 +36336,17 @@
         <w:pStyle w:val="Heading3"/>
       </w:pPr>
       <w:r>
-        <w:t>64.2.2. TikTok OAuth Connection</w:t>
+        <w:t>64.2.2. QA-OAUTH-001: TikTok OAuth Connection</w:t>
+      </w:r>
+    </w:p>
+    <w:p>
+      <w:r>
+        <w:t>Automation: OAuth state, URL, signature, and encrypted storage paths are covered. Final provider</w:t>
+      </w:r>
+    </w:p>
+    <w:p>
+      <w:r>
+        <w:t>authorization remains a staging check.</w:t>
       </w:r>
     </w:p>
     <w:p>
@@ -36333,7 +36391,17 @@
         <w:pStyle w:val="Heading3"/>
       </w:pPr>
       <w:r>
-        <w:t>64.2.3. Successful Video Publication</w:t>
+        <w:t>64.2.3. QA-UPL-001: Successful Video Publication</w:t>
+      </w:r>
+    </w:p>
+    <w:p>
+      <w:r>
+        <w:t>Automation: video validation, FSM options, queue locking, TikTok client mocks, and status history</w:t>
+      </w:r>
+    </w:p>
+    <w:p>
+      <w:r>
+        <w:t>are covered. Final publication through an approved TikTok application remains a staging check.</w:t>
       </w:r>
     </w:p>
     <w:p>
@@ -36394,7 +36462,12 @@
         <w:pStyle w:val="Heading3"/>
       </w:pPr>
       <w:r>
-        <w:t>64.2.4. Daily Limit Exceeded</w:t>
+        <w:t>64.2.4. QA-LIMIT-001: Daily Limit Exceeded</w:t>
+      </w:r>
+    </w:p>
+    <w:p>
+      <w:r>
+        <w:t>Automation: implemented in `tests/test_subscriptions.py`, including concurrent first-use checks.</w:t>
       </w:r>
     </w:p>
     <w:p>
@@ -36439,7 +36512,17 @@
         <w:pStyle w:val="Heading3"/>
       </w:pPr>
       <w:r>
-        <w:t>64.2.5. PRO Purchase Through Robokassa</w:t>
+        <w:t>64.2.5. QA-PAY-001: PRO Purchase Through Robokassa</w:t>
+      </w:r>
+    </w:p>
+    <w:p>
+      <w:r>
+        <w:t>Automation: signature, order creation, amount validation, and duplicate ResultURL activation are</w:t>
+      </w:r>
+    </w:p>
+    <w:p>
+      <w:r>
+        <w:t>covered. A Robokassa test-mode round trip remains a staging check.</w:t>
       </w:r>
     </w:p>
     <w:p>
@@ -36492,7 +36575,12 @@
         <w:pStyle w:val="Heading3"/>
       </w:pPr>
       <w:r>
-        <w:t>64.2.6. Automatic Return to FREE</w:t>
+        <w:t>64.2.6. QA-SUB-001: Automatic Return to FREE</w:t>
+      </w:r>
+    </w:p>
+    <w:p>
+      <w:r>
+        <w:t>Automation: implemented in `tests/test_subscriptions.py`.</w:t>
       </w:r>
     </w:p>
     <w:p>
@@ -36537,7 +36625,17 @@
         <w:pStyle w:val="Heading3"/>
       </w:pPr>
       <w:r>
-        <w:t>64.2.7. Repeated Webhook</w:t>
+        <w:t>64.2.7. QA-WEBHOOK-001: Repeated Webhook</w:t>
+      </w:r>
+    </w:p>
+    <w:p>
+      <w:r>
+        <w:t>Automation: payment idempotency and webhook signature rejection are covered. Provider redelivery</w:t>
+      </w:r>
+    </w:p>
+    <w:p>
+      <w:r>
+        <w:t>is also checked during staging acceptance.</w:t>
       </w:r>
     </w:p>
     <w:p>
@@ -36582,7 +36680,17 @@
         <w:pStyle w:val="Heading3"/>
       </w:pPr>
       <w:r>
-        <w:t>64.2.8. Temporary Queue Failure Recovery</w:t>
+        <w:t>64.2.8. QA-QUEUE-001: Temporary Queue Failure Recovery</w:t>
+      </w:r>
+    </w:p>
+    <w:p>
+      <w:r>
+        <w:t>Automation: scheduler lease recovery, worker lock exclusion, and bounded TikTok chunk retries are</w:t>
+      </w:r>
+    </w:p>
+    <w:p>
+      <w:r>
+        <w:t>covered.</w:t>
       </w:r>
     </w:p>
     <w:p>
@@ -36711,7 +36819,7 @@
         <w:pStyle w:val="Heading1"/>
       </w:pPr>
       <w:r>
-        <w:t>65. Acceptance Checklist</w:t>
+        <w:t>65. Test Strategy and Quality Gates</w:t>
       </w:r>
     </w:p>
     <w:p>
@@ -36721,22 +36829,17 @@
     </w:p>
     <w:p>
       <w:r>
-        <w:t>Final implementation must satisfy Architecture Summary.</w:t>
-      </w:r>
-    </w:p>
-    <w:p>
-      <w:r>
-        <w:t>Non-functional requirements must be validated according to Non-Functional Requirements.</w:t>
-      </w:r>
-    </w:p>
-    <w:p>
-      <w:r>
-        <w:t>Documentation completeness must be checked against Specification Index.</w:t>
-      </w:r>
-    </w:p>
-    <w:p>
-      <w:r>
-        <w:t>Implementation progress must be checked against Implementation Roadmap.</w:t>
+        <w:t>This document defines the automated test layers, release evidence, and staging checks for</w:t>
+      </w:r>
+    </w:p>
+    <w:p>
+      <w:r>
+        <w:t>Tik_Tok_Loader. Detailed business scenarios are maintained in</w:t>
+      </w:r>
+    </w:p>
+    <w:p>
+      <w:r>
+        <w:t>QA Test Data and Acceptance Scenarios.</w:t>
       </w:r>
     </w:p>
     <w:p>
@@ -36744,327 +36847,551 @@
         <w:pStyle w:val="Heading2"/>
       </w:pPr>
       <w:r>
-        <w:t>65.1. Functional Readiness</w:t>
-      </w:r>
-    </w:p>
-    <w:p>
-      <w:pPr>
-        <w:pStyle w:val="ListBullet"/>
-      </w:pPr>
-      <w:r>
-        <w:t>New Telegram user registration works.</w:t>
-      </w:r>
-    </w:p>
-    <w:p>
-      <w:pPr>
-        <w:pStyle w:val="ListBullet"/>
-      </w:pPr>
-      <w:r>
-        <w:t>FREE plan is assigned automatically.</w:t>
-      </w:r>
-    </w:p>
-    <w:p>
-      <w:pPr>
-        <w:pStyle w:val="ListBullet"/>
-      </w:pPr>
-      <w:r>
-        <w:t>User agreement flow works.</w:t>
-      </w:r>
-    </w:p>
-    <w:p>
-      <w:pPr>
-        <w:pStyle w:val="ListBullet"/>
-      </w:pPr>
-      <w:r>
-        <w:t>TikTok OAuth 2.0 connection uses the official TikTok authorization flow.</w:t>
-      </w:r>
-    </w:p>
-    <w:p>
-      <w:pPr>
-        <w:pStyle w:val="ListBullet"/>
-      </w:pPr>
-      <w:r>
-        <w:t>TikTok OAuth tokens are encrypted in storage.</w:t>
-      </w:r>
-    </w:p>
-    <w:p>
-      <w:pPr>
-        <w:pStyle w:val="ListBullet"/>
-      </w:pPr>
-      <w:r>
-        <w:t>Video upload FSM works: video, description, hashtags, confirmation.</w:t>
-      </w:r>
-    </w:p>
-    <w:p>
-      <w:pPr>
-        <w:pStyle w:val="ListBullet"/>
-      </w:pPr>
-      <w:r>
-        <w:t>Video validation and preparation work for MP4, MOV, and WEBM.</w:t>
-      </w:r>
-    </w:p>
-    <w:p>
-      <w:pPr>
-        <w:pStyle w:val="ListBullet"/>
-      </w:pPr>
-      <w:r>
-        <w:t>Upload lifecycle events are recorded.</w:t>
-      </w:r>
-    </w:p>
-    <w:p>
-      <w:pPr>
-        <w:pStyle w:val="ListBullet"/>
-      </w:pPr>
-      <w:r>
-        <w:t>FREE, PRO, and BUSINESS limits match the specification.</w:t>
-      </w:r>
-    </w:p>
-    <w:p>
-      <w:pPr>
-        <w:pStyle w:val="ListBullet"/>
-      </w:pPr>
-      <w:r>
-        <w:t>Robokassa payment link generation works for PRO and BUSINESS.</w:t>
-      </w:r>
-    </w:p>
-    <w:p>
-      <w:pPr>
-        <w:pStyle w:val="ListBullet"/>
-      </w:pPr>
-      <w:r>
-        <w:t>Robokassa ResultURL activates paid subscriptions.</w:t>
-      </w:r>
-    </w:p>
-    <w:p>
-      <w:pPr>
-        <w:pStyle w:val="ListBullet"/>
-      </w:pPr>
-      <w:r>
-        <w:t>SuccessURL does not activate subscriptions.</w:t>
-      </w:r>
-    </w:p>
-    <w:p>
-      <w:pPr>
-        <w:pStyle w:val="ListBullet"/>
-      </w:pPr>
-      <w:r>
-        <w:t>Expired paid subscriptions return to FREE and produce one pending user notification.</w:t>
-      </w:r>
-    </w:p>
-    <w:p>
-      <w:pPr>
-        <w:pStyle w:val="ListBullet"/>
-      </w:pPr>
-      <w:r>
-        <w:t>User can disconnect TikTok.</w:t>
-      </w:r>
-    </w:p>
-    <w:p>
-      <w:pPr>
-        <w:pStyle w:val="ListBullet"/>
-      </w:pPr>
-      <w:r>
-        <w:t>Admin console is available only through HTTPS in production.</w:t>
-      </w:r>
-    </w:p>
-    <w:p>
-      <w:pPr>
-        <w:pStyle w:val="ListBullet"/>
-      </w:pPr>
-      <w:r>
-        <w:t>SUPPORT, ADMIN, and SUPER_ADMIN see only server-authorized operations.</w:t>
-      </w:r>
-    </w:p>
-    <w:p>
-      <w:pPr>
-        <w:pStyle w:val="ListBullet"/>
-      </w:pPr>
-      <w:r>
-        <w:t>User detail never returns encrypted or decrypted TikTok OAuth tokens.</w:t>
-      </w:r>
-    </w:p>
-    <w:p>
-      <w:pPr>
-        <w:pStyle w:val="ListBullet"/>
-      </w:pPr>
-      <w:r>
-        <w:t>User blocking, FREE fallback, plan changes, settings changes, role changes, and safe retries are audited.</w:t>
-      </w:r>
-    </w:p>
-    <w:p>
-      <w:pPr>
-        <w:pStyle w:val="ListBullet"/>
-      </w:pPr>
-      <w:r>
-        <w:t>Only eligible temporary publication failures can be manually retried.</w:t>
-      </w:r>
-    </w:p>
+        <w:t>65.1. Test Layers</w:t>
+      </w:r>
+    </w:p>
+    <w:tbl>
+      <w:tblPr>
+        <w:tblStyle w:val="TableGrid"/>
+        <w:tblW w:type="dxa" w:w="9360"/>
+        <w:jc w:val="left"/>
+        <w:tblLayout w:type="fixed"/>
+        <w:tblLook w:firstColumn="1" w:firstRow="1" w:lastColumn="0" w:lastRow="0" w:noHBand="0" w:noVBand="1" w:val="04A0"/>
+      </w:tblPr>
+      <w:tblGrid>
+        <w:gridCol w:w="3120"/>
+        <w:gridCol w:w="3120"/>
+        <w:gridCol w:w="3120"/>
+      </w:tblGrid>
+      <w:tr>
+        <w:trPr>
+          <w:cantSplit/>
+          <w:tblHeader/>
+        </w:trPr>
+        <w:tc>
+          <w:tcPr>
+            <w:tcW w:type="dxa" w:w="2200"/>
+            <w:shd w:fill="E8EEF5"/>
+            <w:vAlign w:val="center"/>
+          </w:tcPr>
+          <w:p>
+            <w:pPr>
+              <w:spacing w:after="0" w:line="252" w:lineRule="auto"/>
+            </w:pPr>
+            <w:r>
+              <w:rPr>
+                <w:b/>
+              </w:rPr>
+              <w:t>Layer</w:t>
+            </w:r>
+          </w:p>
+        </w:tc>
+        <w:tc>
+          <w:tcPr>
+            <w:tcW w:type="dxa" w:w="2960"/>
+            <w:shd w:fill="E8EEF5"/>
+            <w:vAlign w:val="center"/>
+          </w:tcPr>
+          <w:p>
+            <w:pPr>
+              <w:spacing w:after="0" w:line="252" w:lineRule="auto"/>
+            </w:pPr>
+            <w:r>
+              <w:rPr>
+                <w:b/>
+              </w:rPr>
+              <w:t>Scope</w:t>
+            </w:r>
+          </w:p>
+        </w:tc>
+        <w:tc>
+          <w:tcPr>
+            <w:tcW w:type="dxa" w:w="4200"/>
+            <w:shd w:fill="E8EEF5"/>
+            <w:vAlign w:val="center"/>
+          </w:tcPr>
+          <w:p>
+            <w:pPr>
+              <w:spacing w:after="0" w:line="252" w:lineRule="auto"/>
+            </w:pPr>
+            <w:r>
+              <w:rPr>
+                <w:b/>
+              </w:rPr>
+              <w:t>Primary Evidence</w:t>
+            </w:r>
+          </w:p>
+        </w:tc>
+      </w:tr>
+      <w:tr>
+        <w:trPr>
+          <w:cantSplit/>
+        </w:trPr>
+        <w:tc>
+          <w:tcPr>
+            <w:tcW w:type="dxa" w:w="2200"/>
+            <w:vAlign w:val="center"/>
+          </w:tcPr>
+          <w:p>
+            <w:pPr>
+              <w:spacing w:after="0" w:line="252" w:lineRule="auto"/>
+            </w:pPr>
+            <w:r>
+              <w:t>Unit</w:t>
+            </w:r>
+          </w:p>
+        </w:tc>
+        <w:tc>
+          <w:tcPr>
+            <w:tcW w:type="dxa" w:w="2960"/>
+            <w:vAlign w:val="center"/>
+          </w:tcPr>
+          <w:p>
+            <w:pPr>
+              <w:spacing w:after="0" w:line="252" w:lineRule="auto"/>
+            </w:pPr>
+            <w:r>
+              <w:t>Plans, RBAC, configuration, signatures, encryption, status transitions, localization</w:t>
+            </w:r>
+          </w:p>
+        </w:tc>
+        <w:tc>
+          <w:tcPr>
+            <w:tcW w:type="dxa" w:w="4200"/>
+            <w:vAlign w:val="center"/>
+          </w:tcPr>
+          <w:p>
+            <w:pPr>
+              <w:spacing w:after="0" w:line="252" w:lineRule="auto"/>
+            </w:pPr>
+            <w:r>
+              <w:t>`tests/test_plans.py`, `tests/test_rbac.py`, `tests/test_configuration.py`, `tests/test_security_crypto.py`</w:t>
+            </w:r>
+          </w:p>
+        </w:tc>
+      </w:tr>
+      <w:tr>
+        <w:trPr>
+          <w:cantSplit/>
+        </w:trPr>
+        <w:tc>
+          <w:tcPr>
+            <w:tcW w:type="dxa" w:w="2200"/>
+            <w:vAlign w:val="center"/>
+          </w:tcPr>
+          <w:p>
+            <w:pPr>
+              <w:spacing w:after="0" w:line="252" w:lineRule="auto"/>
+            </w:pPr>
+            <w:r>
+              <w:t>Bot FSM</w:t>
+            </w:r>
+          </w:p>
+        </w:tc>
+        <w:tc>
+          <w:tcPr>
+            <w:tcW w:type="dxa" w:w="2960"/>
+            <w:vAlign w:val="center"/>
+          </w:tcPr>
+          <w:p>
+            <w:pPr>
+              <w:spacing w:after="0" w:line="252" w:lineRule="auto"/>
+            </w:pPr>
+            <w:r>
+              <w:t>Description, hashtags, creator constraints, privacy, commercial content, cancellation</w:t>
+            </w:r>
+          </w:p>
+        </w:tc>
+        <w:tc>
+          <w:tcPr>
+            <w:tcW w:type="dxa" w:w="4200"/>
+            <w:vAlign w:val="center"/>
+          </w:tcPr>
+          <w:p>
+            <w:pPr>
+              <w:spacing w:after="0" w:line="252" w:lineRule="auto"/>
+            </w:pPr>
+            <w:r>
+              <w:t>`tests/test_bot_fsm.py`</w:t>
+            </w:r>
+          </w:p>
+        </w:tc>
+      </w:tr>
+      <w:tr>
+        <w:trPr>
+          <w:cantSplit/>
+        </w:trPr>
+        <w:tc>
+          <w:tcPr>
+            <w:tcW w:type="dxa" w:w="2200"/>
+            <w:vAlign w:val="center"/>
+          </w:tcPr>
+          <w:p>
+            <w:pPr>
+              <w:spacing w:after="0" w:line="252" w:lineRule="auto"/>
+            </w:pPr>
+            <w:r>
+              <w:t>API and contracts</w:t>
+            </w:r>
+          </w:p>
+        </w:tc>
+        <w:tc>
+          <w:tcPr>
+            <w:tcW w:type="dxa" w:w="2960"/>
+            <w:vAlign w:val="center"/>
+          </w:tcPr>
+          <w:p>
+            <w:pPr>
+              <w:spacing w:after="0" w:line="252" w:lineRule="auto"/>
+            </w:pPr>
+            <w:r>
+              <w:t>Health, tracing headers, safe errors, OAuth state validation, webhook rejection, OpenAPI paths</w:t>
+            </w:r>
+          </w:p>
+        </w:tc>
+        <w:tc>
+          <w:tcPr>
+            <w:tcW w:type="dxa" w:w="4200"/>
+            <w:vAlign w:val="center"/>
+          </w:tcPr>
+          <w:p>
+            <w:pPr>
+              <w:spacing w:after="0" w:line="252" w:lineRule="auto"/>
+            </w:pPr>
+            <w:r>
+              <w:t>`tests/test_api_integration.py`, `tools/check_openapi.py`</w:t>
+            </w:r>
+          </w:p>
+        </w:tc>
+      </w:tr>
+      <w:tr>
+        <w:trPr>
+          <w:cantSplit/>
+        </w:trPr>
+        <w:tc>
+          <w:tcPr>
+            <w:tcW w:type="dxa" w:w="2200"/>
+            <w:vAlign w:val="center"/>
+          </w:tcPr>
+          <w:p>
+            <w:pPr>
+              <w:spacing w:after="0" w:line="252" w:lineRule="auto"/>
+            </w:pPr>
+            <w:r>
+              <w:t>Video and TikTok client</w:t>
+            </w:r>
+          </w:p>
+        </w:tc>
+        <w:tc>
+          <w:tcPr>
+            <w:tcW w:type="dxa" w:w="2960"/>
+            <w:vAlign w:val="center"/>
+          </w:tcPr>
+          <w:p>
+            <w:pPr>
+              <w:spacing w:after="0" w:line="252" w:lineRule="auto"/>
+            </w:pPr>
+            <w:r>
+              <w:t>File signatures, duration, cleanup, chunk planning, retries, creator info, webhook HMAC</w:t>
+            </w:r>
+          </w:p>
+        </w:tc>
+        <w:tc>
+          <w:tcPr>
+            <w:tcW w:type="dxa" w:w="4200"/>
+            <w:vAlign w:val="center"/>
+          </w:tcPr>
+          <w:p>
+            <w:pPr>
+              <w:spacing w:after="0" w:line="252" w:lineRule="auto"/>
+            </w:pPr>
+            <w:r>
+              <w:t>`tests/test_video_service.py`, `tests/test_tiktok_service.py`</w:t>
+            </w:r>
+          </w:p>
+        </w:tc>
+      </w:tr>
+      <w:tr>
+        <w:trPr>
+          <w:cantSplit/>
+        </w:trPr>
+        <w:tc>
+          <w:tcPr>
+            <w:tcW w:type="dxa" w:w="2200"/>
+            <w:vAlign w:val="center"/>
+          </w:tcPr>
+          <w:p>
+            <w:pPr>
+              <w:spacing w:after="0" w:line="252" w:lineRule="auto"/>
+            </w:pPr>
+            <w:r>
+              <w:t>Queue resilience</w:t>
+            </w:r>
+          </w:p>
+        </w:tc>
+        <w:tc>
+          <w:tcPr>
+            <w:tcW w:type="dxa" w:w="2960"/>
+            <w:vAlign w:val="center"/>
+          </w:tcPr>
+          <w:p>
+            <w:pPr>
+              <w:spacing w:after="0" w:line="252" w:lineRule="auto"/>
+            </w:pPr>
+            <w:r>
+              <w:t>Distributed job lock and scheduler lease idempotency</w:t>
+            </w:r>
+          </w:p>
+        </w:tc>
+        <w:tc>
+          <w:tcPr>
+            <w:tcW w:type="dxa" w:w="4200"/>
+            <w:vAlign w:val="center"/>
+          </w:tcPr>
+          <w:p>
+            <w:pPr>
+              <w:spacing w:after="0" w:line="252" w:lineRule="auto"/>
+            </w:pPr>
+            <w:r>
+              <w:t>`tests/test_worker_resilience.py`, `tests/test_scheduler.py`</w:t>
+            </w:r>
+          </w:p>
+        </w:tc>
+      </w:tr>
+      <w:tr>
+        <w:trPr>
+          <w:cantSplit/>
+        </w:trPr>
+        <w:tc>
+          <w:tcPr>
+            <w:tcW w:type="dxa" w:w="2200"/>
+            <w:vAlign w:val="center"/>
+          </w:tcPr>
+          <w:p>
+            <w:pPr>
+              <w:spacing w:after="0" w:line="252" w:lineRule="auto"/>
+            </w:pPr>
+            <w:r>
+              <w:t>PostgreSQL integration</w:t>
+            </w:r>
+          </w:p>
+        </w:tc>
+        <w:tc>
+          <w:tcPr>
+            <w:tcW w:type="dxa" w:w="2960"/>
+            <w:vAlign w:val="center"/>
+          </w:tcPr>
+          <w:p>
+            <w:pPr>
+              <w:spacing w:after="0" w:line="252" w:lineRule="auto"/>
+            </w:pPr>
+            <w:r>
+              <w:t>Registration, plans, daily limits, payment confirmation, subscription expiry, upload event history</w:t>
+            </w:r>
+          </w:p>
+        </w:tc>
+        <w:tc>
+          <w:tcPr>
+            <w:tcW w:type="dxa" w:w="4200"/>
+            <w:vAlign w:val="center"/>
+          </w:tcPr>
+          <w:p>
+            <w:pPr>
+              <w:spacing w:after="0" w:line="252" w:lineRule="auto"/>
+            </w:pPr>
+            <w:r>
+              <w:t>`tests/test_subscriptions.py`, `tests/test_robokassa.py`, `tests/test_upload_lifecycle_integration.py`</w:t>
+            </w:r>
+          </w:p>
+        </w:tc>
+      </w:tr>
+      <w:tr>
+        <w:trPr>
+          <w:cantSplit/>
+        </w:trPr>
+        <w:tc>
+          <w:tcPr>
+            <w:tcW w:type="dxa" w:w="2200"/>
+            <w:vAlign w:val="center"/>
+          </w:tcPr>
+          <w:p>
+            <w:pPr>
+              <w:spacing w:after="0" w:line="252" w:lineRule="auto"/>
+            </w:pPr>
+            <w:r>
+              <w:t>Migration</w:t>
+            </w:r>
+          </w:p>
+        </w:tc>
+        <w:tc>
+          <w:tcPr>
+            <w:tcW w:type="dxa" w:w="2960"/>
+            <w:vAlign w:val="center"/>
+          </w:tcPr>
+          <w:p>
+            <w:pPr>
+              <w:spacing w:after="0" w:line="252" w:lineRule="auto"/>
+            </w:pPr>
+            <w:r>
+              <w:t>Upgrade, schema drift check, downgrade to base, and clean re-upgrade</w:t>
+            </w:r>
+          </w:p>
+        </w:tc>
+        <w:tc>
+          <w:tcPr>
+            <w:tcW w:type="dxa" w:w="4200"/>
+            <w:vAlign w:val="center"/>
+          </w:tcPr>
+          <w:p>
+            <w:pPr>
+              <w:spacing w:after="0" w:line="252" w:lineRule="auto"/>
+            </w:pPr>
+            <w:r>
+              <w:t>GitHub Actions `Migrations and tests` job</w:t>
+            </w:r>
+          </w:p>
+        </w:tc>
+      </w:tr>
+      <w:tr>
+        <w:trPr>
+          <w:cantSplit/>
+        </w:trPr>
+        <w:tc>
+          <w:tcPr>
+            <w:tcW w:type="dxa" w:w="2200"/>
+            <w:vAlign w:val="center"/>
+          </w:tcPr>
+          <w:p>
+            <w:pPr>
+              <w:spacing w:after="0" w:line="252" w:lineRule="auto"/>
+            </w:pPr>
+            <w:r>
+              <w:t>Container</w:t>
+            </w:r>
+          </w:p>
+        </w:tc>
+        <w:tc>
+          <w:tcPr>
+            <w:tcW w:type="dxa" w:w="2960"/>
+            <w:vAlign w:val="center"/>
+          </w:tcPr>
+          <w:p>
+            <w:pPr>
+              <w:spacing w:after="0" w:line="252" w:lineRule="auto"/>
+            </w:pPr>
+            <w:r>
+              <w:t>Compose model, image build, and non-root runtime</w:t>
+            </w:r>
+          </w:p>
+        </w:tc>
+        <w:tc>
+          <w:tcPr>
+            <w:tcW w:type="dxa" w:w="4200"/>
+            <w:vAlign w:val="center"/>
+          </w:tcPr>
+          <w:p>
+            <w:pPr>
+              <w:spacing w:after="0" w:line="252" w:lineRule="auto"/>
+            </w:pPr>
+            <w:r>
+              <w:t>GitHub Actions `Container build` job</w:t>
+            </w:r>
+          </w:p>
+        </w:tc>
+      </w:tr>
+      <w:tr>
+        <w:trPr>
+          <w:cantSplit/>
+        </w:trPr>
+        <w:tc>
+          <w:tcPr>
+            <w:tcW w:type="dxa" w:w="2200"/>
+            <w:vAlign w:val="center"/>
+          </w:tcPr>
+          <w:p>
+            <w:pPr>
+              <w:spacing w:after="0" w:line="252" w:lineRule="auto"/>
+            </w:pPr>
+            <w:r>
+              <w:t>Staging acceptance</w:t>
+            </w:r>
+          </w:p>
+        </w:tc>
+        <w:tc>
+          <w:tcPr>
+            <w:tcW w:type="dxa" w:w="2960"/>
+            <w:vAlign w:val="center"/>
+          </w:tcPr>
+          <w:p>
+            <w:pPr>
+              <w:spacing w:after="0" w:line="252" w:lineRule="auto"/>
+            </w:pPr>
+            <w:r>
+              <w:t>Real Telegram webhook, approved TikTok application, Robokassa test mode, HTTPS, backup and restore</w:t>
+            </w:r>
+          </w:p>
+        </w:tc>
+        <w:tc>
+          <w:tcPr>
+            <w:tcW w:type="dxa" w:w="4200"/>
+            <w:vAlign w:val="center"/>
+          </w:tcPr>
+          <w:p>
+            <w:pPr>
+              <w:spacing w:after="0" w:line="252" w:lineRule="auto"/>
+            </w:pPr>
+            <w:r>
+              <w:t>Signed release checklist and staging run record</w:t>
+            </w:r>
+          </w:p>
+        </w:tc>
+      </w:tr>
+    </w:tbl>
+    <w:p/>
     <w:p>
       <w:pPr>
         <w:pStyle w:val="Heading2"/>
       </w:pPr>
       <w:r>
-        <w:t>65.2. Technical Readiness</w:t>
-      </w:r>
-    </w:p>
-    <w:p>
-      <w:pPr>
-        <w:pStyle w:val="ListBullet"/>
-      </w:pPr>
-      <w:r>
-        <w:t>`docker compose up -d` starts all services.</w:t>
-      </w:r>
-    </w:p>
-    <w:p>
-      <w:pPr>
-        <w:pStyle w:val="ListBullet"/>
-      </w:pPr>
-      <w:r>
-        <w:t>PostgreSQL and Redis are not exposed publicly.</w:t>
-      </w:r>
-    </w:p>
-    <w:p>
-      <w:pPr>
-        <w:pStyle w:val="ListBullet"/>
-      </w:pPr>
-      <w:r>
-        <w:t>API, PostgreSQL, Redis, scheduler, and Nginx healthchecks pass.</w:t>
-      </w:r>
-    </w:p>
-    <w:p>
-      <w:pPr>
-        <w:pStyle w:val="ListBullet"/>
-      </w:pPr>
-      <w:r>
-        <w:t>Alembic migrations apply cleanly.</w:t>
-      </w:r>
-    </w:p>
-    <w:p>
-      <w:pPr>
-        <w:pStyle w:val="ListBullet"/>
-      </w:pPr>
-      <w:r>
-        <w:t>Migration compatibility checks are complete.</w:t>
-      </w:r>
-    </w:p>
-    <w:p>
-      <w:pPr>
-        <w:pStyle w:val="ListBullet"/>
-      </w:pPr>
-      <w:r>
-        <w:t>CI passes Ruff format, Ruff lint, MyPy, tests, Alembic, Docker build, and secret scan.</w:t>
-      </w:r>
-    </w:p>
-    <w:p>
-      <w:pPr>
-        <w:pStyle w:val="ListBullet"/>
-      </w:pPr>
-      <w:r>
-        <w:t>CI verifies Bash scripts with ShellCheck and confirms the application image runs as `appuser`.</w:t>
-      </w:r>
-    </w:p>
-    <w:p>
-      <w:pPr>
-        <w:pStyle w:val="ListBullet"/>
-      </w:pPr>
-      <w:r>
-        <w:t>`.env` files are not committed.</w:t>
-      </w:r>
-    </w:p>
-    <w:p>
-      <w:pPr>
-        <w:pStyle w:val="ListBullet"/>
-      </w:pPr>
-      <w:r>
-        <w:t>`.env.example` is complete and current.</w:t>
-      </w:r>
-    </w:p>
-    <w:p>
-      <w:pPr>
-        <w:pStyle w:val="ListBullet"/>
-      </w:pPr>
-      <w:r>
-        <w:t>Confidential data handling and secret rotation policy is documented.</w:t>
-      </w:r>
-    </w:p>
-    <w:p>
-      <w:pPr>
-        <w:pStyle w:val="ListBullet"/>
-      </w:pPr>
-      <w:r>
-        <w:t>Environment configuration and secret readiness are verified.</w:t>
-      </w:r>
-    </w:p>
-    <w:p>
-      <w:pPr>
-        <w:pStyle w:val="ListBullet"/>
-      </w:pPr>
-      <w:r>
-        <w:t>OpenAPI is available at `/docs` and `/openapi.json`.</w:t>
-      </w:r>
-    </w:p>
-    <w:p>
-      <w:pPr>
-        <w:pStyle w:val="ListBullet"/>
-      </w:pPr>
-      <w:r>
-        <w:t>Versioned administrative endpoints are present under `/api/v1/admin`.</w:t>
-      </w:r>
-    </w:p>
-    <w:p>
-      <w:pPr>
-        <w:pStyle w:val="ListBullet"/>
-      </w:pPr>
-      <w:r>
-        <w:t>Admin static responses include CSP, frame denial, no-sniff, and no-store headers.</w:t>
-      </w:r>
-    </w:p>
-    <w:p>
-      <w:pPr>
-        <w:pStyle w:val="ListBullet"/>
-      </w:pPr>
-      <w:r>
-        <w:t>API version compatibility and deprecation impact have been reviewed.</w:t>
-      </w:r>
-    </w:p>
-    <w:p>
-      <w:pPr>
-        <w:pStyle w:val="ListBullet"/>
-      </w:pPr>
-      <w:r>
-        <w:t>Requirements traceability matrix is current.</w:t>
-      </w:r>
-    </w:p>
-    <w:p>
-      <w:pPr>
-        <w:pStyle w:val="ListBullet"/>
-      </w:pPr>
-      <w:r>
-        <w:t>Specification index is current.</w:t>
-      </w:r>
-    </w:p>
-    <w:p>
-      <w:pPr>
-        <w:pStyle w:val="ListBullet"/>
-      </w:pPr>
-      <w:r>
-        <w:t>Technical debt register has been reviewed.</w:t>
-      </w:r>
-    </w:p>
-    <w:p>
-      <w:pPr>
-        <w:pStyle w:val="ListBullet"/>
-      </w:pPr>
-      <w:r>
-        <w:t>License and third-party component register has been reviewed.</w:t>
-      </w:r>
-    </w:p>
-    <w:p>
-      <w:pPr>
-        <w:pStyle w:val="ListBullet"/>
-      </w:pPr>
-      <w:r>
-        <w:t>Non-functional requirements have been checked.</w:t>
+        <w:t>65.2. Local Quality Commands</w:t>
+      </w:r>
+    </w:p>
+    <w:p>
+      <w:r>
+        <w:t>Run static checks and infrastructure-free tests:</w:t>
+      </w:r>
+    </w:p>
+    <w:p>
+      <w:pPr>
+        <w:spacing w:after="160"/>
+        <w:ind w:left="216"/>
+      </w:pPr>
+      <w:r>
+        <w:rPr>
+          <w:rFonts w:ascii="Courier New" w:hAnsi="Courier New"/>
+          <w:sz w:val="17"/>
+        </w:rPr>
+        <w:t>ruff format --check .</w:t>
+        <w:br/>
+        <w:t>ruff check .</w:t>
+        <w:br/>
+        <w:t>mypy app</w:t>
+        <w:br/>
+        <w:t>python tools/check_openapi.py</w:t>
+        <w:br/>
+        <w:t>python tools/check_secrets.py</w:t>
+        <w:br/>
+        <w:t>pytest --cov=app --cov-report=term-missing --cov-fail-under=45</w:t>
+      </w:r>
+    </w:p>
+    <w:p>
+      <w:r>
+        <w:t>The full `pytest` command requires PostgreSQL and may require Redis. GitHub Actions provides</w:t>
+      </w:r>
+    </w:p>
+    <w:p>
+      <w:r>
+        <w:t>PostgreSQL 16, Redis, FFmpeg, an isolated encryption key, and a migrated disposable database.</w:t>
       </w:r>
     </w:p>
     <w:p>
@@ -37072,135 +37399,32 @@
         <w:pStyle w:val="Heading2"/>
       </w:pPr>
       <w:r>
-        <w:t>65.3. Operational Readiness</w:t>
-      </w:r>
-    </w:p>
-    <w:p>
-      <w:pPr>
-        <w:pStyle w:val="ListBullet"/>
-      </w:pPr>
-      <w:r>
-        <w:t>Production `.env` is prepared.</w:t>
-      </w:r>
-    </w:p>
-    <w:p>
-      <w:pPr>
-        <w:pStyle w:val="ListBullet"/>
-      </w:pPr>
-      <w:r>
-        <w:t>HTTPS is configured.</w:t>
-      </w:r>
-    </w:p>
-    <w:p>
-      <w:pPr>
-        <w:pStyle w:val="ListBullet"/>
-      </w:pPr>
-      <w:r>
-        <w:t>Telegram, TikTok, and Robokassa callbacks are configured.</w:t>
-      </w:r>
-    </w:p>
-    <w:p>
-      <w:pPr>
-        <w:pStyle w:val="ListBullet"/>
-      </w:pPr>
-      <w:r>
-        <w:t>PostgreSQL backup works.</w:t>
-      </w:r>
-    </w:p>
-    <w:p>
-      <w:pPr>
-        <w:pStyle w:val="ListBullet"/>
-      </w:pPr>
-      <w:r>
-        <w:t>Restore drill has been tested on staging.</w:t>
-      </w:r>
-    </w:p>
-    <w:p>
-      <w:pPr>
-        <w:pStyle w:val="ListBullet"/>
-      </w:pPr>
-      <w:r>
-        <w:t>Backup checksum/metadata and `pg_restore --list` verification are present.</w:t>
-      </w:r>
-    </w:p>
-    <w:p>
-      <w:pPr>
-        <w:pStyle w:val="ListBullet"/>
-      </w:pPr>
-      <w:r>
-        <w:t>Automated deployment and application rollback smoke tests pass in staging.</w:t>
-      </w:r>
-    </w:p>
-    <w:p>
-      <w:pPr>
-        <w:pStyle w:val="ListBullet"/>
-      </w:pPr>
-      <w:r>
-        <w:t>Backup and restore policy is documented and current.</w:t>
-      </w:r>
-    </w:p>
-    <w:p>
-      <w:pPr>
-        <w:pStyle w:val="ListBullet"/>
-      </w:pPr>
-      <w:r>
-        <w:t>`/health`, `/ready`, and `/metrics` are monitored.</w:t>
-      </w:r>
-    </w:p>
-    <w:p>
-      <w:pPr>
-        <w:pStyle w:val="ListBullet"/>
-      </w:pPr>
-      <w:r>
-        <w:t>Security logging and audit requirements are verified.</w:t>
-      </w:r>
-    </w:p>
-    <w:p>
-      <w:pPr>
-        <w:pStyle w:val="ListBullet"/>
-      </w:pPr>
-      <w:r>
-        <w:t>Capacity thresholds and scaling actions are documented.</w:t>
-      </w:r>
-    </w:p>
-    <w:p>
-      <w:pPr>
-        <w:pStyle w:val="ListBullet"/>
-      </w:pPr>
-      <w:r>
-        <w:t>Service continuity plan is documented and current.</w:t>
-      </w:r>
-    </w:p>
-    <w:p>
-      <w:pPr>
-        <w:pStyle w:val="ListBullet"/>
-      </w:pPr>
-      <w:r>
-        <w:t>Infrastructure dependency update policy is documented and current.</w:t>
-      </w:r>
-    </w:p>
-    <w:p>
-      <w:pPr>
-        <w:pStyle w:val="ListBullet"/>
-      </w:pPr>
-      <w:r>
-        <w:t>Incident management process is documented.</w:t>
-      </w:r>
-    </w:p>
-    <w:p>
-      <w:pPr>
-        <w:pStyle w:val="ListBullet"/>
-      </w:pPr>
-      <w:r>
-        <w:t>Operations runbook is current.</w:t>
-      </w:r>
-    </w:p>
-    <w:p>
-      <w:pPr>
-        <w:pStyle w:val="ListBullet"/>
-      </w:pPr>
-      <w:r>
-        <w:t>Release and rollback procedures are documented.</w:t>
+        <w:t>65.3. Coverage Policy</w:t>
+      </w:r>
+    </w:p>
+    <w:p>
+      <w:r>
+        <w:t>CI enforces a project-wide line coverage floor of 45%. The floor is a regression guard, not a</w:t>
+      </w:r>
+    </w:p>
+    <w:p>
+      <w:r>
+        <w:t>completion target. New or changed business logic must include focused tests, and critical payment,</w:t>
+      </w:r>
+    </w:p>
+    <w:p>
+      <w:r>
+        <w:t>quota, OAuth, webhook, and queue paths require behavioral assertions even when aggregate coverage</w:t>
+      </w:r>
+    </w:p>
+    <w:p>
+      <w:r>
+        <w:t>already passes.</w:t>
+      </w:r>
+    </w:p>
+    <w:p>
+      <w:r>
+        <w:t>Coverage XML is generated in CI for later publication or quality-platform integration.</w:t>
       </w:r>
     </w:p>
     <w:p>
@@ -37208,37 +37432,151 @@
         <w:pStyle w:val="Heading2"/>
       </w:pPr>
       <w:r>
-        <w:t>65.4. Final Sign-Off</w:t>
-      </w:r>
-    </w:p>
-    <w:p>
-      <w:r>
-        <w:t>Project is ready for production only after functional, integration, security, and operational checks pass successfully.</w:t>
-      </w:r>
-    </w:p>
-    <w:p>
-      <w:r>
-        <w:t>Required QA scenarios are documented in QA Test Data and Acceptance Scenarios.</w:t>
-      </w:r>
-    </w:p>
-    <w:p>
-      <w:r>
-        <w:t>Requirement coverage is tracked in Requirements Traceability Matrix.</w:t>
-      </w:r>
-    </w:p>
-    <w:p>
-      <w:r>
-        <w:t>The first production run should follow Production Launch Plan.</w:t>
-      </w:r>
-    </w:p>
-    <w:p>
-      <w:r>
-        <w:t>Post-launch support should follow Post-Launch Maintenance and Versioning.</w:t>
-      </w:r>
-    </w:p>
-    <w:p>
-      <w:r>
-        <w:t>Future changes should be accepted through Change Acceptance Policy.</w:t>
+        <w:t>65.4. Concurrency and Idempotency</w:t>
+      </w:r>
+    </w:p>
+    <w:p>
+      <w:r>
+        <w:t>Automated PostgreSQL tests verify these invariants:</w:t>
+      </w:r>
+    </w:p>
+    <w:p>
+      <w:pPr>
+        <w:pStyle w:val="ListBullet"/>
+      </w:pPr>
+      <w:r>
+        <w:t>Concurrent Telegram registration creates one user and one active FREE subscription.</w:t>
+      </w:r>
+    </w:p>
+    <w:p>
+      <w:pPr>
+        <w:pStyle w:val="ListBullet"/>
+      </w:pPr>
+      <w:r>
+        <w:t>Concurrent first-use quota checks create one daily usage row.</w:t>
+      </w:r>
+    </w:p>
+    <w:p>
+      <w:pPr>
+        <w:pStyle w:val="ListBullet"/>
+      </w:pPr>
+      <w:r>
+        <w:t>Duplicate Robokassa confirmation activates a paid subscription exactly once.</w:t>
+      </w:r>
+    </w:p>
+    <w:p>
+      <w:pPr>
+        <w:pStyle w:val="ListBullet"/>
+      </w:pPr>
+      <w:r>
+        <w:t>A paid ResultURL with malformed or mismatched amount cannot activate a subscription.</w:t>
+      </w:r>
+    </w:p>
+    <w:p>
+      <w:pPr>
+        <w:pStyle w:val="ListBullet"/>
+      </w:pPr>
+      <w:r>
+        <w:t>Upload status history contains every accepted transition and terminal jobs cannot be reopened.</w:t>
+      </w:r>
+    </w:p>
+    <w:p>
+      <w:pPr>
+        <w:pStyle w:val="ListBullet"/>
+      </w:pPr>
+      <w:r>
+        <w:t>Redis leases prevent duplicate scheduler dispatch and upload worker execution.</w:t>
+      </w:r>
+    </w:p>
+    <w:p>
+      <w:pPr>
+        <w:pStyle w:val="Heading2"/>
+      </w:pPr>
+      <w:r>
+        <w:t>65.5. External-Service Boundary</w:t>
+      </w:r>
+    </w:p>
+    <w:p>
+      <w:r>
+        <w:t>Unit and integration tests mock TikTok HTTP responses and validate only the official OAuth 2.0 and</w:t>
+      </w:r>
+    </w:p>
+    <w:p>
+      <w:r>
+        <w:t>Content Posting API contract implemented by this project. They do not prove that a TikTok</w:t>
+      </w:r>
+    </w:p>
+    <w:p>
+      <w:r>
+        <w:t>application has been approved or that a specific account or region is eligible to publish.</w:t>
+      </w:r>
+    </w:p>
+    <w:p>
+      <w:r>
+        <w:t>Robokassa production activation requires a real ResultURL round trip against the configured store.</w:t>
+      </w:r>
+    </w:p>
+    <w:p>
+      <w:r>
+        <w:t>SuccessURL is informational and is never acceptance evidence.</w:t>
+      </w:r>
+    </w:p>
+    <w:p>
+      <w:pPr>
+        <w:pStyle w:val="Heading2"/>
+      </w:pPr>
+      <w:r>
+        <w:t>65.6. Release Evidence</w:t>
+      </w:r>
+    </w:p>
+    <w:p>
+      <w:r>
+        <w:t>A release candidate requires:</w:t>
+      </w:r>
+    </w:p>
+    <w:p>
+      <w:pPr>
+        <w:pStyle w:val="ListBullet"/>
+      </w:pPr>
+      <w:r>
+        <w:t>Successful GitHub Actions quality, integration, migration, and container jobs.</w:t>
+      </w:r>
+    </w:p>
+    <w:p>
+      <w:pPr>
+        <w:pStyle w:val="ListBullet"/>
+      </w:pPr>
+      <w:r>
+        <w:t>Current requirement-to-test links in the traceability matrix.</w:t>
+      </w:r>
+    </w:p>
+    <w:p>
+      <w:pPr>
+        <w:pStyle w:val="ListBullet"/>
+      </w:pPr>
+      <w:r>
+        <w:t>Staging execution of scenarios that depend on Telegram, TikTok, Robokassa, HTTPS, or recovery.</w:t>
+      </w:r>
+    </w:p>
+    <w:p>
+      <w:pPr>
+        <w:pStyle w:val="ListBullet"/>
+      </w:pPr>
+      <w:r>
+        <w:t>No unresolved critical security findings.</w:t>
+      </w:r>
+    </w:p>
+    <w:p>
+      <w:pPr>
+        <w:pStyle w:val="ListBullet"/>
+      </w:pPr>
+      <w:r>
+        <w:t>A backup and restore record before production deployment.</w:t>
+      </w:r>
+    </w:p>
+    <w:p>
+      <w:r>
+        <w:t>Passing automated tests does not by itself authorize production launch.</w:t>
       </w:r>
     </w:p>
     <w:p>
@@ -37256,7 +37594,552 @@
         <w:pStyle w:val="Heading1"/>
       </w:pPr>
       <w:r>
-        <w:t>66. Requirements Traceability Matrix</w:t>
+        <w:t>66. Acceptance Checklist</w:t>
+      </w:r>
+    </w:p>
+    <w:p>
+      <w:r>
+        <w:t>Группа спецификации: Качество</w:t>
+      </w:r>
+    </w:p>
+    <w:p>
+      <w:r>
+        <w:t>Final implementation must satisfy Architecture Summary.</w:t>
+      </w:r>
+    </w:p>
+    <w:p>
+      <w:r>
+        <w:t>Non-functional requirements must be validated according to Non-Functional Requirements.</w:t>
+      </w:r>
+    </w:p>
+    <w:p>
+      <w:r>
+        <w:t>Documentation completeness must be checked against Specification Index.</w:t>
+      </w:r>
+    </w:p>
+    <w:p>
+      <w:r>
+        <w:t>Implementation progress must be checked against Implementation Roadmap.</w:t>
+      </w:r>
+    </w:p>
+    <w:p>
+      <w:pPr>
+        <w:pStyle w:val="Heading2"/>
+      </w:pPr>
+      <w:r>
+        <w:t>66.1. Functional Readiness</w:t>
+      </w:r>
+    </w:p>
+    <w:p>
+      <w:pPr>
+        <w:pStyle w:val="ListBullet"/>
+      </w:pPr>
+      <w:r>
+        <w:t>New Telegram user registration works.</w:t>
+      </w:r>
+    </w:p>
+    <w:p>
+      <w:pPr>
+        <w:pStyle w:val="ListBullet"/>
+      </w:pPr>
+      <w:r>
+        <w:t>FREE plan is assigned automatically.</w:t>
+      </w:r>
+    </w:p>
+    <w:p>
+      <w:pPr>
+        <w:pStyle w:val="ListBullet"/>
+      </w:pPr>
+      <w:r>
+        <w:t>User agreement flow works.</w:t>
+      </w:r>
+    </w:p>
+    <w:p>
+      <w:pPr>
+        <w:pStyle w:val="ListBullet"/>
+      </w:pPr>
+      <w:r>
+        <w:t>TikTok OAuth 2.0 connection uses the official TikTok authorization flow.</w:t>
+      </w:r>
+    </w:p>
+    <w:p>
+      <w:pPr>
+        <w:pStyle w:val="ListBullet"/>
+      </w:pPr>
+      <w:r>
+        <w:t>TikTok OAuth tokens are encrypted in storage.</w:t>
+      </w:r>
+    </w:p>
+    <w:p>
+      <w:pPr>
+        <w:pStyle w:val="ListBullet"/>
+      </w:pPr>
+      <w:r>
+        <w:t>Video upload FSM works: video, description, hashtags, confirmation.</w:t>
+      </w:r>
+    </w:p>
+    <w:p>
+      <w:pPr>
+        <w:pStyle w:val="ListBullet"/>
+      </w:pPr>
+      <w:r>
+        <w:t>Video validation and preparation work for MP4, MOV, and WEBM.</w:t>
+      </w:r>
+    </w:p>
+    <w:p>
+      <w:pPr>
+        <w:pStyle w:val="ListBullet"/>
+      </w:pPr>
+      <w:r>
+        <w:t>Upload lifecycle events are recorded.</w:t>
+      </w:r>
+    </w:p>
+    <w:p>
+      <w:pPr>
+        <w:pStyle w:val="ListBullet"/>
+      </w:pPr>
+      <w:r>
+        <w:t>FREE, PRO, and BUSINESS limits match the specification.</w:t>
+      </w:r>
+    </w:p>
+    <w:p>
+      <w:pPr>
+        <w:pStyle w:val="ListBullet"/>
+      </w:pPr>
+      <w:r>
+        <w:t>Robokassa payment link generation works for PRO and BUSINESS.</w:t>
+      </w:r>
+    </w:p>
+    <w:p>
+      <w:pPr>
+        <w:pStyle w:val="ListBullet"/>
+      </w:pPr>
+      <w:r>
+        <w:t>Robokassa ResultURL activates paid subscriptions.</w:t>
+      </w:r>
+    </w:p>
+    <w:p>
+      <w:pPr>
+        <w:pStyle w:val="ListBullet"/>
+      </w:pPr>
+      <w:r>
+        <w:t>SuccessURL does not activate subscriptions.</w:t>
+      </w:r>
+    </w:p>
+    <w:p>
+      <w:pPr>
+        <w:pStyle w:val="ListBullet"/>
+      </w:pPr>
+      <w:r>
+        <w:t>Expired paid subscriptions return to FREE and produce one pending user notification.</w:t>
+      </w:r>
+    </w:p>
+    <w:p>
+      <w:pPr>
+        <w:pStyle w:val="ListBullet"/>
+      </w:pPr>
+      <w:r>
+        <w:t>User can disconnect TikTok.</w:t>
+      </w:r>
+    </w:p>
+    <w:p>
+      <w:pPr>
+        <w:pStyle w:val="ListBullet"/>
+      </w:pPr>
+      <w:r>
+        <w:t>Admin console is available only through HTTPS in production.</w:t>
+      </w:r>
+    </w:p>
+    <w:p>
+      <w:pPr>
+        <w:pStyle w:val="ListBullet"/>
+      </w:pPr>
+      <w:r>
+        <w:t>SUPPORT, ADMIN, and SUPER_ADMIN see only server-authorized operations.</w:t>
+      </w:r>
+    </w:p>
+    <w:p>
+      <w:pPr>
+        <w:pStyle w:val="ListBullet"/>
+      </w:pPr>
+      <w:r>
+        <w:t>User detail never returns encrypted or decrypted TikTok OAuth tokens.</w:t>
+      </w:r>
+    </w:p>
+    <w:p>
+      <w:pPr>
+        <w:pStyle w:val="ListBullet"/>
+      </w:pPr>
+      <w:r>
+        <w:t>User blocking, FREE fallback, plan changes, settings changes, role changes, and safe retries are audited.</w:t>
+      </w:r>
+    </w:p>
+    <w:p>
+      <w:pPr>
+        <w:pStyle w:val="ListBullet"/>
+      </w:pPr>
+      <w:r>
+        <w:t>Only eligible temporary publication failures can be manually retried.</w:t>
+      </w:r>
+    </w:p>
+    <w:p>
+      <w:pPr>
+        <w:pStyle w:val="Heading2"/>
+      </w:pPr>
+      <w:r>
+        <w:t>66.2. Technical Readiness</w:t>
+      </w:r>
+    </w:p>
+    <w:p>
+      <w:pPr>
+        <w:pStyle w:val="ListBullet"/>
+      </w:pPr>
+      <w:r>
+        <w:t>`docker compose up -d` starts all services.</w:t>
+      </w:r>
+    </w:p>
+    <w:p>
+      <w:pPr>
+        <w:pStyle w:val="ListBullet"/>
+      </w:pPr>
+      <w:r>
+        <w:t>PostgreSQL and Redis are not exposed publicly.</w:t>
+      </w:r>
+    </w:p>
+    <w:p>
+      <w:pPr>
+        <w:pStyle w:val="ListBullet"/>
+      </w:pPr>
+      <w:r>
+        <w:t>API, PostgreSQL, Redis, scheduler, and Nginx healthchecks pass.</w:t>
+      </w:r>
+    </w:p>
+    <w:p>
+      <w:pPr>
+        <w:pStyle w:val="ListBullet"/>
+      </w:pPr>
+      <w:r>
+        <w:t>Alembic migrations apply cleanly.</w:t>
+      </w:r>
+    </w:p>
+    <w:p>
+      <w:pPr>
+        <w:pStyle w:val="ListBullet"/>
+      </w:pPr>
+      <w:r>
+        <w:t>Migration compatibility checks are complete.</w:t>
+      </w:r>
+    </w:p>
+    <w:p>
+      <w:pPr>
+        <w:pStyle w:val="ListBullet"/>
+      </w:pPr>
+      <w:r>
+        <w:t>CI passes Ruff format, Ruff lint, MyPy, tests, Alembic, Docker build, and secret scan.</w:t>
+      </w:r>
+    </w:p>
+    <w:p>
+      <w:pPr>
+        <w:pStyle w:val="ListBullet"/>
+      </w:pPr>
+      <w:r>
+        <w:t>CI verifies Bash scripts with ShellCheck and confirms the application image runs as `appuser`.</w:t>
+      </w:r>
+    </w:p>
+    <w:p>
+      <w:pPr>
+        <w:pStyle w:val="ListBullet"/>
+      </w:pPr>
+      <w:r>
+        <w:t>`.env` files are not committed.</w:t>
+      </w:r>
+    </w:p>
+    <w:p>
+      <w:pPr>
+        <w:pStyle w:val="ListBullet"/>
+      </w:pPr>
+      <w:r>
+        <w:t>`.env.example` is complete and current.</w:t>
+      </w:r>
+    </w:p>
+    <w:p>
+      <w:pPr>
+        <w:pStyle w:val="ListBullet"/>
+      </w:pPr>
+      <w:r>
+        <w:t>Confidential data handling and secret rotation policy is documented.</w:t>
+      </w:r>
+    </w:p>
+    <w:p>
+      <w:pPr>
+        <w:pStyle w:val="ListBullet"/>
+      </w:pPr>
+      <w:r>
+        <w:t>Environment configuration and secret readiness are verified.</w:t>
+      </w:r>
+    </w:p>
+    <w:p>
+      <w:pPr>
+        <w:pStyle w:val="ListBullet"/>
+      </w:pPr>
+      <w:r>
+        <w:t>OpenAPI is available at `/docs` and `/openapi.json`.</w:t>
+      </w:r>
+    </w:p>
+    <w:p>
+      <w:pPr>
+        <w:pStyle w:val="ListBullet"/>
+      </w:pPr>
+      <w:r>
+        <w:t>Versioned administrative endpoints are present under `/api/v1/admin`.</w:t>
+      </w:r>
+    </w:p>
+    <w:p>
+      <w:pPr>
+        <w:pStyle w:val="ListBullet"/>
+      </w:pPr>
+      <w:r>
+        <w:t>Admin static responses include CSP, frame denial, no-sniff, and no-store headers.</w:t>
+      </w:r>
+    </w:p>
+    <w:p>
+      <w:pPr>
+        <w:pStyle w:val="ListBullet"/>
+      </w:pPr>
+      <w:r>
+        <w:t>API version compatibility and deprecation impact have been reviewed.</w:t>
+      </w:r>
+    </w:p>
+    <w:p>
+      <w:pPr>
+        <w:pStyle w:val="ListBullet"/>
+      </w:pPr>
+      <w:r>
+        <w:t>Requirements traceability matrix is current.</w:t>
+      </w:r>
+    </w:p>
+    <w:p>
+      <w:pPr>
+        <w:pStyle w:val="ListBullet"/>
+      </w:pPr>
+      <w:r>
+        <w:t>Specification index is current.</w:t>
+      </w:r>
+    </w:p>
+    <w:p>
+      <w:pPr>
+        <w:pStyle w:val="ListBullet"/>
+      </w:pPr>
+      <w:r>
+        <w:t>Technical debt register has been reviewed.</w:t>
+      </w:r>
+    </w:p>
+    <w:p>
+      <w:pPr>
+        <w:pStyle w:val="ListBullet"/>
+      </w:pPr>
+      <w:r>
+        <w:t>License and third-party component register has been reviewed.</w:t>
+      </w:r>
+    </w:p>
+    <w:p>
+      <w:pPr>
+        <w:pStyle w:val="ListBullet"/>
+      </w:pPr>
+      <w:r>
+        <w:t>Non-functional requirements have been checked.</w:t>
+      </w:r>
+    </w:p>
+    <w:p>
+      <w:pPr>
+        <w:pStyle w:val="Heading2"/>
+      </w:pPr>
+      <w:r>
+        <w:t>66.3. Operational Readiness</w:t>
+      </w:r>
+    </w:p>
+    <w:p>
+      <w:pPr>
+        <w:pStyle w:val="ListBullet"/>
+      </w:pPr>
+      <w:r>
+        <w:t>Production `.env` is prepared.</w:t>
+      </w:r>
+    </w:p>
+    <w:p>
+      <w:pPr>
+        <w:pStyle w:val="ListBullet"/>
+      </w:pPr>
+      <w:r>
+        <w:t>HTTPS is configured.</w:t>
+      </w:r>
+    </w:p>
+    <w:p>
+      <w:pPr>
+        <w:pStyle w:val="ListBullet"/>
+      </w:pPr>
+      <w:r>
+        <w:t>Telegram, TikTok, and Robokassa callbacks are configured.</w:t>
+      </w:r>
+    </w:p>
+    <w:p>
+      <w:pPr>
+        <w:pStyle w:val="ListBullet"/>
+      </w:pPr>
+      <w:r>
+        <w:t>PostgreSQL backup works.</w:t>
+      </w:r>
+    </w:p>
+    <w:p>
+      <w:pPr>
+        <w:pStyle w:val="ListBullet"/>
+      </w:pPr>
+      <w:r>
+        <w:t>Restore drill has been tested on staging.</w:t>
+      </w:r>
+    </w:p>
+    <w:p>
+      <w:pPr>
+        <w:pStyle w:val="ListBullet"/>
+      </w:pPr>
+      <w:r>
+        <w:t>Backup checksum/metadata and `pg_restore --list` verification are present.</w:t>
+      </w:r>
+    </w:p>
+    <w:p>
+      <w:pPr>
+        <w:pStyle w:val="ListBullet"/>
+      </w:pPr>
+      <w:r>
+        <w:t>Automated deployment and application rollback smoke tests pass in staging.</w:t>
+      </w:r>
+    </w:p>
+    <w:p>
+      <w:pPr>
+        <w:pStyle w:val="ListBullet"/>
+      </w:pPr>
+      <w:r>
+        <w:t>Backup and restore policy is documented and current.</w:t>
+      </w:r>
+    </w:p>
+    <w:p>
+      <w:pPr>
+        <w:pStyle w:val="ListBullet"/>
+      </w:pPr>
+      <w:r>
+        <w:t>`/health`, `/ready`, and `/metrics` are monitored.</w:t>
+      </w:r>
+    </w:p>
+    <w:p>
+      <w:pPr>
+        <w:pStyle w:val="ListBullet"/>
+      </w:pPr>
+      <w:r>
+        <w:t>Security logging and audit requirements are verified.</w:t>
+      </w:r>
+    </w:p>
+    <w:p>
+      <w:pPr>
+        <w:pStyle w:val="ListBullet"/>
+      </w:pPr>
+      <w:r>
+        <w:t>Capacity thresholds and scaling actions are documented.</w:t>
+      </w:r>
+    </w:p>
+    <w:p>
+      <w:pPr>
+        <w:pStyle w:val="ListBullet"/>
+      </w:pPr>
+      <w:r>
+        <w:t>Service continuity plan is documented and current.</w:t>
+      </w:r>
+    </w:p>
+    <w:p>
+      <w:pPr>
+        <w:pStyle w:val="ListBullet"/>
+      </w:pPr>
+      <w:r>
+        <w:t>Infrastructure dependency update policy is documented and current.</w:t>
+      </w:r>
+    </w:p>
+    <w:p>
+      <w:pPr>
+        <w:pStyle w:val="ListBullet"/>
+      </w:pPr>
+      <w:r>
+        <w:t>Incident management process is documented.</w:t>
+      </w:r>
+    </w:p>
+    <w:p>
+      <w:pPr>
+        <w:pStyle w:val="ListBullet"/>
+      </w:pPr>
+      <w:r>
+        <w:t>Operations runbook is current.</w:t>
+      </w:r>
+    </w:p>
+    <w:p>
+      <w:pPr>
+        <w:pStyle w:val="ListBullet"/>
+      </w:pPr>
+      <w:r>
+        <w:t>Release and rollback procedures are documented.</w:t>
+      </w:r>
+    </w:p>
+    <w:p>
+      <w:pPr>
+        <w:pStyle w:val="Heading2"/>
+      </w:pPr>
+      <w:r>
+        <w:t>66.4. Final Sign-Off</w:t>
+      </w:r>
+    </w:p>
+    <w:p>
+      <w:r>
+        <w:t>Project is ready for production only after functional, integration, security, and operational checks pass successfully.</w:t>
+      </w:r>
+    </w:p>
+    <w:p>
+      <w:r>
+        <w:t>Required QA scenarios are documented in QA Test Data and Acceptance Scenarios.</w:t>
+      </w:r>
+    </w:p>
+    <w:p>
+      <w:r>
+        <w:t>Requirement coverage is tracked in Requirements Traceability Matrix.</w:t>
+      </w:r>
+    </w:p>
+    <w:p>
+      <w:r>
+        <w:t>The first production run should follow Production Launch Plan.</w:t>
+      </w:r>
+    </w:p>
+    <w:p>
+      <w:r>
+        <w:t>Post-launch support should follow Post-Launch Maintenance and Versioning.</w:t>
+      </w:r>
+    </w:p>
+    <w:p>
+      <w:r>
+        <w:t>Future changes should be accepted through Change Acceptance Policy.</w:t>
+      </w:r>
+    </w:p>
+    <w:p>
+      <w:pPr>
+        <w:sectPr>
+          <w:pgSz w:w="12240" w:h="15840"/>
+          <w:pgMar w:top="1440" w:right="1440" w:bottom="1440" w:left="1440" w:header="708" w:footer="708" w:gutter="0"/>
+          <w:cols w:space="720"/>
+          <w:docGrid w:linePitch="360"/>
+        </w:sectPr>
+      </w:pPr>
+    </w:p>
+    <w:p>
+      <w:pPr>
+        <w:pStyle w:val="Heading1"/>
+      </w:pPr>
+      <w:r>
+        <w:t>67. Requirements Traceability Matrix</w:t>
       </w:r>
     </w:p>
     <w:p>
@@ -37269,7 +38152,7 @@
         <w:pStyle w:val="Heading2"/>
       </w:pPr>
       <w:r>
-        <w:t>66.1. Purpose</w:t>
+        <w:t>67.1. Purpose</w:t>
       </w:r>
     </w:p>
     <w:p>
@@ -37282,7 +38165,7 @@
         <w:pStyle w:val="Heading2"/>
       </w:pPr>
       <w:r>
-        <w:t>66.2. Initial Matrix</w:t>
+        <w:t>67.2. Current Matrix</w:t>
       </w:r>
     </w:p>
     <w:tbl>
@@ -37374,7 +38257,7 @@
               <w:rPr>
                 <w:b/>
               </w:rPr>
-              <w:t>Test</w:t>
+              <w:t>Test evidence</w:t>
             </w:r>
           </w:p>
         </w:tc>
@@ -37392,7 +38275,7 @@
               <w:rPr>
                 <w:b/>
               </w:rPr>
-              <w:t>Documentation</w:t>
+              <w:t>Docs</w:t>
             </w:r>
           </w:p>
         </w:tc>
@@ -37457,7 +38340,7 @@
               <w:spacing w:after="0" w:line="252" w:lineRule="auto"/>
             </w:pPr>
             <w:r>
-              <w:t>Telegram Bot</w:t>
+              <w:t>Bot / DB</w:t>
             </w:r>
           </w:p>
         </w:tc>
@@ -37471,7 +38354,7 @@
               <w:spacing w:after="0" w:line="252" w:lineRule="auto"/>
             </w:pPr>
             <w:r>
-              <w:t>`QA-REG-001`</w:t>
+              <w:t>`QA-REG-001`; subscriptions and FSM tests</w:t>
             </w:r>
           </w:p>
         </w:tc>
@@ -37485,7 +38368,7 @@
               <w:spacing w:after="0" w:line="252" w:lineRule="auto"/>
             </w:pPr>
             <w:r>
-              <w:t>Users Entity, QA Scenarios</w:t>
+              <w:t>Users, QA</w:t>
             </w:r>
           </w:p>
         </w:tc>
@@ -37499,7 +38382,7 @@
               <w:spacing w:after="0" w:line="252" w:lineRule="auto"/>
             </w:pPr>
             <w:r>
-              <w:t>Planned</w:t>
+              <w:t>Implemented</w:t>
             </w:r>
           </w:p>
         </w:tc>
@@ -37546,7 +38429,7 @@
               <w:spacing w:after="0" w:line="252" w:lineRule="auto"/>
             </w:pPr>
             <w:r>
-              <w:t>FastAPI / OAuth</w:t>
+              <w:t>API / OAuth</w:t>
             </w:r>
           </w:p>
         </w:tc>
@@ -37560,7 +38443,7 @@
               <w:spacing w:after="0" w:line="252" w:lineRule="auto"/>
             </w:pPr>
             <w:r>
-              <w:t>`QA-OAUTH-001`</w:t>
+              <w:t>`QA-OAUTH-001`; API and TikTok tests</w:t>
             </w:r>
           </w:p>
         </w:tc>
@@ -37574,7 +38457,7 @@
               <w:spacing w:after="0" w:line="252" w:lineRule="auto"/>
             </w:pPr>
             <w:r>
-              <w:t>TikTok Developer Configuration, Public REST API</w:t>
+              <w:t>TikTok Config, Public API</w:t>
             </w:r>
           </w:p>
         </w:tc>
@@ -37588,7 +38471,7 @@
               <w:spacing w:after="0" w:line="252" w:lineRule="auto"/>
             </w:pPr>
             <w:r>
-              <w:t>Planned</w:t>
+              <w:t>Implemented; staging pending</w:t>
             </w:r>
           </w:p>
         </w:tc>
@@ -37621,7 +38504,7 @@
               <w:spacing w:after="0" w:line="252" w:lineRule="auto"/>
             </w:pPr>
             <w:r>
-              <w:t>PRO/BUSINESS payment</w:t>
+              <w:t>Paid plans</w:t>
             </w:r>
           </w:p>
         </w:tc>
@@ -37649,7 +38532,7 @@
               <w:spacing w:after="0" w:line="252" w:lineRule="auto"/>
             </w:pPr>
             <w:r>
-              <w:t>`QA-PAY-001`</w:t>
+              <w:t>`QA-PAY-001`; payment idempotency tests</w:t>
             </w:r>
           </w:p>
         </w:tc>
@@ -37663,7 +38546,7 @@
               <w:spacing w:after="0" w:line="252" w:lineRule="auto"/>
             </w:pPr>
             <w:r>
-              <w:t>Payments Entity, Robokassa Setup</w:t>
+              <w:t>Payments, Robokassa</w:t>
             </w:r>
           </w:p>
         </w:tc>
@@ -37677,7 +38560,7 @@
               <w:spacing w:after="0" w:line="252" w:lineRule="auto"/>
             </w:pPr>
             <w:r>
-              <w:t>Planned</w:t>
+              <w:t>Implemented; staging pending</w:t>
             </w:r>
           </w:p>
         </w:tc>
@@ -37724,7 +38607,7 @@
               <w:spacing w:after="0" w:line="252" w:lineRule="auto"/>
             </w:pPr>
             <w:r>
-              <w:t>Worker / TikTok API</w:t>
+              <w:t>Worker / TikTok</w:t>
             </w:r>
           </w:p>
         </w:tc>
@@ -37738,7 +38621,7 @@
               <w:spacing w:after="0" w:line="252" w:lineRule="auto"/>
             </w:pPr>
             <w:r>
-              <w:t>`QA-UPL-001`</w:t>
+              <w:t>`QA-UPL-001`; FSM, video, worker, and lifecycle tests</w:t>
             </w:r>
           </w:p>
         </w:tc>
@@ -37752,7 +38635,7 @@
               <w:spacing w:after="0" w:line="252" w:lineRule="auto"/>
             </w:pPr>
             <w:r>
-              <w:t>Upload Jobs Entity, Video Lifecycle</w:t>
+              <w:t>Upload Jobs, Lifecycle</w:t>
             </w:r>
           </w:p>
         </w:tc>
@@ -37766,7 +38649,7 @@
               <w:spacing w:after="0" w:line="252" w:lineRule="auto"/>
             </w:pPr>
             <w:r>
-              <w:t>Planned</w:t>
+              <w:t>Implemented; staging pending</w:t>
             </w:r>
           </w:p>
         </w:tc>
@@ -37813,7 +38696,7 @@
               <w:spacing w:after="0" w:line="252" w:lineRule="auto"/>
             </w:pPr>
             <w:r>
-              <w:t>`daily_usage`</w:t>
+              <w:t>Usage service</w:t>
             </w:r>
           </w:p>
         </w:tc>
@@ -37827,7 +38710,7 @@
               <w:spacing w:after="0" w:line="252" w:lineRule="auto"/>
             </w:pPr>
             <w:r>
-              <w:t>`QA-LIMIT-001`</w:t>
+              <w:t>`QA-LIMIT-001`; quota concurrency tests</w:t>
             </w:r>
           </w:p>
         </w:tc>
@@ -37841,7 +38724,7 @@
               <w:spacing w:after="0" w:line="252" w:lineRule="auto"/>
             </w:pPr>
             <w:r>
-              <w:t>Daily Usage Entity</w:t>
+              <w:t>Daily Usage</w:t>
             </w:r>
           </w:p>
         </w:tc>
@@ -37855,7 +38738,7 @@
               <w:spacing w:after="0" w:line="252" w:lineRule="auto"/>
             </w:pPr>
             <w:r>
-              <w:t>Planned</w:t>
+              <w:t>Implemented</w:t>
             </w:r>
           </w:p>
         </w:tc>
@@ -37888,7 +38771,7 @@
               <w:spacing w:after="0" w:line="252" w:lineRule="auto"/>
             </w:pPr>
             <w:r>
-              <w:t>Performance, reliability, security, maintainability, and scalability controls</w:t>
+              <w:t>Core NFR controls</w:t>
             </w:r>
           </w:p>
         </w:tc>
@@ -37916,7 +38799,7 @@
               <w:spacing w:after="0" w:line="252" w:lineRule="auto"/>
             </w:pPr>
             <w:r>
-              <w:t>Release readiness checks</w:t>
+              <w:t>CI quality, coverage, migration, container</w:t>
             </w:r>
           </w:p>
         </w:tc>
@@ -37930,7 +38813,7 @@
               <w:spacing w:after="0" w:line="252" w:lineRule="auto"/>
             </w:pPr>
             <w:r>
-              <w:t>Non-Functional Requirements</w:t>
+              <w:t>NFR, Tests</w:t>
             </w:r>
           </w:p>
         </w:tc>
@@ -37944,7 +38827,7 @@
               <w:spacing w:after="0" w:line="252" w:lineRule="auto"/>
             </w:pPr>
             <w:r>
-              <w:t>Planned</w:t>
+              <w:t>Implemented; production evidence pending</w:t>
             </w:r>
           </w:p>
         </w:tc>
@@ -37977,7 +38860,7 @@
               <w:spacing w:after="0" w:line="252" w:lineRule="auto"/>
             </w:pPr>
             <w:r>
-              <w:t>Security logging and audit</w:t>
+              <w:t>Security audit</w:t>
             </w:r>
           </w:p>
         </w:tc>
@@ -37991,7 +38874,7 @@
               <w:spacing w:after="0" w:line="252" w:lineRule="auto"/>
             </w:pPr>
             <w:r>
-              <w:t>Observability / Audit</w:t>
+              <w:t>Audit</w:t>
             </w:r>
           </w:p>
         </w:tc>
@@ -38005,7 +38888,7 @@
               <w:spacing w:after="0" w:line="252" w:lineRule="auto"/>
             </w:pPr>
             <w:r>
-              <w:t>Release readiness checks</w:t>
+              <w:t>Admin, tracing, webhook, secret scan</w:t>
             </w:r>
           </w:p>
         </w:tc>
@@ -38019,7 +38902,7 @@
               <w:spacing w:after="0" w:line="252" w:lineRule="auto"/>
             </w:pPr>
             <w:r>
-              <w:t>Security Logging and Audit</w:t>
+              <w:t>Security Audit</w:t>
             </w:r>
           </w:p>
         </w:tc>
@@ -38033,7 +38916,7 @@
               <w:spacing w:after="0" w:line="252" w:lineRule="auto"/>
             </w:pPr>
             <w:r>
-              <w:t>Planned</w:t>
+              <w:t>Implemented</w:t>
             </w:r>
           </w:p>
         </w:tc>
@@ -38066,7 +38949,7 @@
               <w:spacing w:after="0" w:line="252" w:lineRule="auto"/>
             </w:pPr>
             <w:r>
-              <w:t>Infrastructure dependency management</w:t>
+              <w:t>Infrastructure dependencies</w:t>
             </w:r>
           </w:p>
         </w:tc>
@@ -38080,7 +38963,7 @@
               <w:spacing w:after="0" w:line="252" w:lineRule="auto"/>
             </w:pPr>
             <w:r>
-              <w:t>Deployment / Operations</w:t>
+              <w:t>Operations</w:t>
             </w:r>
           </w:p>
         </w:tc>
@@ -38094,7 +38977,7 @@
               <w:spacing w:after="0" w:line="252" w:lineRule="auto"/>
             </w:pPr>
             <w:r>
-              <w:t>Post-update checks</w:t>
+              <w:t>Container and post-update checks</w:t>
             </w:r>
           </w:p>
         </w:tc>
@@ -38108,7 +38991,7 @@
               <w:spacing w:after="0" w:line="252" w:lineRule="auto"/>
             </w:pPr>
             <w:r>
-              <w:t>Infrastructure Dependency Management</w:t>
+              <w:t>Infrastructure</w:t>
             </w:r>
           </w:p>
         </w:tc>
@@ -38122,7 +39005,7 @@
               <w:spacing w:after="0" w:line="252" w:lineRule="auto"/>
             </w:pPr>
             <w:r>
-              <w:t>Planned</w:t>
+              <w:t>Implemented; staging pending</w:t>
             </w:r>
           </w:p>
         </w:tc>
@@ -38155,7 +39038,7 @@
               <w:spacing w:after="0" w:line="252" w:lineRule="auto"/>
             </w:pPr>
             <w:r>
-              <w:t>Confidential data management</w:t>
+              <w:t>Confidential data</w:t>
             </w:r>
           </w:p>
         </w:tc>
@@ -38169,7 +39052,7 @@
               <w:spacing w:after="0" w:line="252" w:lineRule="auto"/>
             </w:pPr>
             <w:r>
-              <w:t>Security / Configuration</w:t>
+              <w:t>Security</w:t>
             </w:r>
           </w:p>
         </w:tc>
@@ -38183,7 +39066,7 @@
               <w:spacing w:after="0" w:line="252" w:lineRule="auto"/>
             </w:pPr>
             <w:r>
-              <w:t>Release readiness checks</w:t>
+              <w:t>Encryption and secret-scan tests</w:t>
             </w:r>
           </w:p>
         </w:tc>
@@ -38197,7 +39080,7 @@
               <w:spacing w:after="0" w:line="252" w:lineRule="auto"/>
             </w:pPr>
             <w:r>
-              <w:t>Confidential Data Policy</w:t>
+              <w:t>Data Policy</w:t>
             </w:r>
           </w:p>
         </w:tc>
@@ -38211,7 +39094,7 @@
               <w:spacing w:after="0" w:line="252" w:lineRule="auto"/>
             </w:pPr>
             <w:r>
-              <w:t>Planned</w:t>
+              <w:t>Implemented</w:t>
             </w:r>
           </w:p>
         </w:tc>
@@ -38244,7 +39127,7 @@
               <w:spacing w:after="0" w:line="252" w:lineRule="auto"/>
             </w:pPr>
             <w:r>
-              <w:t>Specification index and documentation maintenance</w:t>
+              <w:t>Documentation maintenance</w:t>
             </w:r>
           </w:p>
         </w:tc>
@@ -38272,7 +39155,7 @@
               <w:spacing w:after="0" w:line="252" w:lineRule="auto"/>
             </w:pPr>
             <w:r>
-              <w:t>Release readiness checks</w:t>
+              <w:t>Unified build and release review</w:t>
             </w:r>
           </w:p>
         </w:tc>
@@ -38286,7 +39169,7 @@
               <w:spacing w:after="0" w:line="252" w:lineRule="auto"/>
             </w:pPr>
             <w:r>
-              <w:t>Specification Index</w:t>
+              <w:t>Spec Index</w:t>
             </w:r>
           </w:p>
         </w:tc>
@@ -38300,7 +39183,7 @@
               <w:spacing w:after="0" w:line="252" w:lineRule="auto"/>
             </w:pPr>
             <w:r>
-              <w:t>Planned</w:t>
+              <w:t>Implemented</w:t>
             </w:r>
           </w:p>
         </w:tc>
@@ -38333,7 +39216,7 @@
               <w:spacing w:after="0" w:line="252" w:lineRule="auto"/>
             </w:pPr>
             <w:r>
-              <w:t>Environment configuration and secrets control</w:t>
+              <w:t>Environment and secrets</w:t>
             </w:r>
           </w:p>
         </w:tc>
@@ -38347,7 +39230,7 @@
               <w:spacing w:after="0" w:line="252" w:lineRule="auto"/>
             </w:pPr>
             <w:r>
-              <w:t>Configuration / Security</w:t>
+              <w:t>Configuration</w:t>
             </w:r>
           </w:p>
         </w:tc>
@@ -38361,7 +39244,7 @@
               <w:spacing w:after="0" w:line="252" w:lineRule="auto"/>
             </w:pPr>
             <w:r>
-              <w:t>Release readiness checks</w:t>
+              <w:t>Config and deploy-validator tests</w:t>
             </w:r>
           </w:p>
         </w:tc>
@@ -38375,7 +39258,7 @@
               <w:spacing w:after="0" w:line="252" w:lineRule="auto"/>
             </w:pPr>
             <w:r>
-              <w:t>Environment Configuration and Secrets Control</w:t>
+              <w:t>Environment</w:t>
             </w:r>
           </w:p>
         </w:tc>
@@ -38389,7 +39272,7 @@
               <w:spacing w:after="0" w:line="252" w:lineRule="auto"/>
             </w:pPr>
             <w:r>
-              <w:t>Planned</w:t>
+              <w:t>Implemented</w:t>
             </w:r>
           </w:p>
         </w:tc>
@@ -38422,7 +39305,7 @@
               <w:spacing w:after="0" w:line="252" w:lineRule="auto"/>
             </w:pPr>
             <w:r>
-              <w:t>Technical debt management</w:t>
+              <w:t>Technical debt</w:t>
             </w:r>
           </w:p>
         </w:tc>
@@ -38436,7 +39319,7 @@
               <w:spacing w:after="0" w:line="252" w:lineRule="auto"/>
             </w:pPr>
             <w:r>
-              <w:t>Development / Maintenance</w:t>
+              <w:t>Development</w:t>
             </w:r>
           </w:p>
         </w:tc>
@@ -38450,7 +39333,7 @@
               <w:spacing w:after="0" w:line="252" w:lineRule="auto"/>
             </w:pPr>
             <w:r>
-              <w:t>Release readiness checks</w:t>
+              <w:t>Release readiness review</w:t>
             </w:r>
           </w:p>
         </w:tc>
@@ -38464,7 +39347,7 @@
               <w:spacing w:after="0" w:line="252" w:lineRule="auto"/>
             </w:pPr>
             <w:r>
-              <w:t>Technical Debt Management</w:t>
+              <w:t>Technical Debt</w:t>
             </w:r>
           </w:p>
         </w:tc>
@@ -38478,7 +39361,7 @@
               <w:spacing w:after="0" w:line="252" w:lineRule="auto"/>
             </w:pPr>
             <w:r>
-              <w:t>Planned</w:t>
+              <w:t>Process defined</w:t>
             </w:r>
           </w:p>
         </w:tc>
@@ -38511,7 +39394,7 @@
               <w:spacing w:after="0" w:line="252" w:lineRule="auto"/>
             </w:pPr>
             <w:r>
-              <w:t>License and third-party component management</w:t>
+              <w:t>Licenses and components</w:t>
             </w:r>
           </w:p>
         </w:tc>
@@ -38525,7 +39408,7 @@
               <w:spacing w:after="0" w:line="252" w:lineRule="auto"/>
             </w:pPr>
             <w:r>
-              <w:t>Dependencies / Release</w:t>
+              <w:t>Dependencies</w:t>
             </w:r>
           </w:p>
         </w:tc>
@@ -38539,7 +39422,7 @@
               <w:spacing w:after="0" w:line="252" w:lineRule="auto"/>
             </w:pPr>
             <w:r>
-              <w:t>Release readiness checks</w:t>
+              <w:t>Dependency and release review</w:t>
             </w:r>
           </w:p>
         </w:tc>
@@ -38553,7 +39436,7 @@
               <w:spacing w:after="0" w:line="252" w:lineRule="auto"/>
             </w:pPr>
             <w:r>
-              <w:t>License and Third-Party Component Management</w:t>
+              <w:t>Licenses</w:t>
             </w:r>
           </w:p>
         </w:tc>
@@ -38567,7 +39450,7 @@
               <w:spacing w:after="0" w:line="252" w:lineRule="auto"/>
             </w:pPr>
             <w:r>
-              <w:t>Planned</w:t>
+              <w:t>Process defined</w:t>
             </w:r>
           </w:p>
         </w:tc>
@@ -38600,7 +39483,7 @@
               <w:spacing w:after="0" w:line="252" w:lineRule="auto"/>
             </w:pPr>
             <w:r>
-              <w:t>API versioning and client compatibility</w:t>
+              <w:t>API compatibility</w:t>
             </w:r>
           </w:p>
         </w:tc>
@@ -38614,7 +39497,7 @@
               <w:spacing w:after="0" w:line="252" w:lineRule="auto"/>
             </w:pPr>
             <w:r>
-              <w:t>REST API / OpenAPI</w:t>
+              <w:t>REST / OpenAPI</w:t>
             </w:r>
           </w:p>
         </w:tc>
@@ -38628,7 +39511,7 @@
               <w:spacing w:after="0" w:line="252" w:lineRule="auto"/>
             </w:pPr>
             <w:r>
-              <w:t>Compatibility checks</w:t>
+              <w:t>OpenAPI checker and API tests</w:t>
             </w:r>
           </w:p>
         </w:tc>
@@ -38642,7 +39525,7 @@
               <w:spacing w:after="0" w:line="252" w:lineRule="auto"/>
             </w:pPr>
             <w:r>
-              <w:t>API Versioning and Client Compatibility</w:t>
+              <w:t>API Versioning</w:t>
             </w:r>
           </w:p>
         </w:tc>
@@ -38656,7 +39539,7 @@
               <w:spacing w:after="0" w:line="252" w:lineRule="auto"/>
             </w:pPr>
             <w:r>
-              <w:t>Planned</w:t>
+              <w:t>Implemented</w:t>
             </w:r>
           </w:p>
         </w:tc>
@@ -38689,7 +39572,7 @@
               <w:spacing w:after="0" w:line="252" w:lineRule="auto"/>
             </w:pPr>
             <w:r>
-              <w:t>Final implementation roadmap</w:t>
+              <w:t>Implementation roadmap</w:t>
             </w:r>
           </w:p>
         </w:tc>
@@ -38703,7 +39586,7 @@
               <w:spacing w:after="0" w:line="252" w:lineRule="auto"/>
             </w:pPr>
             <w:r>
-              <w:t>Delivery / Release</w:t>
+              <w:t>Delivery</w:t>
             </w:r>
           </w:p>
         </w:tc>
@@ -38731,7 +39614,7 @@
               <w:spacing w:after="0" w:line="252" w:lineRule="auto"/>
             </w:pPr>
             <w:r>
-              <w:t>Implementation Roadmap</w:t>
+              <w:t>Roadmap</w:t>
             </w:r>
           </w:p>
         </w:tc>
@@ -38745,7 +39628,7 @@
               <w:spacing w:after="0" w:line="252" w:lineRule="auto"/>
             </w:pPr>
             <w:r>
-              <w:t>Planned</w:t>
+              <w:t>Stages 1-9 done; stage 10 pending</w:t>
             </w:r>
           </w:p>
         </w:tc>
@@ -38757,7 +39640,7 @@
         <w:pStyle w:val="Heading2"/>
       </w:pPr>
       <w:r>
-        <w:t>66.3. Maintenance Rules</w:t>
+        <w:t>67.3. Maintenance Rules</w:t>
       </w:r>
     </w:p>
     <w:p>
@@ -38813,7 +39696,7 @@
         <w:pStyle w:val="Heading2"/>
       </w:pPr>
       <w:r>
-        <w:t>66.4. Completion Criterion</w:t>
+        <w:t>67.4. Completion Criterion</w:t>
       </w:r>
     </w:p>
     <w:p>
@@ -38836,7 +39719,7 @@
         <w:pStyle w:val="Heading1"/>
       </w:pPr>
       <w:r>
-        <w:t>67. Glossary and Naming Conventions</w:t>
+        <w:t>68. Glossary and Naming Conventions</w:t>
       </w:r>
     </w:p>
     <w:p>
@@ -38849,7 +39732,7 @@
         <w:pStyle w:val="Heading2"/>
       </w:pPr>
       <w:r>
-        <w:t>67.1. Glossary</w:t>
+        <w:t>68.1. Glossary</w:t>
       </w:r>
     </w:p>
     <w:tbl>
@@ -39276,7 +40159,7 @@
         <w:pStyle w:val="Heading2"/>
       </w:pPr>
       <w:r>
-        <w:t>67.2. Naming Conventions</w:t>
+        <w:t>68.2. Naming Conventions</w:t>
       </w:r>
     </w:p>
     <w:p>
@@ -39340,7 +40223,7 @@
         <w:pStyle w:val="Heading2"/>
       </w:pPr>
       <w:r>
-        <w:t>67.3. Entity Names</w:t>
+        <w:t>68.3. Entity Names</w:t>
       </w:r>
     </w:p>
     <w:p>
@@ -39772,7 +40655,7 @@
         <w:pStyle w:val="Heading2"/>
       </w:pPr>
       <w:r>
-        <w:t>67.4. Consistency Rule</w:t>
+        <w:t>68.4. Consistency Rule</w:t>
       </w:r>
     </w:p>
     <w:p>
@@ -39800,7 +40683,7 @@
         <w:pStyle w:val="Heading1"/>
       </w:pPr>
       <w:r>
-        <w:t>68. Specification Index</w:t>
+        <w:t>69. Specification Index</w:t>
       </w:r>
     </w:p>
     <w:p>
@@ -39818,7 +40701,7 @@
         <w:pStyle w:val="Heading2"/>
       </w:pPr>
       <w:r>
-        <w:t>68.1. Purpose</w:t>
+        <w:t>69.1. Purpose</w:t>
       </w:r>
     </w:p>
     <w:p>
@@ -39879,7 +40762,7 @@
         <w:pStyle w:val="Heading2"/>
       </w:pPr>
       <w:r>
-        <w:t>68.2. Core Specification Groups</w:t>
+        <w:t>69.2. Core Specification Groups</w:t>
       </w:r>
     </w:p>
     <w:tbl>
@@ -40273,7 +41156,7 @@
         <w:pStyle w:val="Heading2"/>
       </w:pPr>
       <w:r>
-        <w:t>68.3. Documentation Maintenance Rules</w:t>
+        <w:t>69.3. Documentation Maintenance Rules</w:t>
       </w:r>
     </w:p>
     <w:p>
@@ -40337,7 +41220,7 @@
         <w:pStyle w:val="Heading2"/>
       </w:pPr>
       <w:r>
-        <w:t>68.4. Completeness Control</w:t>
+        <w:t>69.4. Completeness Control</w:t>
       </w:r>
     </w:p>
     <w:p>
@@ -40438,7 +41321,7 @@
         <w:pStyle w:val="Heading2"/>
       </w:pPr>
       <w:r>
-        <w:t>68.5. Release Rule</w:t>
+        <w:t>69.5. Release Rule</w:t>
       </w:r>
     </w:p>
     <w:p>
@@ -40451,7 +41334,7 @@
         <w:pStyle w:val="Heading2"/>
       </w:pPr>
       <w:r>
-        <w:t>68.6. Final Statement</w:t>
+        <w:t>69.6. Final Statement</w:t>
       </w:r>
     </w:p>
     <w:p>
@@ -40474,7 +41357,7 @@
         <w:pStyle w:val="Heading1"/>
       </w:pPr>
       <w:r>
-        <w:t>69. Risk Management</w:t>
+        <w:t>70. Risk Management</w:t>
       </w:r>
     </w:p>
     <w:p>
@@ -40487,7 +41370,7 @@
         <w:pStyle w:val="Heading2"/>
       </w:pPr>
       <w:r>
-        <w:t>69.1. Operational Constraints</w:t>
+        <w:t>70.1. Operational Constraints</w:t>
       </w:r>
     </w:p>
     <w:p>
@@ -40535,7 +41418,7 @@
         <w:pStyle w:val="Heading2"/>
       </w:pPr>
       <w:r>
-        <w:t>69.2. Risk Register</w:t>
+        <w:t>70.2. Risk Register</w:t>
       </w:r>
     </w:p>
     <w:tbl>
@@ -40863,7 +41746,7 @@
         <w:pStyle w:val="Heading2"/>
       </w:pPr>
       <w:r>
-        <w:t>69.3. Change Control</w:t>
+        <w:t>70.3. Change Control</w:t>
       </w:r>
     </w:p>
     <w:p>
@@ -40932,7 +41815,7 @@
         <w:pStyle w:val="Heading2"/>
       </w:pPr>
       <w:r>
-        <w:t>69.4. Resilience Criteria</w:t>
+        <w:t>70.4. Resilience Criteria</w:t>
       </w:r>
     </w:p>
     <w:p>

</xml_diff>

<commit_message>
build: prepare reproducible release candidate
</commit_message>
<xml_diff>
--- a/docs/final/Tik_Tok_Loader_Unified_Specification.docx
+++ b/docs/final/Tik_Tok_Loader_Unified_Specification.docx
@@ -39,7 +39,7 @@
         <w:jc w:val="center"/>
       </w:pPr>
       <w:r>
-        <w:t>Версия: 0.7.0</w:t>
+        <w:t>Версия: 0.8.0</w:t>
         <w:br/>
         <w:t>Репозиторий: kredavto/Tik-Tok-bot-Rus-2</w:t>
         <w:br/>
@@ -3065,6 +3065,16 @@
       </w:r>
     </w:p>
     <w:p>
+      <w:r>
+        <w:t>Release candidate `0.2.0-rc.1` adds deterministic source evidence and cannot be deployed to</w:t>
+      </w:r>
+    </w:p>
+    <w:p>
+      <w:r>
+        <w:t>production until it is accepted in staging and promoted to a stable version.</w:t>
+      </w:r>
+    </w:p>
+    <w:p>
       <w:pPr>
         <w:pStyle w:val="Heading2"/>
       </w:pPr>
@@ -22561,6 +22571,21 @@
     </w:p>
     <w:p>
       <w:r>
+        <w:t>The checked-out application version must equal `APP_VERSION` in `.env`. A release candidate such as</w:t>
+      </w:r>
+    </w:p>
+    <w:p>
+      <w:r>
+        <w:t>`0.2.0-rc.1` is accepted for staging and rejected for production until promoted to a stable SemVer.</w:t>
+      </w:r>
+    </w:p>
+    <w:p>
+      <w:r>
+        <w:t>Each deployment records a deterministic source manifest under `.deploy/release-manifest.json`.</w:t>
+      </w:r>
+    </w:p>
+    <w:p>
+      <w:r>
         <w:t>The complete certificate bootstrap, deployment, backup, restore, rollback, and CI procedure is in</w:t>
       </w:r>
     </w:p>
@@ -22887,7 +22912,7 @@
     </w:p>
     <w:p>
       <w:r>
-        <w:t>GitHub Actions runs three jobs:</w:t>
+        <w:t>GitHub Actions runs four jobs:</w:t>
       </w:r>
     </w:p>
     <w:p>
@@ -22935,13 +22960,36 @@
       </w:r>
     </w:p>
     <w:p>
-      <w:r>
-        <w:t>The container job starts only after the quality and integration jobs pass. The workflow has</w:t>
-      </w:r>
-    </w:p>
-    <w:p>
-      <w:r>
-        <w:t>read-only repository permissions and cancels superseded runs for the same branch or pull request.</w:t>
+      <w:pPr>
+        <w:pStyle w:val="ListBullet"/>
+      </w:pPr>
+      <w:r>
+        <w:t>`Release candidate manifest`: runs only after the preceding jobs, validates version consistency</w:t>
+      </w:r>
+    </w:p>
+    <w:p>
+      <w:r>
+        <w:t xml:space="preserve">  and migration topology, hashes the tracked source tree, and uploads deterministic release</w:t>
+      </w:r>
+    </w:p>
+    <w:p>
+      <w:r>
+        <w:t xml:space="preserve">  evidence for 30 days.</w:t>
+      </w:r>
+    </w:p>
+    <w:p>
+      <w:r>
+        <w:t>The container job starts only after the quality and integration jobs pass. Manifest generation</w:t>
+      </w:r>
+    </w:p>
+    <w:p>
+      <w:r>
+        <w:t>starts only after all three preceding jobs pass. The workflow has read-only repository permissions</w:t>
+      </w:r>
+    </w:p>
+    <w:p>
+      <w:r>
+        <w:t>and cancels superseded runs for the same branch or pull request.</w:t>
       </w:r>
     </w:p>
     <w:p>
@@ -23218,6 +23266,14 @@
         <w:pStyle w:val="ListBullet"/>
       </w:pPr>
       <w:r>
+        <w:t>verifies version consistency and writes `.deploy/release-manifest.json` before image construction;</w:t>
+      </w:r>
+    </w:p>
+    <w:p>
+      <w:pPr>
+        <w:pStyle w:val="ListBullet"/>
+      </w:pPr>
+      <w:r>
         <w:t>builds images with refreshed base layers;</w:t>
       </w:r>
     </w:p>
@@ -23299,6 +23355,16 @@
     <w:p>
       <w:r>
         <w:t>Staging Acceptance Runbook.</w:t>
+      </w:r>
+    </w:p>
+    <w:p>
+      <w:r>
+        <w:t>The deterministic artifact contract is defined in</w:t>
+      </w:r>
+    </w:p>
+    <w:p>
+      <w:r>
+        <w:t>Release Candidate Manifest.</w:t>
       </w:r>
     </w:p>
     <w:p>
@@ -23767,6 +23833,14 @@
       </w:pPr>
       <w:r>
         <w:t>The release commit passed all GitHub Actions jobs.</w:t>
+      </w:r>
+    </w:p>
+    <w:p>
+      <w:pPr>
+        <w:pStyle w:val="ListBullet"/>
+      </w:pPr>
+      <w:r>
+        <w:t>The CI run contains the `release-candidate-manifest` artifact for the same full Git SHA.</w:t>
       </w:r>
     </w:p>
     <w:p>
@@ -23864,7 +23938,12 @@
     </w:p>
     <w:p>
       <w:r>
-        <w:t>configures the Telegram webhook, and runs public smoke tests.</w:t>
+        <w:t>configures the Telegram webhook, runs public smoke tests, and writes the server-side release</w:t>
+      </w:r>
+    </w:p>
+    <w:p>
+      <w:r>
+        <w:t>manifest before image construction.</w:t>
       </w:r>
     </w:p>
     <w:p>
@@ -24476,6 +24555,14 @@
         <w:pStyle w:val="ListBullet"/>
       </w:pPr>
       <w:r>
+        <w:t>release-candidate manifest filename and aggregate source-tree SHA-256;</w:t>
+      </w:r>
+    </w:p>
+    <w:p>
+      <w:pPr>
+        <w:pStyle w:val="ListBullet"/>
+      </w:pPr>
+      <w:r>
         <w:t>GitHub Actions run URL;</w:t>
       </w:r>
     </w:p>
@@ -24552,7 +24639,12 @@
     </w:p>
     <w:p>
       <w:r>
-        <w:t>decision.</w:t>
+        <w:t>decision. The accepted prerelease must be promoted to a stable SemVer and pass CI again before</w:t>
+      </w:r>
+    </w:p>
+    <w:p>
+      <w:r>
+        <w:t>production deployment.</w:t>
       </w:r>
     </w:p>
     <w:p>
@@ -36053,7 +36145,7 @@
         <w:pStyle w:val="Heading1"/>
       </w:pPr>
       <w:r>
-        <w:t>63. Release Management</w:t>
+        <w:t>63. Release Candidate Manifest</w:t>
       </w:r>
     </w:p>
     <w:p>
@@ -36062,11 +36154,351 @@
       </w:r>
     </w:p>
     <w:p>
+      <w:r>
+        <w:t>The release candidate manifest is deterministic, secret-free evidence that identifies the exact</w:t>
+      </w:r>
+    </w:p>
+    <w:p>
+      <w:r>
+        <w:t>source tree proposed for staging. It complements CI results and provider-backed acceptance records;</w:t>
+      </w:r>
+    </w:p>
+    <w:p>
+      <w:r>
+        <w:t>it does not replace either of them.</w:t>
+      </w:r>
+    </w:p>
+    <w:p>
       <w:pPr>
         <w:pStyle w:val="Heading2"/>
       </w:pPr>
       <w:r>
-        <w:t>63.1. Environments</w:t>
+        <w:t>63.1. Current Candidate</w:t>
+      </w:r>
+    </w:p>
+    <w:p>
+      <w:r>
+        <w:t>The current prerelease version is `0.2.0-rc.1`. The version is synchronized across</w:t>
+      </w:r>
+    </w:p>
+    <w:p>
+      <w:r>
+        <w:t>`pyproject.toml`, `app.__version__`, the application configuration default, and all environment</w:t>
+      </w:r>
+    </w:p>
+    <w:p>
+      <w:r>
+        <w:t>templates. `CHANGELOG.md` contains a matching release heading.</w:t>
+      </w:r>
+    </w:p>
+    <w:p>
+      <w:r>
+        <w:t>Prerelease versions may be built in CI and deployed to staging. The manifest builder rejects a</w:t>
+      </w:r>
+    </w:p>
+    <w:p>
+      <w:r>
+        <w:t>prerelease when the supplied runtime environment contains `APP_ENV=production`. Production</w:t>
+      </w:r>
+    </w:p>
+    <w:p>
+      <w:r>
+        <w:t>promotion requires a stable version such as `0.2.0`, a matching changelog heading, a new successful</w:t>
+      </w:r>
+    </w:p>
+    <w:p>
+      <w:r>
+        <w:t>CI run, and explicit release approval.</w:t>
+      </w:r>
+    </w:p>
+    <w:p>
+      <w:pPr>
+        <w:pStyle w:val="Heading2"/>
+      </w:pPr>
+      <w:r>
+        <w:t>63.2. Manifest Contents</w:t>
+      </w:r>
+    </w:p>
+    <w:p>
+      <w:r>
+        <w:t>The JSON artifact contains:</w:t>
+      </w:r>
+    </w:p>
+    <w:p>
+      <w:pPr>
+        <w:pStyle w:val="ListBullet"/>
+      </w:pPr>
+      <w:r>
+        <w:t>schema version, project name, application version, and release channel;</w:t>
+      </w:r>
+    </w:p>
+    <w:p>
+      <w:pPr>
+        <w:pStyle w:val="ListBullet"/>
+      </w:pPr>
+      <w:r>
+        <w:t>target environment when a runtime `.env` is supplied;</w:t>
+      </w:r>
+    </w:p>
+    <w:p>
+      <w:pPr>
+        <w:pStyle w:val="ListBullet"/>
+      </w:pPr>
+      <w:r>
+        <w:t>full Git commit SHA and deterministic commit timestamp;</w:t>
+      </w:r>
+    </w:p>
+    <w:p>
+      <w:pPr>
+        <w:pStyle w:val="ListBullet"/>
+      </w:pPr>
+      <w:r>
+        <w:t>path, byte size, and SHA-256 digest for every tracked source file;</w:t>
+      </w:r>
+    </w:p>
+    <w:p>
+      <w:pPr>
+        <w:pStyle w:val="ListBullet"/>
+      </w:pPr>
+      <w:r>
+        <w:t>aggregate SHA-256 digest for the tracked source tree;</w:t>
+      </w:r>
+    </w:p>
+    <w:p>
+      <w:pPr>
+        <w:pStyle w:val="ListBullet"/>
+      </w:pPr>
+      <w:r>
+        <w:t>the single Alembic head and migration count;</w:t>
+      </w:r>
+    </w:p>
+    <w:p>
+      <w:pPr>
+        <w:pStyle w:val="ListBullet"/>
+      </w:pPr>
+      <w:r>
+        <w:t>the list of required quality gates; and</w:t>
+      </w:r>
+    </w:p>
+    <w:p>
+      <w:pPr>
+        <w:pStyle w:val="ListBullet"/>
+      </w:pPr>
+      <w:r>
+        <w:t>version-source identifiers and their common non-secret version value.</w:t>
+      </w:r>
+    </w:p>
+    <w:p>
+      <w:r>
+        <w:t>The artifact never copies file contents, environment values other than `APP_ENV` and</w:t>
+      </w:r>
+    </w:p>
+    <w:p>
+      <w:r>
+        <w:t>`APP_VERSION`, tokens, passwords, signatures, OAuth payloads, or payment data.</w:t>
+      </w:r>
+    </w:p>
+    <w:p>
+      <w:pPr>
+        <w:pStyle w:val="Heading2"/>
+      </w:pPr>
+      <w:r>
+        <w:t>63.3. Local Generation</w:t>
+      </w:r>
+    </w:p>
+    <w:p>
+      <w:r>
+        <w:t>Generate evidence only from a clean tracked worktree:</w:t>
+      </w:r>
+    </w:p>
+    <w:p>
+      <w:pPr>
+        <w:spacing w:after="160"/>
+        <w:ind w:left="216"/>
+      </w:pPr>
+      <w:r>
+        <w:rPr>
+          <w:rFonts w:ascii="Courier New" w:hAnsi="Courier New"/>
+          <w:sz w:val="17"/>
+        </w:rPr>
+        <w:t>python tools/build_release_candidate.py</w:t>
+      </w:r>
+    </w:p>
+    <w:p>
+      <w:r>
+        <w:t>The default output is written under ignored `dist/release/`. For a staging deployment:</w:t>
+      </w:r>
+    </w:p>
+    <w:p>
+      <w:pPr>
+        <w:spacing w:after="160"/>
+        <w:ind w:left="216"/>
+      </w:pPr>
+      <w:r>
+        <w:rPr>
+          <w:rFonts w:ascii="Courier New" w:hAnsi="Courier New"/>
+          <w:sz w:val="17"/>
+        </w:rPr>
+        <w:t>python tools/build_release_candidate.py \</w:t>
+        <w:br/>
+        <w:t xml:space="preserve">  --env-file .env \</w:t>
+        <w:br/>
+        <w:t xml:space="preserve">  --output .deploy/release-manifest.json</w:t>
+      </w:r>
+    </w:p>
+    <w:p>
+      <w:r>
+        <w:t>`--allow-dirty` is available only for development diagnostics. A manifest created with that option</w:t>
+      </w:r>
+    </w:p>
+    <w:p>
+      <w:r>
+        <w:t>is not release evidence because its Git SHA may not describe working-tree changes.</w:t>
+      </w:r>
+    </w:p>
+    <w:p>
+      <w:pPr>
+        <w:pStyle w:val="Heading2"/>
+      </w:pPr>
+      <w:r>
+        <w:t>63.4. CI and Deployment</w:t>
+      </w:r>
+    </w:p>
+    <w:p>
+      <w:r>
+        <w:t>GitHub Actions creates `release-candidate-manifest` only after quality, PostgreSQL integration,</w:t>
+      </w:r>
+    </w:p>
+    <w:p>
+      <w:r>
+        <w:t>migration, coverage, container-build, and non-root checks succeed. The artifact is retained for 30</w:t>
+      </w:r>
+    </w:p>
+    <w:p>
+      <w:r>
+        <w:t>days and is attached to the exact workflow commit.</w:t>
+      </w:r>
+    </w:p>
+    <w:p>
+      <w:r>
+        <w:t>The deployment script regenerates `.deploy/release-manifest.json` after checking out the requested</w:t>
+      </w:r>
+    </w:p>
+    <w:p>
+      <w:r>
+        <w:t>commit and before building the application image. It also compares the server-side `APP_VERSION`</w:t>
+      </w:r>
+    </w:p>
+    <w:p>
+      <w:r>
+        <w:t>with every version source. A mismatch, dirty tracked tree, invalid SemVer, multiple Alembic heads,</w:t>
+      </w:r>
+    </w:p>
+    <w:p>
+      <w:r>
+        <w:t>or production prerelease stops deployment before image construction.</w:t>
+      </w:r>
+    </w:p>
+    <w:p>
+      <w:pPr>
+        <w:pStyle w:val="Heading2"/>
+      </w:pPr>
+      <w:r>
+        <w:t>63.5. Staging Evidence</w:t>
+      </w:r>
+    </w:p>
+    <w:p>
+      <w:r>
+        <w:t>Record these values in the staging acceptance result:</w:t>
+      </w:r>
+    </w:p>
+    <w:p>
+      <w:pPr>
+        <w:pStyle w:val="ListBullet"/>
+      </w:pPr>
+      <w:r>
+        <w:t>manifest filename and artifact URL;</w:t>
+      </w:r>
+    </w:p>
+    <w:p>
+      <w:pPr>
+        <w:pStyle w:val="ListBullet"/>
+      </w:pPr>
+      <w:r>
+        <w:t>application version and full Git SHA;</w:t>
+      </w:r>
+    </w:p>
+    <w:p>
+      <w:pPr>
+        <w:pStyle w:val="ListBullet"/>
+      </w:pPr>
+      <w:r>
+        <w:t>aggregate source-tree SHA-256;</w:t>
+      </w:r>
+    </w:p>
+    <w:p>
+      <w:pPr>
+        <w:pStyle w:val="ListBullet"/>
+      </w:pPr>
+      <w:r>
+        <w:t>Alembic head;</w:t>
+      </w:r>
+    </w:p>
+    <w:p>
+      <w:pPr>
+        <w:pStyle w:val="ListBullet"/>
+      </w:pPr>
+      <w:r>
+        <w:t>CI workflow URL; and</w:t>
+      </w:r>
+    </w:p>
+    <w:p>
+      <w:pPr>
+        <w:pStyle w:val="ListBullet"/>
+      </w:pPr>
+      <w:r>
+        <w:t>sanitized acceptance outcomes from the staging runbook.</w:t>
+      </w:r>
+    </w:p>
+    <w:p>
+      <w:r>
+        <w:t>The production approver must be able to match the promoted stable commit to the accepted release</w:t>
+      </w:r>
+    </w:p>
+    <w:p>
+      <w:r>
+        <w:t>candidate and review every change introduced during promotion.</w:t>
+      </w:r>
+    </w:p>
+    <w:p>
+      <w:pPr>
+        <w:sectPr>
+          <w:pgSz w:w="12240" w:h="15840"/>
+          <w:pgMar w:top="1440" w:right="1440" w:bottom="1440" w:left="1440" w:header="708" w:footer="708" w:gutter="0"/>
+          <w:cols w:space="720"/>
+          <w:docGrid w:linePitch="360"/>
+        </w:sectPr>
+      </w:pPr>
+    </w:p>
+    <w:p>
+      <w:pPr>
+        <w:pStyle w:val="Heading1"/>
+      </w:pPr>
+      <w:r>
+        <w:t>64. Release Management</w:t>
+      </w:r>
+    </w:p>
+    <w:p>
+      <w:r>
+        <w:t>Группа спецификации: Релизы</w:t>
+      </w:r>
+    </w:p>
+    <w:p>
+      <w:pPr>
+        <w:pStyle w:val="Heading2"/>
+      </w:pPr>
+      <w:r>
+        <w:t>64.1. Environments</w:t>
       </w:r>
     </w:p>
     <w:tbl>
@@ -36234,7 +36666,7 @@
         <w:pStyle w:val="Heading2"/>
       </w:pPr>
       <w:r>
-        <w:t>63.2. Release Requirements</w:t>
+        <w:t>64.2. Release Requirements</w:t>
       </w:r>
     </w:p>
     <w:p>
@@ -36322,7 +36754,7 @@
         <w:pStyle w:val="Heading2"/>
       </w:pPr>
       <w:r>
-        <w:t>63.3. Release Flow</w:t>
+        <w:t>64.3. Release Flow</w:t>
       </w:r>
     </w:p>
     <w:p>
@@ -36330,7 +36762,7 @@
         <w:pStyle w:val="ListNumber"/>
       </w:pPr>
       <w:r>
-        <w:t>Create a release branch.</w:t>
+        <w:t>Create a release branch and assign a SemVer prerelease such as `0.2.0-rc.1`.</w:t>
       </w:r>
     </w:p>
     <w:p>
@@ -36338,7 +36770,7 @@
         <w:pStyle w:val="ListNumber"/>
       </w:pPr>
       <w:r>
-        <w:t>Update version and changelog.</w:t>
+        <w:t>Synchronize version sources and update the changelog.</w:t>
       </w:r>
     </w:p>
     <w:p>
@@ -36346,7 +36778,7 @@
         <w:pStyle w:val="ListNumber"/>
       </w:pPr>
       <w:r>
-        <w:t>Run CI checks.</w:t>
+        <w:t>Run CI and retain the deterministic release-candidate manifest.</w:t>
       </w:r>
     </w:p>
     <w:p>
@@ -36354,7 +36786,7 @@
         <w:pStyle w:val="ListNumber"/>
       </w:pPr>
       <w:r>
-        <w:t>Deploy to staging.</w:t>
+        <w:t>Deploy the candidate to staging.</w:t>
       </w:r>
     </w:p>
     <w:p>
@@ -36362,7 +36794,7 @@
         <w:pStyle w:val="ListNumber"/>
       </w:pPr>
       <w:r>
-        <w:t>Run acceptance tests.</w:t>
+        <w:t>Run acceptance tests and attach sanitized evidence to the manifest record.</w:t>
       </w:r>
     </w:p>
     <w:p>
@@ -36370,7 +36802,7 @@
         <w:pStyle w:val="ListNumber"/>
       </w:pPr>
       <w:r>
-        <w:t>Approve release.</w:t>
+        <w:t>Promote the accepted source to a stable version such as `0.2.0`.</w:t>
       </w:r>
     </w:p>
     <w:p>
@@ -36378,6 +36810,14 @@
         <w:pStyle w:val="ListNumber"/>
       </w:pPr>
       <w:r>
+        <w:t>Run CI again and approve the stable release.</w:t>
+      </w:r>
+    </w:p>
+    <w:p>
+      <w:pPr>
+        <w:pStyle w:val="ListNumber"/>
+      </w:pPr>
+      <w:r>
         <w:t>Back up production.</w:t>
       </w:r>
     </w:p>
@@ -36386,7 +36826,7 @@
         <w:pStyle w:val="ListNumber"/>
       </w:pPr>
       <w:r>
-        <w:t>Deploy to production.</w:t>
+        <w:t>Deploy the stable version to production.</w:t>
       </w:r>
     </w:p>
     <w:p>
@@ -36394,15 +36834,17 @@
         <w:pStyle w:val="ListNumber"/>
       </w:pPr>
       <w:r>
-        <w:t>Check `/health`, `/ready`, `/metrics`.</w:t>
-      </w:r>
-    </w:p>
-    <w:p>
-      <w:pPr>
-        <w:pStyle w:val="ListNumber"/>
-      </w:pPr>
-      <w:r>
-        <w:t>Monitor logs and core scenarios after release.</w:t>
+        <w:t>Check `/health`, `/ready`, `/metrics` and monitor core scenarios.</w:t>
+      </w:r>
+    </w:p>
+    <w:p>
+      <w:r>
+        <w:t>Manifest generation, prerelease restrictions, and promotion evidence are defined in</w:t>
+      </w:r>
+    </w:p>
+    <w:p>
+      <w:r>
+        <w:t>Release Candidate Manifest.</w:t>
       </w:r>
     </w:p>
     <w:p>
@@ -36480,7 +36922,7 @@
         <w:pStyle w:val="Heading2"/>
       </w:pPr>
       <w:r>
-        <w:t>63.4. Production Update</w:t>
+        <w:t>64.4. Production Update</w:t>
       </w:r>
     </w:p>
     <w:p>
@@ -36497,11 +36939,16 @@
       </w:r>
     </w:p>
     <w:p>
+      <w:r>
+        <w:t>The deployment command rejects prerelease versions for `APP_ENV=production`.</w:t>
+      </w:r>
+    </w:p>
+    <w:p>
       <w:pPr>
         <w:pStyle w:val="Heading2"/>
       </w:pPr>
       <w:r>
-        <w:t>63.5. Rollback</w:t>
+        <w:t>64.5. Rollback</w:t>
       </w:r>
     </w:p>
     <w:p>
@@ -36567,7 +37014,7 @@
         <w:pStyle w:val="Heading2"/>
       </w:pPr>
       <w:r>
-        <w:t>63.6. API Compatibility</w:t>
+        <w:t>64.6. API Compatibility</w:t>
       </w:r>
     </w:p>
     <w:p>
@@ -36590,7 +37037,7 @@
         <w:pStyle w:val="Heading1"/>
       </w:pPr>
       <w:r>
-        <w:t>64. Change Acceptance Policy</w:t>
+        <w:t>65. Change Acceptance Policy</w:t>
       </w:r>
     </w:p>
     <w:p>
@@ -36603,7 +37050,7 @@
         <w:pStyle w:val="Heading2"/>
       </w:pPr>
       <w:r>
-        <w:t>64.1. Architectural Principles</w:t>
+        <w:t>65.1. Architectural Principles</w:t>
       </w:r>
     </w:p>
     <w:p>
@@ -36664,7 +37111,7 @@
         <w:pStyle w:val="Heading2"/>
       </w:pPr>
       <w:r>
-        <w:t>64.2. Change Acceptance Flow</w:t>
+        <w:t>65.2. Change Acceptance Flow</w:t>
       </w:r>
     </w:p>
     <w:p>
@@ -36774,7 +37221,7 @@
         <w:pStyle w:val="Heading2"/>
       </w:pPr>
       <w:r>
-        <w:t>64.3. Minimum Quality Criteria</w:t>
+        <w:t>65.3. Minimum Quality Criteria</w:t>
       </w:r>
     </w:p>
     <w:p>
@@ -36867,7 +37314,7 @@
         <w:pStyle w:val="Heading2"/>
       </w:pPr>
       <w:r>
-        <w:t>64.4. Regression Checks</w:t>
+        <w:t>65.4. Regression Checks</w:t>
       </w:r>
     </w:p>
     <w:p>
@@ -36949,7 +37396,7 @@
         <w:pStyle w:val="Heading2"/>
       </w:pPr>
       <w:r>
-        <w:t>64.5. Final Requirement</w:t>
+        <w:t>65.5. Final Requirement</w:t>
       </w:r>
     </w:p>
     <w:p>
@@ -36977,7 +37424,7 @@
         <w:pStyle w:val="Heading1"/>
       </w:pPr>
       <w:r>
-        <w:t>65. QA Test Data and Acceptance Scenarios</w:t>
+        <w:t>66. QA Test Data and Acceptance Scenarios</w:t>
       </w:r>
     </w:p>
     <w:p>
@@ -36995,7 +37442,7 @@
         <w:pStyle w:val="Heading2"/>
       </w:pPr>
       <w:r>
-        <w:t>65.1. Test Users</w:t>
+        <w:t>66.1. Test Users</w:t>
       </w:r>
     </w:p>
     <w:p>
@@ -37234,7 +37681,7 @@
         <w:pStyle w:val="Heading2"/>
       </w:pPr>
       <w:r>
-        <w:t>65.2. Acceptance Scenarios</w:t>
+        <w:t>66.2. Acceptance Scenarios</w:t>
       </w:r>
     </w:p>
     <w:p>
@@ -37242,7 +37689,7 @@
         <w:pStyle w:val="Heading3"/>
       </w:pPr>
       <w:r>
-        <w:t>65.2.1. QA-REG-001: New User Registration</w:t>
+        <w:t>66.2.1. QA-REG-001: New User Registration</w:t>
       </w:r>
     </w:p>
     <w:p>
@@ -37292,7 +37739,7 @@
         <w:pStyle w:val="Heading3"/>
       </w:pPr>
       <w:r>
-        <w:t>65.2.2. QA-OAUTH-001: TikTok OAuth Connection</w:t>
+        <w:t>66.2.2. QA-OAUTH-001: TikTok OAuth Connection</w:t>
       </w:r>
     </w:p>
     <w:p>
@@ -37347,7 +37794,7 @@
         <w:pStyle w:val="Heading3"/>
       </w:pPr>
       <w:r>
-        <w:t>65.2.3. QA-UPL-001: Successful Video Publication</w:t>
+        <w:t>66.2.3. QA-UPL-001: Successful Video Publication</w:t>
       </w:r>
     </w:p>
     <w:p>
@@ -37418,7 +37865,7 @@
         <w:pStyle w:val="Heading3"/>
       </w:pPr>
       <w:r>
-        <w:t>65.2.4. QA-LIMIT-001: Daily Limit Exceeded</w:t>
+        <w:t>66.2.4. QA-LIMIT-001: Daily Limit Exceeded</w:t>
       </w:r>
     </w:p>
     <w:p>
@@ -37468,7 +37915,7 @@
         <w:pStyle w:val="Heading3"/>
       </w:pPr>
       <w:r>
-        <w:t>65.2.5. QA-PAY-001: PRO Purchase Through Robokassa</w:t>
+        <w:t>66.2.5. QA-PAY-001: PRO Purchase Through Robokassa</w:t>
       </w:r>
     </w:p>
     <w:p>
@@ -37531,7 +37978,7 @@
         <w:pStyle w:val="Heading3"/>
       </w:pPr>
       <w:r>
-        <w:t>65.2.6. QA-SUB-001: Automatic Return to FREE</w:t>
+        <w:t>66.2.6. QA-SUB-001: Automatic Return to FREE</w:t>
       </w:r>
     </w:p>
     <w:p>
@@ -37581,7 +38028,7 @@
         <w:pStyle w:val="Heading3"/>
       </w:pPr>
       <w:r>
-        <w:t>65.2.7. QA-WEBHOOK-001: Repeated Webhook</w:t>
+        <w:t>66.2.7. QA-WEBHOOK-001: Repeated Webhook</w:t>
       </w:r>
     </w:p>
     <w:p>
@@ -37636,7 +38083,7 @@
         <w:pStyle w:val="Heading3"/>
       </w:pPr>
       <w:r>
-        <w:t>65.2.8. QA-QUEUE-001: Temporary Queue Failure Recovery</w:t>
+        <w:t>66.2.8. QA-QUEUE-001: Temporary Queue Failure Recovery</w:t>
       </w:r>
     </w:p>
     <w:p>
@@ -37691,7 +38138,7 @@
         <w:pStyle w:val="Heading2"/>
       </w:pPr>
       <w:r>
-        <w:t>65.3. Success Criteria</w:t>
+        <w:t>66.3. Success Criteria</w:t>
       </w:r>
     </w:p>
     <w:p>
@@ -37752,7 +38199,7 @@
         <w:pStyle w:val="Heading2"/>
       </w:pPr>
       <w:r>
-        <w:t>65.4. Release Rule</w:t>
+        <w:t>66.4. Release Rule</w:t>
       </w:r>
     </w:p>
     <w:p>
@@ -37775,7 +38222,7 @@
         <w:pStyle w:val="Heading1"/>
       </w:pPr>
       <w:r>
-        <w:t>66. Test Strategy and Quality Gates</w:t>
+        <w:t>67. Test Strategy and Quality Gates</w:t>
       </w:r>
     </w:p>
     <w:p>
@@ -37803,7 +38250,7 @@
         <w:pStyle w:val="Heading2"/>
       </w:pPr>
       <w:r>
-        <w:t>66.1. Test Layers</w:t>
+        <w:t>67.1. Test Layers</w:t>
       </w:r>
     </w:p>
     <w:tbl>
@@ -38309,7 +38756,7 @@
         <w:pStyle w:val="Heading2"/>
       </w:pPr>
       <w:r>
-        <w:t>66.2. Local Quality Commands</w:t>
+        <w:t>67.2. Local Quality Commands</w:t>
       </w:r>
     </w:p>
     <w:p>
@@ -38355,7 +38802,7 @@
         <w:pStyle w:val="Heading2"/>
       </w:pPr>
       <w:r>
-        <w:t>66.3. Coverage Policy</w:t>
+        <w:t>67.3. Coverage Policy</w:t>
       </w:r>
     </w:p>
     <w:p>
@@ -38388,7 +38835,7 @@
         <w:pStyle w:val="Heading2"/>
       </w:pPr>
       <w:r>
-        <w:t>66.4. Concurrency and Idempotency</w:t>
+        <w:t>67.4. Concurrency and Idempotency</w:t>
       </w:r>
     </w:p>
     <w:p>
@@ -38449,7 +38896,7 @@
         <w:pStyle w:val="Heading2"/>
       </w:pPr>
       <w:r>
-        <w:t>66.5. External-Service Boundary</w:t>
+        <w:t>67.5. External-Service Boundary</w:t>
       </w:r>
     </w:p>
     <w:p>
@@ -38482,7 +38929,7 @@
         <w:pStyle w:val="Heading2"/>
       </w:pPr>
       <w:r>
-        <w:t>66.6. Release Evidence</w:t>
+        <w:t>67.6. Release Evidence</w:t>
       </w:r>
     </w:p>
     <w:p>
@@ -38503,6 +38950,19 @@
         <w:pStyle w:val="ListBullet"/>
       </w:pPr>
       <w:r>
+        <w:t>A deterministic manifest whose Git SHA, source-tree hash, version, and Alembic head match the</w:t>
+      </w:r>
+    </w:p>
+    <w:p>
+      <w:r>
+        <w:t xml:space="preserve">  candidate deployed to staging.</w:t>
+      </w:r>
+    </w:p>
+    <w:p>
+      <w:pPr>
+        <w:pStyle w:val="ListBullet"/>
+      </w:pPr>
+      <w:r>
         <w:t>Current requirement-to-test links in the traceability matrix.</w:t>
       </w:r>
     </w:p>
@@ -38533,6 +38993,16 @@
     <w:p>
       <w:r>
         <w:t>Passing automated tests does not by itself authorize production launch.</w:t>
+      </w:r>
+    </w:p>
+    <w:p>
+      <w:r>
+        <w:t>The manifest format and stable-version promotion rule are documented in</w:t>
+      </w:r>
+    </w:p>
+    <w:p>
+      <w:r>
+        <w:t>Release Candidate Manifest.</w:t>
       </w:r>
     </w:p>
     <w:p>
@@ -38550,7 +39020,7 @@
         <w:pStyle w:val="Heading1"/>
       </w:pPr>
       <w:r>
-        <w:t>67. Acceptance Checklist</w:t>
+        <w:t>68. Acceptance Checklist</w:t>
       </w:r>
     </w:p>
     <w:p>
@@ -38583,7 +39053,7 @@
         <w:pStyle w:val="Heading2"/>
       </w:pPr>
       <w:r>
-        <w:t>67.1. Functional Readiness</w:t>
+        <w:t>68.1. Functional Readiness</w:t>
       </w:r>
     </w:p>
     <w:p>
@@ -38743,7 +39213,7 @@
         <w:pStyle w:val="Heading2"/>
       </w:pPr>
       <w:r>
-        <w:t>67.2. Technical Readiness</w:t>
+        <w:t>68.2. Technical Readiness</w:t>
       </w:r>
     </w:p>
     <w:p>
@@ -38911,7 +39381,7 @@
         <w:pStyle w:val="Heading2"/>
       </w:pPr>
       <w:r>
-        <w:t>67.3. Operational Readiness</w:t>
+        <w:t>68.3. Operational Readiness</w:t>
       </w:r>
     </w:p>
     <w:p>
@@ -39047,7 +39517,7 @@
         <w:pStyle w:val="Heading2"/>
       </w:pPr>
       <w:r>
-        <w:t>67.4. Final Sign-Off</w:t>
+        <w:t>68.4. Final Sign-Off</w:t>
       </w:r>
     </w:p>
     <w:p>
@@ -39095,7 +39565,7 @@
         <w:pStyle w:val="Heading1"/>
       </w:pPr>
       <w:r>
-        <w:t>68. Requirements Traceability Matrix</w:t>
+        <w:t>69. Requirements Traceability Matrix</w:t>
       </w:r>
     </w:p>
     <w:p>
@@ -39108,7 +39578,7 @@
         <w:pStyle w:val="Heading2"/>
       </w:pPr>
       <w:r>
-        <w:t>68.1. Purpose</w:t>
+        <w:t>69.1. Purpose</w:t>
       </w:r>
     </w:p>
     <w:p>
@@ -39121,7 +39591,7 @@
         <w:pStyle w:val="Heading2"/>
       </w:pPr>
       <w:r>
-        <w:t>68.2. Current Matrix</w:t>
+        <w:t>69.2. Current Matrix</w:t>
       </w:r>
     </w:p>
     <w:tbl>
@@ -40678,6 +41148,95 @@
           </w:p>
         </w:tc>
       </w:tr>
+      <w:tr>
+        <w:trPr>
+          <w:cantSplit/>
+        </w:trPr>
+        <w:tc>
+          <w:tcPr>
+            <w:tcW w:type="dxa" w:w="1560"/>
+            <w:vAlign w:val="center"/>
+          </w:tcPr>
+          <w:p>
+            <w:pPr>
+              <w:spacing w:after="0" w:line="252" w:lineRule="auto"/>
+            </w:pPr>
+            <w:r>
+              <w:t>`REL-001`</w:t>
+            </w:r>
+          </w:p>
+        </w:tc>
+        <w:tc>
+          <w:tcPr>
+            <w:tcW w:type="dxa" w:w="1560"/>
+            <w:vAlign w:val="center"/>
+          </w:tcPr>
+          <w:p>
+            <w:pPr>
+              <w:spacing w:after="0" w:line="252" w:lineRule="auto"/>
+            </w:pPr>
+            <w:r>
+              <w:t>Reproducible release candidate</w:t>
+            </w:r>
+          </w:p>
+        </w:tc>
+        <w:tc>
+          <w:tcPr>
+            <w:tcW w:type="dxa" w:w="1560"/>
+            <w:vAlign w:val="center"/>
+          </w:tcPr>
+          <w:p>
+            <w:pPr>
+              <w:spacing w:after="0" w:line="252" w:lineRule="auto"/>
+            </w:pPr>
+            <w:r>
+              <w:t>Release</w:t>
+            </w:r>
+          </w:p>
+        </w:tc>
+        <w:tc>
+          <w:tcPr>
+            <w:tcW w:type="dxa" w:w="1560"/>
+            <w:vAlign w:val="center"/>
+          </w:tcPr>
+          <w:p>
+            <w:pPr>
+              <w:spacing w:after="0" w:line="252" w:lineRule="auto"/>
+            </w:pPr>
+            <w:r>
+              <w:t>Manifest determinism, version, migration, and prerelease tests</w:t>
+            </w:r>
+          </w:p>
+        </w:tc>
+        <w:tc>
+          <w:tcPr>
+            <w:tcW w:type="dxa" w:w="1560"/>
+            <w:vAlign w:val="center"/>
+          </w:tcPr>
+          <w:p>
+            <w:pPr>
+              <w:spacing w:after="0" w:line="252" w:lineRule="auto"/>
+            </w:pPr>
+            <w:r>
+              <w:t>Release Candidate, Release</w:t>
+            </w:r>
+          </w:p>
+        </w:tc>
+        <w:tc>
+          <w:tcPr>
+            <w:tcW w:type="dxa" w:w="1560"/>
+            <w:vAlign w:val="center"/>
+          </w:tcPr>
+          <w:p>
+            <w:pPr>
+              <w:spacing w:after="0" w:line="252" w:lineRule="auto"/>
+            </w:pPr>
+            <w:r>
+              <w:t>Implemented; staging evidence pending</w:t>
+            </w:r>
+          </w:p>
+        </w:tc>
+      </w:tr>
     </w:tbl>
     <w:p/>
     <w:p>
@@ -40685,7 +41244,7 @@
         <w:pStyle w:val="Heading2"/>
       </w:pPr>
       <w:r>
-        <w:t>68.3. Maintenance Rules</w:t>
+        <w:t>69.3. Maintenance Rules</w:t>
       </w:r>
     </w:p>
     <w:p>
@@ -40741,7 +41300,7 @@
         <w:pStyle w:val="Heading2"/>
       </w:pPr>
       <w:r>
-        <w:t>68.4. Completion Criterion</w:t>
+        <w:t>69.4. Completion Criterion</w:t>
       </w:r>
     </w:p>
     <w:p>
@@ -40764,7 +41323,7 @@
         <w:pStyle w:val="Heading1"/>
       </w:pPr>
       <w:r>
-        <w:t>69. Glossary and Naming Conventions</w:t>
+        <w:t>70. Glossary and Naming Conventions</w:t>
       </w:r>
     </w:p>
     <w:p>
@@ -40777,7 +41336,7 @@
         <w:pStyle w:val="Heading2"/>
       </w:pPr>
       <w:r>
-        <w:t>69.1. Glossary</w:t>
+        <w:t>70.1. Glossary</w:t>
       </w:r>
     </w:p>
     <w:tbl>
@@ -41204,7 +41763,7 @@
         <w:pStyle w:val="Heading2"/>
       </w:pPr>
       <w:r>
-        <w:t>69.2. Naming Conventions</w:t>
+        <w:t>70.2. Naming Conventions</w:t>
       </w:r>
     </w:p>
     <w:p>
@@ -41268,7 +41827,7 @@
         <w:pStyle w:val="Heading2"/>
       </w:pPr>
       <w:r>
-        <w:t>69.3. Entity Names</w:t>
+        <w:t>70.3. Entity Names</w:t>
       </w:r>
     </w:p>
     <w:p>
@@ -41700,7 +42259,7 @@
         <w:pStyle w:val="Heading2"/>
       </w:pPr>
       <w:r>
-        <w:t>69.4. Consistency Rule</w:t>
+        <w:t>70.4. Consistency Rule</w:t>
       </w:r>
     </w:p>
     <w:p>
@@ -41728,7 +42287,7 @@
         <w:pStyle w:val="Heading1"/>
       </w:pPr>
       <w:r>
-        <w:t>70. Specification Index</w:t>
+        <w:t>71. Specification Index</w:t>
       </w:r>
     </w:p>
     <w:p>
@@ -41746,7 +42305,7 @@
         <w:pStyle w:val="Heading2"/>
       </w:pPr>
       <w:r>
-        <w:t>70.1. Purpose</w:t>
+        <w:t>71.1. Purpose</w:t>
       </w:r>
     </w:p>
     <w:p>
@@ -41807,7 +42366,7 @@
         <w:pStyle w:val="Heading2"/>
       </w:pPr>
       <w:r>
-        <w:t>70.2. Core Specification Groups</w:t>
+        <w:t>71.2. Core Specification Groups</w:t>
       </w:r>
     </w:p>
     <w:tbl>
@@ -42156,7 +42715,7 @@
               <w:spacing w:after="0" w:line="252" w:lineRule="auto"/>
             </w:pPr>
             <w:r>
-              <w:t>Release Management, Post-Launch Maintenance and Versioning, Change Acceptance Policy, Migration and Version Compatibility Plan, Infrastructure Dependency Management, License and Third-Party Component Management, Technical Debt Management</w:t>
+              <w:t>Release Management, Release Candidate Manifest, Post-Launch Maintenance and Versioning, Change Acceptance Policy, Migration and Version Compatibility Plan, Infrastructure Dependency Management, License and Third-Party Component Management, Technical Debt Management</w:t>
             </w:r>
           </w:p>
         </w:tc>
@@ -42201,7 +42760,7 @@
         <w:pStyle w:val="Heading2"/>
       </w:pPr>
       <w:r>
-        <w:t>70.3. Documentation Maintenance Rules</w:t>
+        <w:t>71.3. Documentation Maintenance Rules</w:t>
       </w:r>
     </w:p>
     <w:p>
@@ -42265,7 +42824,7 @@
         <w:pStyle w:val="Heading2"/>
       </w:pPr>
       <w:r>
-        <w:t>70.4. Completeness Control</w:t>
+        <w:t>71.4. Completeness Control</w:t>
       </w:r>
     </w:p>
     <w:p>
@@ -42366,7 +42925,7 @@
         <w:pStyle w:val="Heading2"/>
       </w:pPr>
       <w:r>
-        <w:t>70.5. Release Rule</w:t>
+        <w:t>71.5. Release Rule</w:t>
       </w:r>
     </w:p>
     <w:p>
@@ -42379,7 +42938,7 @@
         <w:pStyle w:val="Heading2"/>
       </w:pPr>
       <w:r>
-        <w:t>70.6. Final Statement</w:t>
+        <w:t>71.6. Final Statement</w:t>
       </w:r>
     </w:p>
     <w:p>
@@ -42402,7 +42961,7 @@
         <w:pStyle w:val="Heading1"/>
       </w:pPr>
       <w:r>
-        <w:t>71. Risk Management</w:t>
+        <w:t>72. Risk Management</w:t>
       </w:r>
     </w:p>
     <w:p>
@@ -42415,7 +42974,7 @@
         <w:pStyle w:val="Heading2"/>
       </w:pPr>
       <w:r>
-        <w:t>71.1. Operational Constraints</w:t>
+        <w:t>72.1. Operational Constraints</w:t>
       </w:r>
     </w:p>
     <w:p>
@@ -42463,7 +43022,7 @@
         <w:pStyle w:val="Heading2"/>
       </w:pPr>
       <w:r>
-        <w:t>71.2. Risk Register</w:t>
+        <w:t>72.2. Risk Register</w:t>
       </w:r>
     </w:p>
     <w:tbl>
@@ -42791,7 +43350,7 @@
         <w:pStyle w:val="Heading2"/>
       </w:pPr>
       <w:r>
-        <w:t>71.3. Change Control</w:t>
+        <w:t>72.3. Change Control</w:t>
       </w:r>
     </w:p>
     <w:p>
@@ -42860,7 +43419,7 @@
         <w:pStyle w:val="Heading2"/>
       </w:pPr>
       <w:r>
-        <w:t>71.4. Resilience Criteria</w:t>
+        <w:t>72.4. Resilience Criteria</w:t>
       </w:r>
     </w:p>
     <w:p>

</xml_diff>